<commit_message>
Clarify Fetarak spell mechanics
</commit_message>
<xml_diff>
--- a/Essentials/Fetarak.docx
+++ b/Essentials/Fetarak.docx
@@ -8,6 +8,7 @@
         <w:jc w:val="center"/>
         <w:shd w:fill="F3E5C0"/>
         <w:pBdr>
+          <w:top w:val="single" w:sz="8" w:space="6" w:color="9B6A2D"/>
           <w:bottom w:val="single" w:sz="8" w:space="6" w:color="9B6A2D"/>
         </w:pBdr>
       </w:pPr>
@@ -15,6 +16,7 @@
         <w:rPr>
           <w:rFonts w:ascii="Garamond" w:hAnsi="Garamond"/>
           <w:b/>
+          <w:i w:val="0"/>
           <w:color w:val="4A260F"/>
           <w:sz w:val="56"/>
         </w:rPr>
@@ -23,8 +25,9 @@
     </w:p>
     <w:p>
       <w:pPr>
-        <w:spacing w:before="260" w:after="80"/>
+        <w:spacing w:before="300" w:after="100"/>
         <w:pBdr>
+          <w:top w:val="single" w:sz="8" w:space="6" w:color="7A4A22"/>
           <w:bottom w:val="single" w:sz="8" w:space="6" w:color="7A4A22"/>
         </w:pBdr>
       </w:pPr>
@@ -32,6 +35,7 @@
         <w:rPr>
           <w:rFonts w:ascii="Garamond" w:hAnsi="Garamond"/>
           <w:b/>
+          <w:i w:val="0"/>
           <w:color w:val="5C3114"/>
           <w:sz w:val="32"/>
         </w:rPr>
@@ -48,10 +52,11 @@
         <w:rPr>
           <w:rFonts w:ascii="Garamond" w:hAnsi="Garamond"/>
           <w:b w:val="0"/>
+          <w:i w:val="0"/>
           <w:color w:val="2D1F15"/>
           <w:sz w:val="23"/>
         </w:rPr>
-        <w:t>Fetarak's staff is grown through with a magical stone. Every DAMAGE spell is cast at random when he calls upon that power.</w:t>
+        <w:t>Every DAMAGE spell from the sheet is part of the random casting pool.</w:t>
       </w:r>
     </w:p>
     <w:p>
@@ -64,6 +69,7 @@
         <w:rPr>
           <w:rFonts w:ascii="Garamond" w:hAnsi="Garamond"/>
           <w:b w:val="0"/>
+          <w:i w:val="0"/>
           <w:color w:val="2D1F15"/>
           <w:sz w:val="23"/>
         </w:rPr>
@@ -72,8 +78,9 @@
     </w:p>
     <w:p>
       <w:pPr>
-        <w:spacing w:before="260" w:after="80"/>
+        <w:spacing w:before="300" w:after="100"/>
         <w:pBdr>
+          <w:top w:val="single" w:sz="8" w:space="6" w:color="7A4A22"/>
           <w:bottom w:val="single" w:sz="8" w:space="6" w:color="7A4A22"/>
         </w:pBdr>
       </w:pPr>
@@ -81,6 +88,7 @@
         <w:rPr>
           <w:rFonts w:ascii="Garamond" w:hAnsi="Garamond"/>
           <w:b/>
+          <w:i w:val="0"/>
           <w:color w:val="5C3114"/>
           <w:sz w:val="32"/>
         </w:rPr>
@@ -96,6 +104,7 @@
         <w:rPr>
           <w:rFonts w:ascii="Garamond" w:hAnsi="Garamond"/>
           <w:b/>
+          <w:i w:val="0"/>
           <w:color w:val="5C3114"/>
           <w:sz w:val="23"/>
         </w:rPr>
@@ -105,6 +114,7 @@
         <w:rPr>
           <w:rFonts w:ascii="Garamond" w:hAnsi="Garamond"/>
           <w:b w:val="0"/>
+          <w:i w:val="0"/>
           <w:color w:val="2D1F15"/>
           <w:sz w:val="23"/>
         </w:rPr>
@@ -120,6 +130,7 @@
         <w:rPr>
           <w:rFonts w:ascii="Garamond" w:hAnsi="Garamond"/>
           <w:b/>
+          <w:i w:val="0"/>
           <w:color w:val="5C3114"/>
           <w:sz w:val="23"/>
         </w:rPr>
@@ -129,6 +140,7 @@
         <w:rPr>
           <w:rFonts w:ascii="Garamond" w:hAnsi="Garamond"/>
           <w:b w:val="0"/>
+          <w:i w:val="0"/>
           <w:color w:val="2D1F15"/>
           <w:sz w:val="23"/>
         </w:rPr>
@@ -144,6 +156,7 @@
         <w:rPr>
           <w:rFonts w:ascii="Garamond" w:hAnsi="Garamond"/>
           <w:b/>
+          <w:i w:val="0"/>
           <w:color w:val="5C3114"/>
           <w:sz w:val="23"/>
         </w:rPr>
@@ -153,6 +166,7 @@
         <w:rPr>
           <w:rFonts w:ascii="Garamond" w:hAnsi="Garamond"/>
           <w:b w:val="0"/>
+          <w:i w:val="0"/>
           <w:color w:val="2D1F15"/>
           <w:sz w:val="23"/>
         </w:rPr>
@@ -168,6 +182,7 @@
         <w:rPr>
           <w:rFonts w:ascii="Garamond" w:hAnsi="Garamond"/>
           <w:b/>
+          <w:i w:val="0"/>
           <w:color w:val="5C3114"/>
           <w:sz w:val="23"/>
         </w:rPr>
@@ -177,6 +192,7 @@
         <w:rPr>
           <w:rFonts w:ascii="Garamond" w:hAnsi="Garamond"/>
           <w:b w:val="0"/>
+          <w:i w:val="0"/>
           <w:color w:val="2D1F15"/>
           <w:sz w:val="23"/>
         </w:rPr>
@@ -192,6 +208,7 @@
         <w:rPr>
           <w:rFonts w:ascii="Garamond" w:hAnsi="Garamond"/>
           <w:b/>
+          <w:i w:val="0"/>
           <w:color w:val="5C3114"/>
           <w:sz w:val="23"/>
         </w:rPr>
@@ -201,6 +218,7 @@
         <w:rPr>
           <w:rFonts w:ascii="Garamond" w:hAnsi="Garamond"/>
           <w:b w:val="0"/>
+          <w:i w:val="0"/>
           <w:color w:val="2D1F15"/>
           <w:sz w:val="23"/>
         </w:rPr>
@@ -209,8 +227,9 @@
     </w:p>
     <w:p>
       <w:pPr>
-        <w:spacing w:before="260" w:after="80"/>
+        <w:spacing w:before="300" w:after="100"/>
         <w:pBdr>
+          <w:top w:val="single" w:sz="8" w:space="6" w:color="7A4A22"/>
           <w:bottom w:val="single" w:sz="8" w:space="6" w:color="7A4A22"/>
         </w:pBdr>
       </w:pPr>
@@ -218,6 +237,7 @@
         <w:rPr>
           <w:rFonts w:ascii="Garamond" w:hAnsi="Garamond"/>
           <w:b/>
+          <w:i w:val="0"/>
           <w:color w:val="5C3114"/>
           <w:sz w:val="32"/>
         </w:rPr>
@@ -233,6 +253,7 @@
         <w:rPr>
           <w:rFonts w:ascii="Garamond" w:hAnsi="Garamond"/>
           <w:b/>
+          <w:i w:val="0"/>
           <w:color w:val="5C3114"/>
           <w:sz w:val="23"/>
         </w:rPr>
@@ -242,10 +263,11 @@
         <w:rPr>
           <w:rFonts w:ascii="Garamond" w:hAnsi="Garamond"/>
           <w:b w:val="0"/>
+          <w:i w:val="0"/>
           <w:color w:val="2D1F15"/>
           <w:sz w:val="23"/>
         </w:rPr>
-        <w:t>Ice Knife - 1d10 piercing, then 2d6 cold in the burst</w:t>
+        <w:t>Ice Knife - 1d10 piercing; 2d6 cold explosion</w:t>
       </w:r>
     </w:p>
     <w:p>
@@ -257,6 +279,7 @@
         <w:rPr>
           <w:rFonts w:ascii="Garamond" w:hAnsi="Garamond"/>
           <w:b/>
+          <w:i w:val="0"/>
           <w:color w:val="5C3114"/>
           <w:sz w:val="23"/>
         </w:rPr>
@@ -266,6 +289,7 @@
         <w:rPr>
           <w:rFonts w:ascii="Garamond" w:hAnsi="Garamond"/>
           <w:b w:val="0"/>
+          <w:i w:val="0"/>
           <w:color w:val="2D1F15"/>
           <w:sz w:val="23"/>
         </w:rPr>
@@ -281,6 +305,7 @@
         <w:rPr>
           <w:rFonts w:ascii="Garamond" w:hAnsi="Garamond"/>
           <w:b/>
+          <w:i w:val="0"/>
           <w:color w:val="5C3114"/>
           <w:sz w:val="23"/>
         </w:rPr>
@@ -290,10 +315,11 @@
         <w:rPr>
           <w:rFonts w:ascii="Garamond" w:hAnsi="Garamond"/>
           <w:b w:val="0"/>
+          <w:i w:val="0"/>
           <w:color w:val="2D1F15"/>
           <w:sz w:val="23"/>
         </w:rPr>
-        <w:t>Chaos Bolt - 2d8 + 1d6; type decided by a d8</w:t>
+        <w:t>Chaos Bolt - 2d8 + 1d6; damage type from d8 result</w:t>
       </w:r>
     </w:p>
     <w:p>
@@ -305,6 +331,7 @@
         <w:rPr>
           <w:rFonts w:ascii="Garamond" w:hAnsi="Garamond"/>
           <w:b/>
+          <w:i w:val="0"/>
           <w:color w:val="5C3114"/>
           <w:sz w:val="23"/>
         </w:rPr>
@@ -314,6 +341,7 @@
         <w:rPr>
           <w:rFonts w:ascii="Garamond" w:hAnsi="Garamond"/>
           <w:b w:val="0"/>
+          <w:i w:val="0"/>
           <w:color w:val="2D1F15"/>
           <w:sz w:val="23"/>
         </w:rPr>
@@ -322,31 +350,53 @@
     </w:p>
     <w:p>
       <w:pPr>
-        <w:spacing w:before="260" w:after="80"/>
+        <w:spacing w:before="300" w:after="100"/>
         <w:pBdr>
-          <w:bottom w:val="single" w:sz="8" w:space="6" w:color="7A4A22"/>
+          <w:top w:val="single" w:sz="10" w:space="6" w:color="8A2D1E"/>
+          <w:bottom w:val="single" w:sz="10" w:space="6" w:color="8A2D1E"/>
         </w:pBdr>
+        <w:shd w:fill="F8D9C8"/>
       </w:pPr>
       <w:r>
         <w:rPr>
           <w:rFonts w:ascii="Garamond" w:hAnsi="Garamond"/>
           <w:b/>
-          <w:color w:val="5C3114"/>
+          <w:i w:val="0"/>
+          <w:color w:val="781C12"/>
           <w:sz w:val="32"/>
         </w:rPr>
-        <w:t>Other Damage Spells Found on the Sheet</w:t>
+        <w:t>IMPORTANT: Spells Outside Those Tables</w:t>
       </w:r>
     </w:p>
     <w:p>
       <w:pPr>
+        <w:pStyle w:val="ListBullet"/>
         <w:spacing w:after="40"/>
         <w:ind w:left="360"/>
+      </w:pPr>
+      <w:r>
+        <w:rPr>
+          <w:rFonts w:ascii="Garamond" w:hAnsi="Garamond"/>
+          <w:b w:val="0"/>
+          <w:i w:val="0"/>
+          <w:color w:val="2D1F15"/>
+          <w:sz w:val="23"/>
+        </w:rPr>
+        <w:t>These spells are written on the sheet but are not cantrips or 1st-level spells. They are highlighted here so they do not get missed.</w:t>
+      </w:r>
+    </w:p>
+    <w:p>
+      <w:pPr>
+        <w:spacing w:after="40"/>
+        <w:ind w:left="360"/>
+        <w:shd w:fill="FFF0E7"/>
       </w:pPr>
       <w:r>
         <w:rPr>
           <w:rFonts w:ascii="Garamond" w:hAnsi="Garamond"/>
           <w:b/>
-          <w:color w:val="5C3114"/>
+          <w:i w:val="0"/>
+          <w:color w:val="781C12"/>
           <w:sz w:val="23"/>
         </w:rPr>
         <w:t xml:space="preserve">1. </w:t>
@@ -354,23 +404,26 @@
       <w:r>
         <w:rPr>
           <w:rFonts w:ascii="Garamond" w:hAnsi="Garamond"/>
-          <w:b w:val="0"/>
-          <w:color w:val="2D1F15"/>
+          <w:b/>
+          <w:i w:val="0"/>
+          <w:color w:val="781C12"/>
           <w:sz w:val="23"/>
         </w:rPr>
-        <w:t>Moonbeam - 2nd Level - 2d10 radiant, half on a successful save</w:t>
+        <w:t>Moonbeam - 2nd Level - 2d10 radiant; half on success</w:t>
       </w:r>
     </w:p>
     <w:p>
       <w:pPr>
         <w:spacing w:after="40"/>
         <w:ind w:left="360"/>
+        <w:shd w:fill="FFF0E7"/>
       </w:pPr>
       <w:r>
         <w:rPr>
           <w:rFonts w:ascii="Garamond" w:hAnsi="Garamond"/>
           <w:b/>
-          <w:color w:val="5C3114"/>
+          <w:i w:val="0"/>
+          <w:color w:val="781C12"/>
           <w:sz w:val="23"/>
         </w:rPr>
         <w:t xml:space="preserve">2. </w:t>
@@ -378,17 +431,19 @@
       <w:r>
         <w:rPr>
           <w:rFonts w:ascii="Garamond" w:hAnsi="Garamond"/>
-          <w:b w:val="0"/>
-          <w:color w:val="2D1F15"/>
+          <w:b/>
+          <w:i w:val="0"/>
+          <w:color w:val="781C12"/>
           <w:sz w:val="23"/>
         </w:rPr>
-        <w:t>Shatter - 2nd Level - 3d8 thunder, half on a successful save</w:t>
+        <w:t>Shatter - 2nd Level - 3d8 thunder; half on success</w:t>
       </w:r>
     </w:p>
     <w:p>
       <w:pPr>
-        <w:spacing w:before="260" w:after="80"/>
+        <w:spacing w:before="300" w:after="100"/>
         <w:pBdr>
+          <w:top w:val="single" w:sz="8" w:space="6" w:color="7A4A22"/>
           <w:bottom w:val="single" w:sz="8" w:space="6" w:color="7A4A22"/>
         </w:pBdr>
       </w:pPr>
@@ -396,16 +451,18 @@
         <w:rPr>
           <w:rFonts w:ascii="Garamond" w:hAnsi="Garamond"/>
           <w:b/>
+          <w:i w:val="0"/>
           <w:color w:val="5C3114"/>
           <w:sz w:val="32"/>
         </w:rPr>
-        <w:t>Cantrips</w:t>
+        <w:t>Cantrips - Full Mechanics</w:t>
       </w:r>
     </w:p>
     <w:p>
       <w:pPr>
-        <w:spacing w:before="260" w:after="80"/>
+        <w:spacing w:before="300" w:after="100"/>
         <w:pBdr>
+          <w:top w:val="single" w:sz="8" w:space="6" w:color="7A4A22"/>
           <w:bottom w:val="single" w:sz="8" w:space="6" w:color="7A4A22"/>
         </w:pBdr>
       </w:pPr>
@@ -413,6 +470,7 @@
         <w:rPr>
           <w:rFonts w:ascii="Garamond" w:hAnsi="Garamond"/>
           <w:b/>
+          <w:i w:val="0"/>
           <w:color w:val="5C3114"/>
           <w:sz w:val="32"/>
         </w:rPr>
@@ -427,6 +485,7 @@
         <w:rPr>
           <w:rFonts w:ascii="Garamond" w:hAnsi="Garamond"/>
           <w:b/>
+          <w:i w:val="0"/>
           <w:color w:val="5C3114"/>
           <w:sz w:val="23"/>
         </w:rPr>
@@ -441,6 +500,7 @@
         <w:rPr>
           <w:rFonts w:ascii="Garamond" w:hAnsi="Garamond"/>
           <w:b/>
+          <w:i w:val="0"/>
           <w:color w:val="5C3114"/>
           <w:sz w:val="23"/>
         </w:rPr>
@@ -450,6 +510,7 @@
         <w:rPr>
           <w:rFonts w:ascii="Garamond" w:hAnsi="Garamond"/>
           <w:b w:val="0"/>
+          <w:i w:val="0"/>
           <w:color w:val="2D1F15"/>
           <w:sz w:val="23"/>
         </w:rPr>
@@ -464,6 +525,7 @@
         <w:rPr>
           <w:rFonts w:ascii="Garamond" w:hAnsi="Garamond"/>
           <w:b/>
+          <w:i w:val="0"/>
           <w:color w:val="5C3114"/>
           <w:sz w:val="23"/>
         </w:rPr>
@@ -473,6 +535,7 @@
         <w:rPr>
           <w:rFonts w:ascii="Garamond" w:hAnsi="Garamond"/>
           <w:b w:val="0"/>
+          <w:i w:val="0"/>
           <w:color w:val="2D1F15"/>
           <w:sz w:val="23"/>
         </w:rPr>
@@ -487,6 +550,7 @@
         <w:rPr>
           <w:rFonts w:ascii="Garamond" w:hAnsi="Garamond"/>
           <w:b/>
+          <w:i w:val="0"/>
           <w:color w:val="5C3114"/>
           <w:sz w:val="23"/>
         </w:rPr>
@@ -496,6 +560,7 @@
         <w:rPr>
           <w:rFonts w:ascii="Garamond" w:hAnsi="Garamond"/>
           <w:b w:val="0"/>
+          <w:i w:val="0"/>
           <w:color w:val="2D1F15"/>
           <w:sz w:val="23"/>
         </w:rPr>
@@ -510,6 +575,7 @@
         <w:rPr>
           <w:rFonts w:ascii="Garamond" w:hAnsi="Garamond"/>
           <w:b/>
+          <w:i w:val="0"/>
           <w:color w:val="5C3114"/>
           <w:sz w:val="23"/>
         </w:rPr>
@@ -519,6 +585,7 @@
         <w:rPr>
           <w:rFonts w:ascii="Garamond" w:hAnsi="Garamond"/>
           <w:b w:val="0"/>
+          <w:i w:val="0"/>
           <w:color w:val="2D1F15"/>
           <w:sz w:val="23"/>
         </w:rPr>
@@ -533,6 +600,7 @@
         <w:rPr>
           <w:rFonts w:ascii="Garamond" w:hAnsi="Garamond"/>
           <w:b/>
+          <w:i w:val="0"/>
           <w:color w:val="5C3114"/>
           <w:sz w:val="23"/>
         </w:rPr>
@@ -542,6 +610,7 @@
         <w:rPr>
           <w:rFonts w:ascii="Garamond" w:hAnsi="Garamond"/>
           <w:b w:val="0"/>
+          <w:i w:val="0"/>
           <w:color w:val="2D1F15"/>
           <w:sz w:val="23"/>
         </w:rPr>
@@ -556,6 +625,7 @@
         <w:rPr>
           <w:rFonts w:ascii="Garamond" w:hAnsi="Garamond"/>
           <w:b/>
+          <w:i w:val="0"/>
           <w:color w:val="5C3114"/>
           <w:sz w:val="23"/>
         </w:rPr>
@@ -565,6 +635,7 @@
         <w:rPr>
           <w:rFonts w:ascii="Garamond" w:hAnsi="Garamond"/>
           <w:b w:val="0"/>
+          <w:i w:val="0"/>
           <w:color w:val="2D1F15"/>
           <w:sz w:val="23"/>
         </w:rPr>
@@ -573,8 +644,9 @@
     </w:p>
     <w:p>
       <w:pPr>
-        <w:spacing w:before="160" w:after="80"/>
+        <w:spacing w:before="160" w:after="100"/>
         <w:pBdr>
+          <w:top w:val="single" w:sz="8" w:space="6" w:color="7A4A22"/>
           <w:bottom w:val="single" w:sz="8" w:space="6" w:color="7A4A22"/>
         </w:pBdr>
       </w:pPr>
@@ -582,10 +654,11 @@
         <w:rPr>
           <w:rFonts w:ascii="Garamond" w:hAnsi="Garamond"/>
           <w:b/>
+          <w:i w:val="0"/>
           <w:color w:val="5C3114"/>
           <w:sz w:val="27"/>
         </w:rPr>
-        <w:t>Effect</w:t>
+        <w:t>Full Rules Text - Condensed Mechanics</w:t>
       </w:r>
     </w:p>
     <w:p>
@@ -598,10 +671,11 @@
         <w:rPr>
           <w:rFonts w:ascii="Garamond" w:hAnsi="Garamond"/>
           <w:b w:val="0"/>
+          <w:i w:val="0"/>
           <w:color w:val="2D1F15"/>
           <w:sz w:val="23"/>
         </w:rPr>
-        <w:t>Fetarak hurls a mote of flame at one creature or object within range.</w:t>
+        <w:t>Choose a creature or object within range.</w:t>
       </w:r>
     </w:p>
     <w:p>
@@ -614,10 +688,11 @@
         <w:rPr>
           <w:rFonts w:ascii="Garamond" w:hAnsi="Garamond"/>
           <w:b w:val="0"/>
+          <w:i w:val="0"/>
           <w:color w:val="2D1F15"/>
           <w:sz w:val="23"/>
         </w:rPr>
-        <w:t>On a hit, the target takes fire damage.</w:t>
+        <w:t>Make a ranged spell attack against the target.</w:t>
       </w:r>
     </w:p>
     <w:p>
@@ -630,6 +705,24 @@
         <w:rPr>
           <w:rFonts w:ascii="Garamond" w:hAnsi="Garamond"/>
           <w:b w:val="0"/>
+          <w:i w:val="0"/>
+          <w:color w:val="2D1F15"/>
+          <w:sz w:val="23"/>
+        </w:rPr>
+        <w:t>On a hit, the target takes 1d10 fire damage.</w:t>
+      </w:r>
+    </w:p>
+    <w:p>
+      <w:pPr>
+        <w:pStyle w:val="ListBullet"/>
+        <w:spacing w:after="40"/>
+        <w:ind w:left="360"/>
+      </w:pPr>
+      <w:r>
+        <w:rPr>
+          <w:rFonts w:ascii="Garamond" w:hAnsi="Garamond"/>
+          <w:b w:val="0"/>
+          <w:i w:val="0"/>
           <w:color w:val="2D1F15"/>
           <w:sz w:val="23"/>
         </w:rPr>
@@ -638,8 +731,9 @@
     </w:p>
     <w:p>
       <w:pPr>
-        <w:spacing w:before="160" w:after="80"/>
+        <w:spacing w:before="160" w:after="100"/>
         <w:pBdr>
+          <w:top w:val="single" w:sz="8" w:space="6" w:color="7A4A22"/>
           <w:bottom w:val="single" w:sz="8" w:space="6" w:color="7A4A22"/>
         </w:pBdr>
       </w:pPr>
@@ -647,6 +741,7 @@
         <w:rPr>
           <w:rFonts w:ascii="Garamond" w:hAnsi="Garamond"/>
           <w:b/>
+          <w:i w:val="0"/>
           <w:color w:val="5C3114"/>
           <w:sz w:val="27"/>
         </w:rPr>
@@ -663,16 +758,18 @@
         <w:rPr>
           <w:rFonts w:ascii="Garamond" w:hAnsi="Garamond"/>
           <w:b w:val="0"/>
+          <w:i w:val="0"/>
           <w:color w:val="2D1F15"/>
           <w:sz w:val="23"/>
         </w:rPr>
-        <w:t>Damage increases by 1d10 at character levels 5, 11, and 17.</w:t>
+        <w:t>The damage increases by 1d10 at 5th level, 11th level, and 17th level.</w:t>
       </w:r>
     </w:p>
     <w:p>
       <w:pPr>
-        <w:spacing w:before="260" w:after="80"/>
+        <w:spacing w:before="300" w:after="100"/>
         <w:pBdr>
+          <w:top w:val="single" w:sz="8" w:space="6" w:color="7A4A22"/>
           <w:bottom w:val="single" w:sz="8" w:space="6" w:color="7A4A22"/>
         </w:pBdr>
       </w:pPr>
@@ -680,6 +777,7 @@
         <w:rPr>
           <w:rFonts w:ascii="Garamond" w:hAnsi="Garamond"/>
           <w:b/>
+          <w:i w:val="0"/>
           <w:color w:val="5C3114"/>
           <w:sz w:val="32"/>
         </w:rPr>
@@ -694,6 +792,7 @@
         <w:rPr>
           <w:rFonts w:ascii="Garamond" w:hAnsi="Garamond"/>
           <w:b/>
+          <w:i w:val="0"/>
           <w:color w:val="5C3114"/>
           <w:sz w:val="23"/>
         </w:rPr>
@@ -708,6 +807,7 @@
         <w:rPr>
           <w:rFonts w:ascii="Garamond" w:hAnsi="Garamond"/>
           <w:b/>
+          <w:i w:val="0"/>
           <w:color w:val="5C3114"/>
           <w:sz w:val="23"/>
         </w:rPr>
@@ -717,6 +817,7 @@
         <w:rPr>
           <w:rFonts w:ascii="Garamond" w:hAnsi="Garamond"/>
           <w:b w:val="0"/>
+          <w:i w:val="0"/>
           <w:color w:val="2D1F15"/>
           <w:sz w:val="23"/>
         </w:rPr>
@@ -731,6 +832,7 @@
         <w:rPr>
           <w:rFonts w:ascii="Garamond" w:hAnsi="Garamond"/>
           <w:b/>
+          <w:i w:val="0"/>
           <w:color w:val="5C3114"/>
           <w:sz w:val="23"/>
         </w:rPr>
@@ -740,6 +842,7 @@
         <w:rPr>
           <w:rFonts w:ascii="Garamond" w:hAnsi="Garamond"/>
           <w:b w:val="0"/>
+          <w:i w:val="0"/>
           <w:color w:val="2D1F15"/>
           <w:sz w:val="23"/>
         </w:rPr>
@@ -754,6 +857,7 @@
         <w:rPr>
           <w:rFonts w:ascii="Garamond" w:hAnsi="Garamond"/>
           <w:b/>
+          <w:i w:val="0"/>
           <w:color w:val="5C3114"/>
           <w:sz w:val="23"/>
         </w:rPr>
@@ -763,6 +867,7 @@
         <w:rPr>
           <w:rFonts w:ascii="Garamond" w:hAnsi="Garamond"/>
           <w:b w:val="0"/>
+          <w:i w:val="0"/>
           <w:color w:val="2D1F15"/>
           <w:sz w:val="23"/>
         </w:rPr>
@@ -777,6 +882,7 @@
         <w:rPr>
           <w:rFonts w:ascii="Garamond" w:hAnsi="Garamond"/>
           <w:b/>
+          <w:i w:val="0"/>
           <w:color w:val="5C3114"/>
           <w:sz w:val="23"/>
         </w:rPr>
@@ -786,6 +892,7 @@
         <w:rPr>
           <w:rFonts w:ascii="Garamond" w:hAnsi="Garamond"/>
           <w:b w:val="0"/>
+          <w:i w:val="0"/>
           <w:color w:val="2D1F15"/>
           <w:sz w:val="23"/>
         </w:rPr>
@@ -800,6 +907,7 @@
         <w:rPr>
           <w:rFonts w:ascii="Garamond" w:hAnsi="Garamond"/>
           <w:b/>
+          <w:i w:val="0"/>
           <w:color w:val="5C3114"/>
           <w:sz w:val="23"/>
         </w:rPr>
@@ -809,6 +917,7 @@
         <w:rPr>
           <w:rFonts w:ascii="Garamond" w:hAnsi="Garamond"/>
           <w:b w:val="0"/>
+          <w:i w:val="0"/>
           <w:color w:val="2D1F15"/>
           <w:sz w:val="23"/>
         </w:rPr>
@@ -823,6 +932,7 @@
         <w:rPr>
           <w:rFonts w:ascii="Garamond" w:hAnsi="Garamond"/>
           <w:b/>
+          <w:i w:val="0"/>
           <w:color w:val="5C3114"/>
           <w:sz w:val="23"/>
         </w:rPr>
@@ -832,6 +942,7 @@
         <w:rPr>
           <w:rFonts w:ascii="Garamond" w:hAnsi="Garamond"/>
           <w:b w:val="0"/>
+          <w:i w:val="0"/>
           <w:color w:val="2D1F15"/>
           <w:sz w:val="23"/>
         </w:rPr>
@@ -840,8 +951,9 @@
     </w:p>
     <w:p>
       <w:pPr>
-        <w:spacing w:before="160" w:after="80"/>
+        <w:spacing w:before="160" w:after="100"/>
         <w:pBdr>
+          <w:top w:val="single" w:sz="8" w:space="6" w:color="7A4A22"/>
           <w:bottom w:val="single" w:sz="8" w:space="6" w:color="7A4A22"/>
         </w:pBdr>
       </w:pPr>
@@ -849,10 +961,11 @@
         <w:rPr>
           <w:rFonts w:ascii="Garamond" w:hAnsi="Garamond"/>
           <w:b/>
+          <w:i w:val="0"/>
           <w:color w:val="5C3114"/>
           <w:sz w:val="27"/>
         </w:rPr>
-        <w:t>Effect</w:t>
+        <w:t>Full Rules Text - Condensed Mechanics</w:t>
       </w:r>
     </w:p>
     <w:p>
@@ -865,10 +978,11 @@
         <w:rPr>
           <w:rFonts w:ascii="Garamond" w:hAnsi="Garamond"/>
           <w:b w:val="0"/>
+          <w:i w:val="0"/>
           <w:color w:val="2D1F15"/>
           <w:sz w:val="23"/>
         </w:rPr>
-        <w:t>A crackling beam of force streaks toward one creature in range.</w:t>
+        <w:t>Choose a creature within range.</w:t>
       </w:r>
     </w:p>
     <w:p>
@@ -881,16 +995,35 @@
         <w:rPr>
           <w:rFonts w:ascii="Garamond" w:hAnsi="Garamond"/>
           <w:b w:val="0"/>
+          <w:i w:val="0"/>
           <w:color w:val="2D1F15"/>
           <w:sz w:val="23"/>
         </w:rPr>
-        <w:t>On a hit, the target takes force damage.</w:t>
+        <w:t>Make a ranged spell attack against the target.</w:t>
       </w:r>
     </w:p>
     <w:p>
       <w:pPr>
-        <w:spacing w:before="160" w:after="80"/>
+        <w:pStyle w:val="ListBullet"/>
+        <w:spacing w:after="40"/>
+        <w:ind w:left="360"/>
+      </w:pPr>
+      <w:r>
+        <w:rPr>
+          <w:rFonts w:ascii="Garamond" w:hAnsi="Garamond"/>
+          <w:b w:val="0"/>
+          <w:i w:val="0"/>
+          <w:color w:val="2D1F15"/>
+          <w:sz w:val="23"/>
+        </w:rPr>
+        <w:t>On a hit, the target takes 1d10 force damage.</w:t>
+      </w:r>
+    </w:p>
+    <w:p>
+      <w:pPr>
+        <w:spacing w:before="160" w:after="100"/>
         <w:pBdr>
+          <w:top w:val="single" w:sz="8" w:space="6" w:color="7A4A22"/>
           <w:bottom w:val="single" w:sz="8" w:space="6" w:color="7A4A22"/>
         </w:pBdr>
       </w:pPr>
@@ -898,6 +1031,7 @@
         <w:rPr>
           <w:rFonts w:ascii="Garamond" w:hAnsi="Garamond"/>
           <w:b/>
+          <w:i w:val="0"/>
           <w:color w:val="5C3114"/>
           <w:sz w:val="27"/>
         </w:rPr>
@@ -914,10 +1048,11 @@
         <w:rPr>
           <w:rFonts w:ascii="Garamond" w:hAnsi="Garamond"/>
           <w:b w:val="0"/>
+          <w:i w:val="0"/>
           <w:color w:val="2D1F15"/>
           <w:sz w:val="23"/>
         </w:rPr>
-        <w:t>At level 5 the spell creates two beams, at level 11 three beams, and at level 17 four beams.</w:t>
+        <w:t>At 5th level the spell creates two beams; at 11th level, three beams; at 17th level, four beams.</w:t>
       </w:r>
     </w:p>
     <w:p>
@@ -930,16 +1065,35 @@
         <w:rPr>
           <w:rFonts w:ascii="Garamond" w:hAnsi="Garamond"/>
           <w:b w:val="0"/>
+          <w:i w:val="0"/>
           <w:color w:val="2D1F15"/>
           <w:sz w:val="23"/>
         </w:rPr>
-        <w:t>Each beam uses its own attack roll and may be aimed at the same creature or at different creatures.</w:t>
+        <w:t>Each beam requires a separate attack roll.</w:t>
       </w:r>
     </w:p>
     <w:p>
       <w:pPr>
-        <w:spacing w:before="260" w:after="80"/>
+        <w:pStyle w:val="ListBullet"/>
+        <w:spacing w:after="40"/>
+        <w:ind w:left="360"/>
+      </w:pPr>
+      <w:r>
+        <w:rPr>
+          <w:rFonts w:ascii="Garamond" w:hAnsi="Garamond"/>
+          <w:b w:val="0"/>
+          <w:i w:val="0"/>
+          <w:color w:val="2D1F15"/>
+          <w:sz w:val="23"/>
+        </w:rPr>
+        <w:t>The beams can be aimed at the same target or at different targets.</w:t>
+      </w:r>
+    </w:p>
+    <w:p>
+      <w:pPr>
+        <w:spacing w:before="300" w:after="100"/>
         <w:pBdr>
+          <w:top w:val="single" w:sz="8" w:space="6" w:color="7A4A22"/>
           <w:bottom w:val="single" w:sz="8" w:space="6" w:color="7A4A22"/>
         </w:pBdr>
       </w:pPr>
@@ -947,6 +1101,7 @@
         <w:rPr>
           <w:rFonts w:ascii="Garamond" w:hAnsi="Garamond"/>
           <w:b/>
+          <w:i w:val="0"/>
           <w:color w:val="5C3114"/>
           <w:sz w:val="32"/>
         </w:rPr>
@@ -961,6 +1116,7 @@
         <w:rPr>
           <w:rFonts w:ascii="Garamond" w:hAnsi="Garamond"/>
           <w:b/>
+          <w:i w:val="0"/>
           <w:color w:val="5C3114"/>
           <w:sz w:val="23"/>
         </w:rPr>
@@ -975,6 +1131,7 @@
         <w:rPr>
           <w:rFonts w:ascii="Garamond" w:hAnsi="Garamond"/>
           <w:b/>
+          <w:i w:val="0"/>
           <w:color w:val="5C3114"/>
           <w:sz w:val="23"/>
         </w:rPr>
@@ -984,6 +1141,7 @@
         <w:rPr>
           <w:rFonts w:ascii="Garamond" w:hAnsi="Garamond"/>
           <w:b w:val="0"/>
+          <w:i w:val="0"/>
           <w:color w:val="2D1F15"/>
           <w:sz w:val="23"/>
         </w:rPr>
@@ -998,6 +1156,7 @@
         <w:rPr>
           <w:rFonts w:ascii="Garamond" w:hAnsi="Garamond"/>
           <w:b/>
+          <w:i w:val="0"/>
           <w:color w:val="5C3114"/>
           <w:sz w:val="23"/>
         </w:rPr>
@@ -1007,6 +1166,7 @@
         <w:rPr>
           <w:rFonts w:ascii="Garamond" w:hAnsi="Garamond"/>
           <w:b w:val="0"/>
+          <w:i w:val="0"/>
           <w:color w:val="2D1F15"/>
           <w:sz w:val="23"/>
         </w:rPr>
@@ -1021,6 +1181,7 @@
         <w:rPr>
           <w:rFonts w:ascii="Garamond" w:hAnsi="Garamond"/>
           <w:b/>
+          <w:i w:val="0"/>
           <w:color w:val="5C3114"/>
           <w:sz w:val="23"/>
         </w:rPr>
@@ -1030,6 +1191,7 @@
         <w:rPr>
           <w:rFonts w:ascii="Garamond" w:hAnsi="Garamond"/>
           <w:b w:val="0"/>
+          <w:i w:val="0"/>
           <w:color w:val="2D1F15"/>
           <w:sz w:val="23"/>
         </w:rPr>
@@ -1044,6 +1206,7 @@
         <w:rPr>
           <w:rFonts w:ascii="Garamond" w:hAnsi="Garamond"/>
           <w:b/>
+          <w:i w:val="0"/>
           <w:color w:val="5C3114"/>
           <w:sz w:val="23"/>
         </w:rPr>
@@ -1053,6 +1216,7 @@
         <w:rPr>
           <w:rFonts w:ascii="Garamond" w:hAnsi="Garamond"/>
           <w:b w:val="0"/>
+          <w:i w:val="0"/>
           <w:color w:val="2D1F15"/>
           <w:sz w:val="23"/>
         </w:rPr>
@@ -1067,6 +1231,7 @@
         <w:rPr>
           <w:rFonts w:ascii="Garamond" w:hAnsi="Garamond"/>
           <w:b/>
+          <w:i w:val="0"/>
           <w:color w:val="5C3114"/>
           <w:sz w:val="23"/>
         </w:rPr>
@@ -1076,6 +1241,7 @@
         <w:rPr>
           <w:rFonts w:ascii="Garamond" w:hAnsi="Garamond"/>
           <w:b w:val="0"/>
+          <w:i w:val="0"/>
           <w:color w:val="2D1F15"/>
           <w:sz w:val="23"/>
         </w:rPr>
@@ -1090,6 +1256,7 @@
         <w:rPr>
           <w:rFonts w:ascii="Garamond" w:hAnsi="Garamond"/>
           <w:b/>
+          <w:i w:val="0"/>
           <w:color w:val="5C3114"/>
           <w:sz w:val="23"/>
         </w:rPr>
@@ -1099,6 +1266,7 @@
         <w:rPr>
           <w:rFonts w:ascii="Garamond" w:hAnsi="Garamond"/>
           <w:b w:val="0"/>
+          <w:i w:val="0"/>
           <w:color w:val="2D1F15"/>
           <w:sz w:val="23"/>
         </w:rPr>
@@ -1107,8 +1275,9 @@
     </w:p>
     <w:p>
       <w:pPr>
-        <w:spacing w:before="160" w:after="80"/>
+        <w:spacing w:before="160" w:after="100"/>
         <w:pBdr>
+          <w:top w:val="single" w:sz="8" w:space="6" w:color="7A4A22"/>
           <w:bottom w:val="single" w:sz="8" w:space="6" w:color="7A4A22"/>
         </w:pBdr>
       </w:pPr>
@@ -1116,10 +1285,11 @@
         <w:rPr>
           <w:rFonts w:ascii="Garamond" w:hAnsi="Garamond"/>
           <w:b/>
+          <w:i w:val="0"/>
           <w:color w:val="5C3114"/>
           <w:sz w:val="27"/>
         </w:rPr>
-        <w:t>Effect</w:t>
+        <w:t>Full Rules Text - Condensed Mechanics</w:t>
       </w:r>
     </w:p>
     <w:p>
@@ -1132,10 +1302,11 @@
         <w:rPr>
           <w:rFonts w:ascii="Garamond" w:hAnsi="Garamond"/>
           <w:b w:val="0"/>
+          <w:i w:val="0"/>
           <w:color w:val="2D1F15"/>
           <w:sz w:val="23"/>
         </w:rPr>
-        <w:t>Fetarak conjures a bubble of acid and throws it at one creature he can see within range.</w:t>
+        <w:t>Choose one visible creature within range.</w:t>
       </w:r>
     </w:p>
     <w:p>
@@ -1148,10 +1319,11 @@
         <w:rPr>
           <w:rFonts w:ascii="Garamond" w:hAnsi="Garamond"/>
           <w:b w:val="0"/>
+          <w:i w:val="0"/>
           <w:color w:val="2D1F15"/>
           <w:sz w:val="23"/>
         </w:rPr>
-        <w:t>He may instead choose two visible creatures within range if they are within 5 feet of each other.</w:t>
+        <w:t>Alternatively, choose two visible creatures within range if they are within 5 feet of each other.</w:t>
       </w:r>
     </w:p>
     <w:p>
@@ -1164,16 +1336,35 @@
         <w:rPr>
           <w:rFonts w:ascii="Garamond" w:hAnsi="Garamond"/>
           <w:b w:val="0"/>
+          <w:i w:val="0"/>
           <w:color w:val="2D1F15"/>
           <w:sz w:val="23"/>
         </w:rPr>
-        <w:t>Each target that fails the Dexterity save takes acid damage.</w:t>
+        <w:t>Each target must make a Dexterity saving throw.</w:t>
       </w:r>
     </w:p>
     <w:p>
       <w:pPr>
-        <w:spacing w:before="160" w:after="80"/>
+        <w:pStyle w:val="ListBullet"/>
+        <w:spacing w:after="40"/>
+        <w:ind w:left="360"/>
+      </w:pPr>
+      <w:r>
+        <w:rPr>
+          <w:rFonts w:ascii="Garamond" w:hAnsi="Garamond"/>
+          <w:b w:val="0"/>
+          <w:i w:val="0"/>
+          <w:color w:val="2D1F15"/>
+          <w:sz w:val="23"/>
+        </w:rPr>
+        <w:t>A target that fails the save takes 1d6 acid damage.</w:t>
+      </w:r>
+    </w:p>
+    <w:p>
+      <w:pPr>
+        <w:spacing w:before="160" w:after="100"/>
         <w:pBdr>
+          <w:top w:val="single" w:sz="8" w:space="6" w:color="7A4A22"/>
           <w:bottom w:val="single" w:sz="8" w:space="6" w:color="7A4A22"/>
         </w:pBdr>
       </w:pPr>
@@ -1181,6 +1372,7 @@
         <w:rPr>
           <w:rFonts w:ascii="Garamond" w:hAnsi="Garamond"/>
           <w:b/>
+          <w:i w:val="0"/>
           <w:color w:val="5C3114"/>
           <w:sz w:val="27"/>
         </w:rPr>
@@ -1197,16 +1389,18 @@
         <w:rPr>
           <w:rFonts w:ascii="Garamond" w:hAnsi="Garamond"/>
           <w:b w:val="0"/>
+          <w:i w:val="0"/>
           <w:color w:val="2D1F15"/>
           <w:sz w:val="23"/>
         </w:rPr>
-        <w:t>Damage increases by 1d6 at character levels 5, 11, and 17.</w:t>
+        <w:t>The damage increases by 1d6 at 5th level, 11th level, and 17th level.</w:t>
       </w:r>
     </w:p>
     <w:p>
       <w:pPr>
-        <w:spacing w:before="260" w:after="80"/>
+        <w:spacing w:before="300" w:after="100"/>
         <w:pBdr>
+          <w:top w:val="single" w:sz="8" w:space="6" w:color="7A4A22"/>
           <w:bottom w:val="single" w:sz="8" w:space="6" w:color="7A4A22"/>
         </w:pBdr>
       </w:pPr>
@@ -1214,6 +1408,7 @@
         <w:rPr>
           <w:rFonts w:ascii="Garamond" w:hAnsi="Garamond"/>
           <w:b/>
+          <w:i w:val="0"/>
           <w:color w:val="5C3114"/>
           <w:sz w:val="32"/>
         </w:rPr>
@@ -1228,6 +1423,7 @@
         <w:rPr>
           <w:rFonts w:ascii="Garamond" w:hAnsi="Garamond"/>
           <w:b/>
+          <w:i w:val="0"/>
           <w:color w:val="5C3114"/>
           <w:sz w:val="23"/>
         </w:rPr>
@@ -1242,6 +1438,7 @@
         <w:rPr>
           <w:rFonts w:ascii="Garamond" w:hAnsi="Garamond"/>
           <w:b/>
+          <w:i w:val="0"/>
           <w:color w:val="5C3114"/>
           <w:sz w:val="23"/>
         </w:rPr>
@@ -1251,6 +1448,7 @@
         <w:rPr>
           <w:rFonts w:ascii="Garamond" w:hAnsi="Garamond"/>
           <w:b w:val="0"/>
+          <w:i w:val="0"/>
           <w:color w:val="2D1F15"/>
           <w:sz w:val="23"/>
         </w:rPr>
@@ -1265,6 +1463,7 @@
         <w:rPr>
           <w:rFonts w:ascii="Garamond" w:hAnsi="Garamond"/>
           <w:b/>
+          <w:i w:val="0"/>
           <w:color w:val="5C3114"/>
           <w:sz w:val="23"/>
         </w:rPr>
@@ -1274,6 +1473,7 @@
         <w:rPr>
           <w:rFonts w:ascii="Garamond" w:hAnsi="Garamond"/>
           <w:b w:val="0"/>
+          <w:i w:val="0"/>
           <w:color w:val="2D1F15"/>
           <w:sz w:val="23"/>
         </w:rPr>
@@ -1288,6 +1488,7 @@
         <w:rPr>
           <w:rFonts w:ascii="Garamond" w:hAnsi="Garamond"/>
           <w:b/>
+          <w:i w:val="0"/>
           <w:color w:val="5C3114"/>
           <w:sz w:val="23"/>
         </w:rPr>
@@ -1297,6 +1498,7 @@
         <w:rPr>
           <w:rFonts w:ascii="Garamond" w:hAnsi="Garamond"/>
           <w:b w:val="0"/>
+          <w:i w:val="0"/>
           <w:color w:val="2D1F15"/>
           <w:sz w:val="23"/>
         </w:rPr>
@@ -1311,6 +1513,7 @@
         <w:rPr>
           <w:rFonts w:ascii="Garamond" w:hAnsi="Garamond"/>
           <w:b/>
+          <w:i w:val="0"/>
           <w:color w:val="5C3114"/>
           <w:sz w:val="23"/>
         </w:rPr>
@@ -1320,6 +1523,7 @@
         <w:rPr>
           <w:rFonts w:ascii="Garamond" w:hAnsi="Garamond"/>
           <w:b w:val="0"/>
+          <w:i w:val="0"/>
           <w:color w:val="2D1F15"/>
           <w:sz w:val="23"/>
         </w:rPr>
@@ -1334,6 +1538,7 @@
         <w:rPr>
           <w:rFonts w:ascii="Garamond" w:hAnsi="Garamond"/>
           <w:b/>
+          <w:i w:val="0"/>
           <w:color w:val="5C3114"/>
           <w:sz w:val="23"/>
         </w:rPr>
@@ -1343,6 +1548,7 @@
         <w:rPr>
           <w:rFonts w:ascii="Garamond" w:hAnsi="Garamond"/>
           <w:b w:val="0"/>
+          <w:i w:val="0"/>
           <w:color w:val="2D1F15"/>
           <w:sz w:val="23"/>
         </w:rPr>
@@ -1357,6 +1563,7 @@
         <w:rPr>
           <w:rFonts w:ascii="Garamond" w:hAnsi="Garamond"/>
           <w:b/>
+          <w:i w:val="0"/>
           <w:color w:val="5C3114"/>
           <w:sz w:val="23"/>
         </w:rPr>
@@ -1366,6 +1573,7 @@
         <w:rPr>
           <w:rFonts w:ascii="Garamond" w:hAnsi="Garamond"/>
           <w:b w:val="0"/>
+          <w:i w:val="0"/>
           <w:color w:val="2D1F15"/>
           <w:sz w:val="23"/>
         </w:rPr>
@@ -1374,8 +1582,9 @@
     </w:p>
     <w:p>
       <w:pPr>
-        <w:spacing w:before="160" w:after="80"/>
+        <w:spacing w:before="160" w:after="100"/>
         <w:pBdr>
+          <w:top w:val="single" w:sz="8" w:space="6" w:color="7A4A22"/>
           <w:bottom w:val="single" w:sz="8" w:space="6" w:color="7A4A22"/>
         </w:pBdr>
       </w:pPr>
@@ -1383,10 +1592,11 @@
         <w:rPr>
           <w:rFonts w:ascii="Garamond" w:hAnsi="Garamond"/>
           <w:b/>
+          <w:i w:val="0"/>
           <w:color w:val="5C3114"/>
           <w:sz w:val="27"/>
         </w:rPr>
-        <w:t>Effect</w:t>
+        <w:t>Full Rules Text - Condensed Mechanics</w:t>
       </w:r>
     </w:p>
     <w:p>
@@ -1399,10 +1609,11 @@
         <w:rPr>
           <w:rFonts w:ascii="Garamond" w:hAnsi="Garamond"/>
           <w:b w:val="0"/>
+          <w:i w:val="0"/>
           <w:color w:val="2D1F15"/>
           <w:sz w:val="23"/>
         </w:rPr>
-        <w:t>A beam of freezing light lashes toward one creature in range.</w:t>
+        <w:t>Choose a creature within range.</w:t>
       </w:r>
     </w:p>
     <w:p>
@@ -1415,10 +1626,11 @@
         <w:rPr>
           <w:rFonts w:ascii="Garamond" w:hAnsi="Garamond"/>
           <w:b w:val="0"/>
+          <w:i w:val="0"/>
           <w:color w:val="2D1F15"/>
           <w:sz w:val="23"/>
         </w:rPr>
-        <w:t>On a hit, the target takes cold damage.</w:t>
+        <w:t>Make a ranged spell attack against the target.</w:t>
       </w:r>
     </w:p>
     <w:p>
@@ -1431,16 +1643,35 @@
         <w:rPr>
           <w:rFonts w:ascii="Garamond" w:hAnsi="Garamond"/>
           <w:b w:val="0"/>
+          <w:i w:val="0"/>
           <w:color w:val="2D1F15"/>
           <w:sz w:val="23"/>
         </w:rPr>
-        <w:t>The target's speed is reduced by 10 feet until the start of Fetarak's next turn.</w:t>
+        <w:t>On a hit, the target takes 1d8 cold damage.</w:t>
       </w:r>
     </w:p>
     <w:p>
       <w:pPr>
-        <w:spacing w:before="160" w:after="80"/>
+        <w:pStyle w:val="ListBullet"/>
+        <w:spacing w:after="40"/>
+        <w:ind w:left="360"/>
+      </w:pPr>
+      <w:r>
+        <w:rPr>
+          <w:rFonts w:ascii="Garamond" w:hAnsi="Garamond"/>
+          <w:b w:val="0"/>
+          <w:i w:val="0"/>
+          <w:color w:val="2D1F15"/>
+          <w:sz w:val="23"/>
+        </w:rPr>
+        <w:t>On a hit, the target's speed is reduced by 10 feet until the start of the caster's next turn.</w:t>
+      </w:r>
+    </w:p>
+    <w:p>
+      <w:pPr>
+        <w:spacing w:before="160" w:after="100"/>
         <w:pBdr>
+          <w:top w:val="single" w:sz="8" w:space="6" w:color="7A4A22"/>
           <w:bottom w:val="single" w:sz="8" w:space="6" w:color="7A4A22"/>
         </w:pBdr>
       </w:pPr>
@@ -1448,6 +1679,7 @@
         <w:rPr>
           <w:rFonts w:ascii="Garamond" w:hAnsi="Garamond"/>
           <w:b/>
+          <w:i w:val="0"/>
           <w:color w:val="5C3114"/>
           <w:sz w:val="27"/>
         </w:rPr>
@@ -1464,16 +1696,18 @@
         <w:rPr>
           <w:rFonts w:ascii="Garamond" w:hAnsi="Garamond"/>
           <w:b w:val="0"/>
+          <w:i w:val="0"/>
           <w:color w:val="2D1F15"/>
           <w:sz w:val="23"/>
         </w:rPr>
-        <w:t>Damage increases by 1d8 at character levels 5, 11, and 17.</w:t>
+        <w:t>The damage increases by 1d8 at 5th level, 11th level, and 17th level.</w:t>
       </w:r>
     </w:p>
     <w:p>
       <w:pPr>
-        <w:spacing w:before="260" w:after="80"/>
+        <w:spacing w:before="300" w:after="100"/>
         <w:pBdr>
+          <w:top w:val="single" w:sz="8" w:space="6" w:color="7A4A22"/>
           <w:bottom w:val="single" w:sz="8" w:space="6" w:color="7A4A22"/>
         </w:pBdr>
       </w:pPr>
@@ -1481,6 +1715,7 @@
         <w:rPr>
           <w:rFonts w:ascii="Garamond" w:hAnsi="Garamond"/>
           <w:b/>
+          <w:i w:val="0"/>
           <w:color w:val="5C3114"/>
           <w:sz w:val="32"/>
         </w:rPr>
@@ -1495,6 +1730,7 @@
         <w:rPr>
           <w:rFonts w:ascii="Garamond" w:hAnsi="Garamond"/>
           <w:b/>
+          <w:i w:val="0"/>
           <w:color w:val="5C3114"/>
           <w:sz w:val="23"/>
         </w:rPr>
@@ -1509,6 +1745,7 @@
         <w:rPr>
           <w:rFonts w:ascii="Garamond" w:hAnsi="Garamond"/>
           <w:b/>
+          <w:i w:val="0"/>
           <w:color w:val="5C3114"/>
           <w:sz w:val="23"/>
         </w:rPr>
@@ -1518,6 +1755,7 @@
         <w:rPr>
           <w:rFonts w:ascii="Garamond" w:hAnsi="Garamond"/>
           <w:b w:val="0"/>
+          <w:i w:val="0"/>
           <w:color w:val="2D1F15"/>
           <w:sz w:val="23"/>
         </w:rPr>
@@ -1532,6 +1770,7 @@
         <w:rPr>
           <w:rFonts w:ascii="Garamond" w:hAnsi="Garamond"/>
           <w:b/>
+          <w:i w:val="0"/>
           <w:color w:val="5C3114"/>
           <w:sz w:val="23"/>
         </w:rPr>
@@ -1541,6 +1780,7 @@
         <w:rPr>
           <w:rFonts w:ascii="Garamond" w:hAnsi="Garamond"/>
           <w:b w:val="0"/>
+          <w:i w:val="0"/>
           <w:color w:val="2D1F15"/>
           <w:sz w:val="23"/>
         </w:rPr>
@@ -1555,6 +1795,7 @@
         <w:rPr>
           <w:rFonts w:ascii="Garamond" w:hAnsi="Garamond"/>
           <w:b/>
+          <w:i w:val="0"/>
           <w:color w:val="5C3114"/>
           <w:sz w:val="23"/>
         </w:rPr>
@@ -1564,6 +1805,7 @@
         <w:rPr>
           <w:rFonts w:ascii="Garamond" w:hAnsi="Garamond"/>
           <w:b w:val="0"/>
+          <w:i w:val="0"/>
           <w:color w:val="2D1F15"/>
           <w:sz w:val="23"/>
         </w:rPr>
@@ -1578,6 +1820,7 @@
         <w:rPr>
           <w:rFonts w:ascii="Garamond" w:hAnsi="Garamond"/>
           <w:b/>
+          <w:i w:val="0"/>
           <w:color w:val="5C3114"/>
           <w:sz w:val="23"/>
         </w:rPr>
@@ -1587,6 +1830,7 @@
         <w:rPr>
           <w:rFonts w:ascii="Garamond" w:hAnsi="Garamond"/>
           <w:b w:val="0"/>
+          <w:i w:val="0"/>
           <w:color w:val="2D1F15"/>
           <w:sz w:val="23"/>
         </w:rPr>
@@ -1601,6 +1845,7 @@
         <w:rPr>
           <w:rFonts w:ascii="Garamond" w:hAnsi="Garamond"/>
           <w:b/>
+          <w:i w:val="0"/>
           <w:color w:val="5C3114"/>
           <w:sz w:val="23"/>
         </w:rPr>
@@ -1610,6 +1855,7 @@
         <w:rPr>
           <w:rFonts w:ascii="Garamond" w:hAnsi="Garamond"/>
           <w:b w:val="0"/>
+          <w:i w:val="0"/>
           <w:color w:val="2D1F15"/>
           <w:sz w:val="23"/>
         </w:rPr>
@@ -1624,6 +1870,7 @@
         <w:rPr>
           <w:rFonts w:ascii="Garamond" w:hAnsi="Garamond"/>
           <w:b/>
+          <w:i w:val="0"/>
           <w:color w:val="5C3114"/>
           <w:sz w:val="23"/>
         </w:rPr>
@@ -1633,6 +1880,7 @@
         <w:rPr>
           <w:rFonts w:ascii="Garamond" w:hAnsi="Garamond"/>
           <w:b w:val="0"/>
+          <w:i w:val="0"/>
           <w:color w:val="2D1F15"/>
           <w:sz w:val="23"/>
         </w:rPr>
@@ -1641,8 +1889,9 @@
     </w:p>
     <w:p>
       <w:pPr>
-        <w:spacing w:before="160" w:after="80"/>
+        <w:spacing w:before="160" w:after="100"/>
         <w:pBdr>
+          <w:top w:val="single" w:sz="8" w:space="6" w:color="7A4A22"/>
           <w:bottom w:val="single" w:sz="8" w:space="6" w:color="7A4A22"/>
         </w:pBdr>
       </w:pPr>
@@ -1650,10 +1899,11 @@
         <w:rPr>
           <w:rFonts w:ascii="Garamond" w:hAnsi="Garamond"/>
           <w:b/>
+          <w:i w:val="0"/>
           <w:color w:val="5C3114"/>
           <w:sz w:val="27"/>
         </w:rPr>
-        <w:t>Effect</w:t>
+        <w:t>Full Rules Text - Condensed Mechanics</w:t>
       </w:r>
     </w:p>
     <w:p>
@@ -1666,10 +1916,11 @@
         <w:rPr>
           <w:rFonts w:ascii="Garamond" w:hAnsi="Garamond"/>
           <w:b w:val="0"/>
+          <w:i w:val="0"/>
           <w:color w:val="2D1F15"/>
           <w:sz w:val="23"/>
         </w:rPr>
-        <w:t>Fetarak creates a thorned vine-like whip that lashes at one creature within range.</w:t>
+        <w:t>Choose a creature within range.</w:t>
       </w:r>
     </w:p>
     <w:p>
@@ -1682,10 +1933,11 @@
         <w:rPr>
           <w:rFonts w:ascii="Garamond" w:hAnsi="Garamond"/>
           <w:b w:val="0"/>
+          <w:i w:val="0"/>
           <w:color w:val="2D1F15"/>
           <w:sz w:val="23"/>
         </w:rPr>
-        <w:t>On a hit, the creature takes piercing damage.</w:t>
+        <w:t>Make a melee spell attack against the target.</w:t>
       </w:r>
     </w:p>
     <w:p>
@@ -1698,16 +1950,35 @@
         <w:rPr>
           <w:rFonts w:ascii="Garamond" w:hAnsi="Garamond"/>
           <w:b w:val="0"/>
+          <w:i w:val="0"/>
           <w:color w:val="2D1F15"/>
           <w:sz w:val="23"/>
         </w:rPr>
-        <w:t>If the target is Large or smaller, Fetarak pulls it up to 10 feet closer.</w:t>
+        <w:t>On a hit, the target takes 1d6 piercing damage.</w:t>
       </w:r>
     </w:p>
     <w:p>
       <w:pPr>
-        <w:spacing w:before="160" w:after="80"/>
+        <w:pStyle w:val="ListBullet"/>
+        <w:spacing w:after="40"/>
+        <w:ind w:left="360"/>
+      </w:pPr>
+      <w:r>
+        <w:rPr>
+          <w:rFonts w:ascii="Garamond" w:hAnsi="Garamond"/>
+          <w:b w:val="0"/>
+          <w:i w:val="0"/>
+          <w:color w:val="2D1F15"/>
+          <w:sz w:val="23"/>
+        </w:rPr>
+        <w:t>If the target is Large or smaller, it is pulled up to 10 feet closer to the caster.</w:t>
+      </w:r>
+    </w:p>
+    <w:p>
+      <w:pPr>
+        <w:spacing w:before="160" w:after="100"/>
         <w:pBdr>
+          <w:top w:val="single" w:sz="8" w:space="6" w:color="7A4A22"/>
           <w:bottom w:val="single" w:sz="8" w:space="6" w:color="7A4A22"/>
         </w:pBdr>
       </w:pPr>
@@ -1715,6 +1986,7 @@
         <w:rPr>
           <w:rFonts w:ascii="Garamond" w:hAnsi="Garamond"/>
           <w:b/>
+          <w:i w:val="0"/>
           <w:color w:val="5C3114"/>
           <w:sz w:val="27"/>
         </w:rPr>
@@ -1731,16 +2003,18 @@
         <w:rPr>
           <w:rFonts w:ascii="Garamond" w:hAnsi="Garamond"/>
           <w:b w:val="0"/>
+          <w:i w:val="0"/>
           <w:color w:val="2D1F15"/>
           <w:sz w:val="23"/>
         </w:rPr>
-        <w:t>Damage increases by 1d6 at character levels 5, 11, and 17.</w:t>
+        <w:t>The damage increases by 1d6 at 5th level, 11th level, and 17th level.</w:t>
       </w:r>
     </w:p>
     <w:p>
       <w:pPr>
-        <w:spacing w:before="260" w:after="80"/>
+        <w:spacing w:before="300" w:after="100"/>
         <w:pBdr>
+          <w:top w:val="single" w:sz="8" w:space="6" w:color="7A4A22"/>
           <w:bottom w:val="single" w:sz="8" w:space="6" w:color="7A4A22"/>
         </w:pBdr>
       </w:pPr>
@@ -1748,16 +2022,18 @@
         <w:rPr>
           <w:rFonts w:ascii="Garamond" w:hAnsi="Garamond"/>
           <w:b/>
+          <w:i w:val="0"/>
           <w:color w:val="5C3114"/>
           <w:sz w:val="32"/>
         </w:rPr>
-        <w:t>1st-Level Spells</w:t>
+        <w:t>1st-Level Spells - Full Mechanics</w:t>
       </w:r>
     </w:p>
     <w:p>
       <w:pPr>
-        <w:spacing w:before="260" w:after="80"/>
+        <w:spacing w:before="300" w:after="100"/>
         <w:pBdr>
+          <w:top w:val="single" w:sz="8" w:space="6" w:color="7A4A22"/>
           <w:bottom w:val="single" w:sz="8" w:space="6" w:color="7A4A22"/>
         </w:pBdr>
       </w:pPr>
@@ -1765,6 +2041,7 @@
         <w:rPr>
           <w:rFonts w:ascii="Garamond" w:hAnsi="Garamond"/>
           <w:b/>
+          <w:i w:val="0"/>
           <w:color w:val="5C3114"/>
           <w:sz w:val="32"/>
         </w:rPr>
@@ -1779,6 +2056,7 @@
         <w:rPr>
           <w:rFonts w:ascii="Garamond" w:hAnsi="Garamond"/>
           <w:b/>
+          <w:i w:val="0"/>
           <w:color w:val="5C3114"/>
           <w:sz w:val="23"/>
         </w:rPr>
@@ -1793,6 +2071,7 @@
         <w:rPr>
           <w:rFonts w:ascii="Garamond" w:hAnsi="Garamond"/>
           <w:b/>
+          <w:i w:val="0"/>
           <w:color w:val="5C3114"/>
           <w:sz w:val="23"/>
         </w:rPr>
@@ -1802,6 +2081,7 @@
         <w:rPr>
           <w:rFonts w:ascii="Garamond" w:hAnsi="Garamond"/>
           <w:b w:val="0"/>
+          <w:i w:val="0"/>
           <w:color w:val="2D1F15"/>
           <w:sz w:val="23"/>
         </w:rPr>
@@ -1816,6 +2096,7 @@
         <w:rPr>
           <w:rFonts w:ascii="Garamond" w:hAnsi="Garamond"/>
           <w:b/>
+          <w:i w:val="0"/>
           <w:color w:val="5C3114"/>
           <w:sz w:val="23"/>
         </w:rPr>
@@ -1825,6 +2106,7 @@
         <w:rPr>
           <w:rFonts w:ascii="Garamond" w:hAnsi="Garamond"/>
           <w:b w:val="0"/>
+          <w:i w:val="0"/>
           <w:color w:val="2D1F15"/>
           <w:sz w:val="23"/>
         </w:rPr>
@@ -1839,6 +2121,7 @@
         <w:rPr>
           <w:rFonts w:ascii="Garamond" w:hAnsi="Garamond"/>
           <w:b/>
+          <w:i w:val="0"/>
           <w:color w:val="5C3114"/>
           <w:sz w:val="23"/>
         </w:rPr>
@@ -1848,6 +2131,7 @@
         <w:rPr>
           <w:rFonts w:ascii="Garamond" w:hAnsi="Garamond"/>
           <w:b w:val="0"/>
+          <w:i w:val="0"/>
           <w:color w:val="2D1F15"/>
           <w:sz w:val="23"/>
         </w:rPr>
@@ -1862,6 +2146,7 @@
         <w:rPr>
           <w:rFonts w:ascii="Garamond" w:hAnsi="Garamond"/>
           <w:b/>
+          <w:i w:val="0"/>
           <w:color w:val="5C3114"/>
           <w:sz w:val="23"/>
         </w:rPr>
@@ -1871,6 +2156,7 @@
         <w:rPr>
           <w:rFonts w:ascii="Garamond" w:hAnsi="Garamond"/>
           <w:b w:val="0"/>
+          <w:i w:val="0"/>
           <w:color w:val="2D1F15"/>
           <w:sz w:val="23"/>
         </w:rPr>
@@ -1885,6 +2171,7 @@
         <w:rPr>
           <w:rFonts w:ascii="Garamond" w:hAnsi="Garamond"/>
           <w:b/>
+          <w:i w:val="0"/>
           <w:color w:val="5C3114"/>
           <w:sz w:val="23"/>
         </w:rPr>
@@ -1894,6 +2181,7 @@
         <w:rPr>
           <w:rFonts w:ascii="Garamond" w:hAnsi="Garamond"/>
           <w:b w:val="0"/>
+          <w:i w:val="0"/>
           <w:color w:val="2D1F15"/>
           <w:sz w:val="23"/>
         </w:rPr>
@@ -1908,6 +2196,7 @@
         <w:rPr>
           <w:rFonts w:ascii="Garamond" w:hAnsi="Garamond"/>
           <w:b/>
+          <w:i w:val="0"/>
           <w:color w:val="5C3114"/>
           <w:sz w:val="23"/>
         </w:rPr>
@@ -1917,16 +2206,18 @@
         <w:rPr>
           <w:rFonts w:ascii="Garamond" w:hAnsi="Garamond"/>
           <w:b w:val="0"/>
+          <w:i w:val="0"/>
           <w:color w:val="2D1F15"/>
           <w:sz w:val="23"/>
         </w:rPr>
-        <w:t>1d10 piercing, then 2d6 cold in the burst</w:t>
+        <w:t>1d10 piercing; 2d6 cold explosion</w:t>
       </w:r>
     </w:p>
     <w:p>
       <w:pPr>
-        <w:spacing w:before="160" w:after="80"/>
+        <w:spacing w:before="160" w:after="100"/>
         <w:pBdr>
+          <w:top w:val="single" w:sz="8" w:space="6" w:color="7A4A22"/>
           <w:bottom w:val="single" w:sz="8" w:space="6" w:color="7A4A22"/>
         </w:pBdr>
       </w:pPr>
@@ -1934,10 +2225,11 @@
         <w:rPr>
           <w:rFonts w:ascii="Garamond" w:hAnsi="Garamond"/>
           <w:b/>
+          <w:i w:val="0"/>
           <w:color w:val="5C3114"/>
           <w:sz w:val="27"/>
         </w:rPr>
-        <w:t>Effect</w:t>
+        <w:t>Full Rules Text - Condensed Mechanics</w:t>
       </w:r>
     </w:p>
     <w:p>
@@ -1950,10 +2242,11 @@
         <w:rPr>
           <w:rFonts w:ascii="Garamond" w:hAnsi="Garamond"/>
           <w:b w:val="0"/>
+          <w:i w:val="0"/>
           <w:color w:val="2D1F15"/>
           <w:sz w:val="23"/>
         </w:rPr>
-        <w:t>Fetarak creates and throws a shard of ice at one creature in range.</w:t>
+        <w:t>Choose one creature within range.</w:t>
       </w:r>
     </w:p>
     <w:p>
@@ -1966,10 +2259,11 @@
         <w:rPr>
           <w:rFonts w:ascii="Garamond" w:hAnsi="Garamond"/>
           <w:b w:val="0"/>
+          <w:i w:val="0"/>
           <w:color w:val="2D1F15"/>
           <w:sz w:val="23"/>
         </w:rPr>
-        <w:t>On a hit, the target takes piercing damage.</w:t>
+        <w:t>Make a ranged spell attack against the target.</w:t>
       </w:r>
     </w:p>
     <w:p>
@@ -1982,10 +2276,11 @@
         <w:rPr>
           <w:rFonts w:ascii="Garamond" w:hAnsi="Garamond"/>
           <w:b w:val="0"/>
+          <w:i w:val="0"/>
           <w:color w:val="2D1F15"/>
           <w:sz w:val="23"/>
         </w:rPr>
-        <w:t>Hit or miss, the shard explodes at the target point.</w:t>
+        <w:t>On a hit, the target takes 1d10 piercing damage.</w:t>
       </w:r>
     </w:p>
     <w:p>
@@ -1998,16 +2293,52 @@
         <w:rPr>
           <w:rFonts w:ascii="Garamond" w:hAnsi="Garamond"/>
           <w:b w:val="0"/>
+          <w:i w:val="0"/>
           <w:color w:val="2D1F15"/>
           <w:sz w:val="23"/>
         </w:rPr>
-        <w:t>The target and each creature within 5 feet of the explosion must make a Dexterity save or take cold damage.</w:t>
+        <w:t>Hit or miss, the shard explodes.</w:t>
       </w:r>
     </w:p>
     <w:p>
       <w:pPr>
-        <w:spacing w:before="160" w:after="80"/>
+        <w:pStyle w:val="ListBullet"/>
+        <w:spacing w:after="40"/>
+        <w:ind w:left="360"/>
+      </w:pPr>
+      <w:r>
+        <w:rPr>
+          <w:rFonts w:ascii="Garamond" w:hAnsi="Garamond"/>
+          <w:b w:val="0"/>
+          <w:i w:val="0"/>
+          <w:color w:val="2D1F15"/>
+          <w:sz w:val="23"/>
+        </w:rPr>
+        <w:t>The target and each creature within 5 feet of the explosion point must make a Dexterity saving throw.</w:t>
+      </w:r>
+    </w:p>
+    <w:p>
+      <w:pPr>
+        <w:pStyle w:val="ListBullet"/>
+        <w:spacing w:after="40"/>
+        <w:ind w:left="360"/>
+      </w:pPr>
+      <w:r>
+        <w:rPr>
+          <w:rFonts w:ascii="Garamond" w:hAnsi="Garamond"/>
+          <w:b w:val="0"/>
+          <w:i w:val="0"/>
+          <w:color w:val="2D1F15"/>
+          <w:sz w:val="23"/>
+        </w:rPr>
+        <w:t>A creature that fails the save takes 2d6 cold damage.</w:t>
+      </w:r>
+    </w:p>
+    <w:p>
+      <w:pPr>
+        <w:spacing w:before="160" w:after="100"/>
         <w:pBdr>
+          <w:top w:val="single" w:sz="8" w:space="6" w:color="7A4A22"/>
           <w:bottom w:val="single" w:sz="8" w:space="6" w:color="7A4A22"/>
         </w:pBdr>
       </w:pPr>
@@ -2015,6 +2346,7 @@
         <w:rPr>
           <w:rFonts w:ascii="Garamond" w:hAnsi="Garamond"/>
           <w:b/>
+          <w:i w:val="0"/>
           <w:color w:val="5C3114"/>
           <w:sz w:val="27"/>
         </w:rPr>
@@ -2031,16 +2363,18 @@
         <w:rPr>
           <w:rFonts w:ascii="Garamond" w:hAnsi="Garamond"/>
           <w:b w:val="0"/>
+          <w:i w:val="0"/>
           <w:color w:val="2D1F15"/>
           <w:sz w:val="23"/>
         </w:rPr>
-        <w:t>When cast with a 2nd-level or higher slot, the cold damage increases by 1d6 for each slot level above 1st.</w:t>
+        <w:t>When cast with a spell slot of 2nd level or higher, the cold damage increases by 1d6 for each slot level above 1st.</w:t>
       </w:r>
     </w:p>
     <w:p>
       <w:pPr>
-        <w:spacing w:before="260" w:after="80"/>
+        <w:spacing w:before="300" w:after="100"/>
         <w:pBdr>
+          <w:top w:val="single" w:sz="8" w:space="6" w:color="7A4A22"/>
           <w:bottom w:val="single" w:sz="8" w:space="6" w:color="7A4A22"/>
         </w:pBdr>
       </w:pPr>
@@ -2048,6 +2382,7 @@
         <w:rPr>
           <w:rFonts w:ascii="Garamond" w:hAnsi="Garamond"/>
           <w:b/>
+          <w:i w:val="0"/>
           <w:color w:val="5C3114"/>
           <w:sz w:val="32"/>
         </w:rPr>
@@ -2062,6 +2397,7 @@
         <w:rPr>
           <w:rFonts w:ascii="Garamond" w:hAnsi="Garamond"/>
           <w:b/>
+          <w:i w:val="0"/>
           <w:color w:val="5C3114"/>
           <w:sz w:val="23"/>
         </w:rPr>
@@ -2076,6 +2412,7 @@
         <w:rPr>
           <w:rFonts w:ascii="Garamond" w:hAnsi="Garamond"/>
           <w:b/>
+          <w:i w:val="0"/>
           <w:color w:val="5C3114"/>
           <w:sz w:val="23"/>
         </w:rPr>
@@ -2085,6 +2422,7 @@
         <w:rPr>
           <w:rFonts w:ascii="Garamond" w:hAnsi="Garamond"/>
           <w:b w:val="0"/>
+          <w:i w:val="0"/>
           <w:color w:val="2D1F15"/>
           <w:sz w:val="23"/>
         </w:rPr>
@@ -2099,6 +2437,7 @@
         <w:rPr>
           <w:rFonts w:ascii="Garamond" w:hAnsi="Garamond"/>
           <w:b/>
+          <w:i w:val="0"/>
           <w:color w:val="5C3114"/>
           <w:sz w:val="23"/>
         </w:rPr>
@@ -2108,6 +2447,7 @@
         <w:rPr>
           <w:rFonts w:ascii="Garamond" w:hAnsi="Garamond"/>
           <w:b w:val="0"/>
+          <w:i w:val="0"/>
           <w:color w:val="2D1F15"/>
           <w:sz w:val="23"/>
         </w:rPr>
@@ -2122,6 +2462,7 @@
         <w:rPr>
           <w:rFonts w:ascii="Garamond" w:hAnsi="Garamond"/>
           <w:b/>
+          <w:i w:val="0"/>
           <w:color w:val="5C3114"/>
           <w:sz w:val="23"/>
         </w:rPr>
@@ -2131,6 +2472,7 @@
         <w:rPr>
           <w:rFonts w:ascii="Garamond" w:hAnsi="Garamond"/>
           <w:b w:val="0"/>
+          <w:i w:val="0"/>
           <w:color w:val="2D1F15"/>
           <w:sz w:val="23"/>
         </w:rPr>
@@ -2145,6 +2487,7 @@
         <w:rPr>
           <w:rFonts w:ascii="Garamond" w:hAnsi="Garamond"/>
           <w:b/>
+          <w:i w:val="0"/>
           <w:color w:val="5C3114"/>
           <w:sz w:val="23"/>
         </w:rPr>
@@ -2154,6 +2497,7 @@
         <w:rPr>
           <w:rFonts w:ascii="Garamond" w:hAnsi="Garamond"/>
           <w:b w:val="0"/>
+          <w:i w:val="0"/>
           <w:color w:val="2D1F15"/>
           <w:sz w:val="23"/>
         </w:rPr>
@@ -2168,6 +2512,7 @@
         <w:rPr>
           <w:rFonts w:ascii="Garamond" w:hAnsi="Garamond"/>
           <w:b/>
+          <w:i w:val="0"/>
           <w:color w:val="5C3114"/>
           <w:sz w:val="23"/>
         </w:rPr>
@@ -2177,6 +2522,7 @@
         <w:rPr>
           <w:rFonts w:ascii="Garamond" w:hAnsi="Garamond"/>
           <w:b w:val="0"/>
+          <w:i w:val="0"/>
           <w:color w:val="2D1F15"/>
           <w:sz w:val="23"/>
         </w:rPr>
@@ -2191,6 +2537,7 @@
         <w:rPr>
           <w:rFonts w:ascii="Garamond" w:hAnsi="Garamond"/>
           <w:b/>
+          <w:i w:val="0"/>
           <w:color w:val="5C3114"/>
           <w:sz w:val="23"/>
         </w:rPr>
@@ -2200,6 +2547,7 @@
         <w:rPr>
           <w:rFonts w:ascii="Garamond" w:hAnsi="Garamond"/>
           <w:b w:val="0"/>
+          <w:i w:val="0"/>
           <w:color w:val="2D1F15"/>
           <w:sz w:val="23"/>
         </w:rPr>
@@ -2208,8 +2556,9 @@
     </w:p>
     <w:p>
       <w:pPr>
-        <w:spacing w:before="160" w:after="80"/>
+        <w:spacing w:before="160" w:after="100"/>
         <w:pBdr>
+          <w:top w:val="single" w:sz="8" w:space="6" w:color="7A4A22"/>
           <w:bottom w:val="single" w:sz="8" w:space="6" w:color="7A4A22"/>
         </w:pBdr>
       </w:pPr>
@@ -2217,10 +2566,11 @@
         <w:rPr>
           <w:rFonts w:ascii="Garamond" w:hAnsi="Garamond"/>
           <w:b/>
+          <w:i w:val="0"/>
           <w:color w:val="5C3114"/>
           <w:sz w:val="27"/>
         </w:rPr>
-        <w:t>Effect</w:t>
+        <w:t>Full Rules Text - Condensed Mechanics</w:t>
       </w:r>
     </w:p>
     <w:p>
@@ -2233,10 +2583,11 @@
         <w:rPr>
           <w:rFonts w:ascii="Garamond" w:hAnsi="Garamond"/>
           <w:b w:val="0"/>
+          <w:i w:val="0"/>
           <w:color w:val="2D1F15"/>
           <w:sz w:val="23"/>
         </w:rPr>
-        <w:t>A flash of radiant light streaks toward one creature within range.</w:t>
+        <w:t>Choose a creature within range.</w:t>
       </w:r>
     </w:p>
     <w:p>
@@ -2249,10 +2600,11 @@
         <w:rPr>
           <w:rFonts w:ascii="Garamond" w:hAnsi="Garamond"/>
           <w:b w:val="0"/>
+          <w:i w:val="0"/>
           <w:color w:val="2D1F15"/>
           <w:sz w:val="23"/>
         </w:rPr>
-        <w:t>On a hit, the target takes radiant damage.</w:t>
+        <w:t>Make a ranged spell attack against the target.</w:t>
       </w:r>
     </w:p>
     <w:p>
@@ -2265,16 +2617,35 @@
         <w:rPr>
           <w:rFonts w:ascii="Garamond" w:hAnsi="Garamond"/>
           <w:b w:val="0"/>
+          <w:i w:val="0"/>
           <w:color w:val="2D1F15"/>
           <w:sz w:val="23"/>
         </w:rPr>
-        <w:t>Until the end of Fetarak's next turn, the next attack roll against that target has advantage as dim magical light clings to it.</w:t>
+        <w:t>On a hit, the target takes 4d6 radiant damage.</w:t>
       </w:r>
     </w:p>
     <w:p>
       <w:pPr>
-        <w:spacing w:before="160" w:after="80"/>
+        <w:pStyle w:val="ListBullet"/>
+        <w:spacing w:after="40"/>
+        <w:ind w:left="360"/>
+      </w:pPr>
+      <w:r>
+        <w:rPr>
+          <w:rFonts w:ascii="Garamond" w:hAnsi="Garamond"/>
+          <w:b w:val="0"/>
+          <w:i w:val="0"/>
+          <w:color w:val="2D1F15"/>
+          <w:sz w:val="23"/>
+        </w:rPr>
+        <w:t>The next attack roll made against the target before the end of the caster's next turn has advantage.</w:t>
+      </w:r>
+    </w:p>
+    <w:p>
+      <w:pPr>
+        <w:spacing w:before="160" w:after="100"/>
         <w:pBdr>
+          <w:top w:val="single" w:sz="8" w:space="6" w:color="7A4A22"/>
           <w:bottom w:val="single" w:sz="8" w:space="6" w:color="7A4A22"/>
         </w:pBdr>
       </w:pPr>
@@ -2282,6 +2653,7 @@
         <w:rPr>
           <w:rFonts w:ascii="Garamond" w:hAnsi="Garamond"/>
           <w:b/>
+          <w:i w:val="0"/>
           <w:color w:val="5C3114"/>
           <w:sz w:val="27"/>
         </w:rPr>
@@ -2298,16 +2670,18 @@
         <w:rPr>
           <w:rFonts w:ascii="Garamond" w:hAnsi="Garamond"/>
           <w:b w:val="0"/>
+          <w:i w:val="0"/>
           <w:color w:val="2D1F15"/>
           <w:sz w:val="23"/>
         </w:rPr>
-        <w:t>When cast with a 2nd-level or higher slot, damage increases by 1d6 for each slot level above 1st.</w:t>
+        <w:t>When cast with a spell slot of 2nd level or higher, the damage increases by 1d6 for each slot level above 1st.</w:t>
       </w:r>
     </w:p>
     <w:p>
       <w:pPr>
-        <w:spacing w:before="260" w:after="80"/>
+        <w:spacing w:before="300" w:after="100"/>
         <w:pBdr>
+          <w:top w:val="single" w:sz="8" w:space="6" w:color="7A4A22"/>
           <w:bottom w:val="single" w:sz="8" w:space="6" w:color="7A4A22"/>
         </w:pBdr>
       </w:pPr>
@@ -2315,6 +2689,7 @@
         <w:rPr>
           <w:rFonts w:ascii="Garamond" w:hAnsi="Garamond"/>
           <w:b/>
+          <w:i w:val="0"/>
           <w:color w:val="5C3114"/>
           <w:sz w:val="32"/>
         </w:rPr>
@@ -2329,6 +2704,7 @@
         <w:rPr>
           <w:rFonts w:ascii="Garamond" w:hAnsi="Garamond"/>
           <w:b/>
+          <w:i w:val="0"/>
           <w:color w:val="5C3114"/>
           <w:sz w:val="23"/>
         </w:rPr>
@@ -2343,6 +2719,7 @@
         <w:rPr>
           <w:rFonts w:ascii="Garamond" w:hAnsi="Garamond"/>
           <w:b/>
+          <w:i w:val="0"/>
           <w:color w:val="5C3114"/>
           <w:sz w:val="23"/>
         </w:rPr>
@@ -2352,6 +2729,7 @@
         <w:rPr>
           <w:rFonts w:ascii="Garamond" w:hAnsi="Garamond"/>
           <w:b w:val="0"/>
+          <w:i w:val="0"/>
           <w:color w:val="2D1F15"/>
           <w:sz w:val="23"/>
         </w:rPr>
@@ -2366,6 +2744,7 @@
         <w:rPr>
           <w:rFonts w:ascii="Garamond" w:hAnsi="Garamond"/>
           <w:b/>
+          <w:i w:val="0"/>
           <w:color w:val="5C3114"/>
           <w:sz w:val="23"/>
         </w:rPr>
@@ -2375,6 +2754,7 @@
         <w:rPr>
           <w:rFonts w:ascii="Garamond" w:hAnsi="Garamond"/>
           <w:b w:val="0"/>
+          <w:i w:val="0"/>
           <w:color w:val="2D1F15"/>
           <w:sz w:val="23"/>
         </w:rPr>
@@ -2389,6 +2769,7 @@
         <w:rPr>
           <w:rFonts w:ascii="Garamond" w:hAnsi="Garamond"/>
           <w:b/>
+          <w:i w:val="0"/>
           <w:color w:val="5C3114"/>
           <w:sz w:val="23"/>
         </w:rPr>
@@ -2398,6 +2779,7 @@
         <w:rPr>
           <w:rFonts w:ascii="Garamond" w:hAnsi="Garamond"/>
           <w:b w:val="0"/>
+          <w:i w:val="0"/>
           <w:color w:val="2D1F15"/>
           <w:sz w:val="23"/>
         </w:rPr>
@@ -2412,6 +2794,7 @@
         <w:rPr>
           <w:rFonts w:ascii="Garamond" w:hAnsi="Garamond"/>
           <w:b/>
+          <w:i w:val="0"/>
           <w:color w:val="5C3114"/>
           <w:sz w:val="23"/>
         </w:rPr>
@@ -2421,6 +2804,7 @@
         <w:rPr>
           <w:rFonts w:ascii="Garamond" w:hAnsi="Garamond"/>
           <w:b w:val="0"/>
+          <w:i w:val="0"/>
           <w:color w:val="2D1F15"/>
           <w:sz w:val="23"/>
         </w:rPr>
@@ -2435,6 +2819,7 @@
         <w:rPr>
           <w:rFonts w:ascii="Garamond" w:hAnsi="Garamond"/>
           <w:b/>
+          <w:i w:val="0"/>
           <w:color w:val="5C3114"/>
           <w:sz w:val="23"/>
         </w:rPr>
@@ -2444,6 +2829,7 @@
         <w:rPr>
           <w:rFonts w:ascii="Garamond" w:hAnsi="Garamond"/>
           <w:b w:val="0"/>
+          <w:i w:val="0"/>
           <w:color w:val="2D1F15"/>
           <w:sz w:val="23"/>
         </w:rPr>
@@ -2458,6 +2844,7 @@
         <w:rPr>
           <w:rFonts w:ascii="Garamond" w:hAnsi="Garamond"/>
           <w:b/>
+          <w:i w:val="0"/>
           <w:color w:val="5C3114"/>
           <w:sz w:val="23"/>
         </w:rPr>
@@ -2467,16 +2854,18 @@
         <w:rPr>
           <w:rFonts w:ascii="Garamond" w:hAnsi="Garamond"/>
           <w:b w:val="0"/>
+          <w:i w:val="0"/>
           <w:color w:val="2D1F15"/>
           <w:sz w:val="23"/>
         </w:rPr>
-        <w:t>2d8 + 1d6; type decided by a d8</w:t>
+        <w:t>2d8 + 1d6; damage type from d8 result</w:t>
       </w:r>
     </w:p>
     <w:p>
       <w:pPr>
-        <w:spacing w:before="160" w:after="80"/>
+        <w:spacing w:before="160" w:after="100"/>
         <w:pBdr>
+          <w:top w:val="single" w:sz="8" w:space="6" w:color="7A4A22"/>
           <w:bottom w:val="single" w:sz="8" w:space="6" w:color="7A4A22"/>
         </w:pBdr>
       </w:pPr>
@@ -2484,10 +2873,11 @@
         <w:rPr>
           <w:rFonts w:ascii="Garamond" w:hAnsi="Garamond"/>
           <w:b/>
+          <w:i w:val="0"/>
           <w:color w:val="5C3114"/>
           <w:sz w:val="27"/>
         </w:rPr>
-        <w:t>Effect</w:t>
+        <w:t>Full Rules Text - Condensed Mechanics</w:t>
       </w:r>
     </w:p>
     <w:p>
@@ -2500,10 +2890,11 @@
         <w:rPr>
           <w:rFonts w:ascii="Garamond" w:hAnsi="Garamond"/>
           <w:b w:val="0"/>
+          <w:i w:val="0"/>
           <w:color w:val="2D1F15"/>
           <w:sz w:val="23"/>
         </w:rPr>
-        <w:t>Fetarak throws unstable chaotic energy at one creature in range.</w:t>
+        <w:t>Choose one creature within range.</w:t>
       </w:r>
     </w:p>
     <w:p>
@@ -2516,6 +2907,24 @@
         <w:rPr>
           <w:rFonts w:ascii="Garamond" w:hAnsi="Garamond"/>
           <w:b w:val="0"/>
+          <w:i w:val="0"/>
+          <w:color w:val="2D1F15"/>
+          <w:sz w:val="23"/>
+        </w:rPr>
+        <w:t>Make a ranged spell attack against the target.</w:t>
+      </w:r>
+    </w:p>
+    <w:p>
+      <w:pPr>
+        <w:pStyle w:val="ListBullet"/>
+        <w:spacing w:after="40"/>
+        <w:ind w:left="360"/>
+      </w:pPr>
+      <w:r>
+        <w:rPr>
+          <w:rFonts w:ascii="Garamond" w:hAnsi="Garamond"/>
+          <w:b w:val="0"/>
+          <w:i w:val="0"/>
           <w:color w:val="2D1F15"/>
           <w:sz w:val="23"/>
         </w:rPr>
@@ -2532,10 +2941,11 @@
         <w:rPr>
           <w:rFonts w:ascii="Garamond" w:hAnsi="Garamond"/>
           <w:b w:val="0"/>
+          <w:i w:val="0"/>
           <w:color w:val="2D1F15"/>
           <w:sz w:val="23"/>
         </w:rPr>
-        <w:t>Choose one of the rolled d8s to determine damage type: 1 acid, 2 cold, 3 fire, 4 force, 5 lightning, 6 poison, 7 psychic, 8 thunder.</w:t>
+        <w:t>Choose one of the d8s rolled for damage; that die determines the damage type.</w:t>
       </w:r>
     </w:p>
     <w:p>
@@ -2548,10 +2958,11 @@
         <w:rPr>
           <w:rFonts w:ascii="Garamond" w:hAnsi="Garamond"/>
           <w:b w:val="0"/>
+          <w:i w:val="0"/>
           <w:color w:val="2D1F15"/>
           <w:sz w:val="23"/>
         </w:rPr>
-        <w:t>If both d8s show the same number, the energy leaps to a different creature of Fetarak's choice within 30 feet of the first target.</w:t>
+        <w:t>Damage type table: 1 acid, 2 cold, 3 fire, 4 force, 5 lightning, 6 poison, 7 psychic, 8 thunder.</w:t>
       </w:r>
     </w:p>
     <w:p>
@@ -2564,10 +2975,11 @@
         <w:rPr>
           <w:rFonts w:ascii="Garamond" w:hAnsi="Garamond"/>
           <w:b w:val="0"/>
+          <w:i w:val="0"/>
           <w:color w:val="2D1F15"/>
           <w:sz w:val="23"/>
         </w:rPr>
-        <w:t>The leaping bolt uses a new attack roll and new damage roll, and it can keep leaping if the d8s match again.</w:t>
+        <w:t>If both d8s show the same number, the energy jumps to a different creature of the caster's choice within 30 feet of the target.</w:t>
       </w:r>
     </w:p>
     <w:p>
@@ -2580,16 +2992,52 @@
         <w:rPr>
           <w:rFonts w:ascii="Garamond" w:hAnsi="Garamond"/>
           <w:b w:val="0"/>
+          <w:i w:val="0"/>
           <w:color w:val="2D1F15"/>
           <w:sz w:val="23"/>
         </w:rPr>
-        <w:t>A creature can be targeted only once by a single casting.</w:t>
+        <w:t>The new target requires a new attack roll and a new damage roll.</w:t>
       </w:r>
     </w:p>
     <w:p>
       <w:pPr>
-        <w:spacing w:before="160" w:after="80"/>
+        <w:pStyle w:val="ListBullet"/>
+        <w:spacing w:after="40"/>
+        <w:ind w:left="360"/>
+      </w:pPr>
+      <w:r>
+        <w:rPr>
+          <w:rFonts w:ascii="Garamond" w:hAnsi="Garamond"/>
+          <w:b w:val="0"/>
+          <w:i w:val="0"/>
+          <w:color w:val="2D1F15"/>
+          <w:sz w:val="23"/>
+        </w:rPr>
+        <w:t>The energy can keep jumping if the d8s match again.</w:t>
+      </w:r>
+    </w:p>
+    <w:p>
+      <w:pPr>
+        <w:pStyle w:val="ListBullet"/>
+        <w:spacing w:after="40"/>
+        <w:ind w:left="360"/>
+      </w:pPr>
+      <w:r>
+        <w:rPr>
+          <w:rFonts w:ascii="Garamond" w:hAnsi="Garamond"/>
+          <w:b w:val="0"/>
+          <w:i w:val="0"/>
+          <w:color w:val="2D1F15"/>
+          <w:sz w:val="23"/>
+        </w:rPr>
+        <w:t>A creature can be targeted only once by a single casting of this spell.</w:t>
+      </w:r>
+    </w:p>
+    <w:p>
+      <w:pPr>
+        <w:spacing w:before="160" w:after="100"/>
         <w:pBdr>
+          <w:top w:val="single" w:sz="8" w:space="6" w:color="7A4A22"/>
           <w:bottom w:val="single" w:sz="8" w:space="6" w:color="7A4A22"/>
         </w:pBdr>
       </w:pPr>
@@ -2597,6 +3045,7 @@
         <w:rPr>
           <w:rFonts w:ascii="Garamond" w:hAnsi="Garamond"/>
           <w:b/>
+          <w:i w:val="0"/>
           <w:color w:val="5C3114"/>
           <w:sz w:val="27"/>
         </w:rPr>
@@ -2613,16 +3062,18 @@
         <w:rPr>
           <w:rFonts w:ascii="Garamond" w:hAnsi="Garamond"/>
           <w:b w:val="0"/>
+          <w:i w:val="0"/>
           <w:color w:val="2D1F15"/>
           <w:sz w:val="23"/>
         </w:rPr>
-        <w:t>When cast with a 2nd-level or higher slot, each target takes 1d6 extra damage for each slot level above 1st.</w:t>
+        <w:t>When cast with a spell slot of 2nd level or higher, each target takes 1d6 extra damage for each slot level above 1st.</w:t>
       </w:r>
     </w:p>
     <w:p>
       <w:pPr>
-        <w:spacing w:before="260" w:after="80"/>
+        <w:spacing w:before="300" w:after="100"/>
         <w:pBdr>
+          <w:top w:val="single" w:sz="8" w:space="6" w:color="7A4A22"/>
           <w:bottom w:val="single" w:sz="8" w:space="6" w:color="7A4A22"/>
         </w:pBdr>
       </w:pPr>
@@ -2630,6 +3081,7 @@
         <w:rPr>
           <w:rFonts w:ascii="Garamond" w:hAnsi="Garamond"/>
           <w:b/>
+          <w:i w:val="0"/>
           <w:color w:val="5C3114"/>
           <w:sz w:val="32"/>
         </w:rPr>
@@ -2644,6 +3096,7 @@
         <w:rPr>
           <w:rFonts w:ascii="Garamond" w:hAnsi="Garamond"/>
           <w:b/>
+          <w:i w:val="0"/>
           <w:color w:val="5C3114"/>
           <w:sz w:val="23"/>
         </w:rPr>
@@ -2658,6 +3111,7 @@
         <w:rPr>
           <w:rFonts w:ascii="Garamond" w:hAnsi="Garamond"/>
           <w:b/>
+          <w:i w:val="0"/>
           <w:color w:val="5C3114"/>
           <w:sz w:val="23"/>
         </w:rPr>
@@ -2667,6 +3121,7 @@
         <w:rPr>
           <w:rFonts w:ascii="Garamond" w:hAnsi="Garamond"/>
           <w:b w:val="0"/>
+          <w:i w:val="0"/>
           <w:color w:val="2D1F15"/>
           <w:sz w:val="23"/>
         </w:rPr>
@@ -2681,6 +3136,7 @@
         <w:rPr>
           <w:rFonts w:ascii="Garamond" w:hAnsi="Garamond"/>
           <w:b/>
+          <w:i w:val="0"/>
           <w:color w:val="5C3114"/>
           <w:sz w:val="23"/>
         </w:rPr>
@@ -2690,6 +3146,7 @@
         <w:rPr>
           <w:rFonts w:ascii="Garamond" w:hAnsi="Garamond"/>
           <w:b w:val="0"/>
+          <w:i w:val="0"/>
           <w:color w:val="2D1F15"/>
           <w:sz w:val="23"/>
         </w:rPr>
@@ -2704,6 +3161,7 @@
         <w:rPr>
           <w:rFonts w:ascii="Garamond" w:hAnsi="Garamond"/>
           <w:b/>
+          <w:i w:val="0"/>
           <w:color w:val="5C3114"/>
           <w:sz w:val="23"/>
         </w:rPr>
@@ -2713,6 +3171,7 @@
         <w:rPr>
           <w:rFonts w:ascii="Garamond" w:hAnsi="Garamond"/>
           <w:b w:val="0"/>
+          <w:i w:val="0"/>
           <w:color w:val="2D1F15"/>
           <w:sz w:val="23"/>
         </w:rPr>
@@ -2727,6 +3186,7 @@
         <w:rPr>
           <w:rFonts w:ascii="Garamond" w:hAnsi="Garamond"/>
           <w:b/>
+          <w:i w:val="0"/>
           <w:color w:val="5C3114"/>
           <w:sz w:val="23"/>
         </w:rPr>
@@ -2736,6 +3196,7 @@
         <w:rPr>
           <w:rFonts w:ascii="Garamond" w:hAnsi="Garamond"/>
           <w:b w:val="0"/>
+          <w:i w:val="0"/>
           <w:color w:val="2D1F15"/>
           <w:sz w:val="23"/>
         </w:rPr>
@@ -2750,6 +3211,7 @@
         <w:rPr>
           <w:rFonts w:ascii="Garamond" w:hAnsi="Garamond"/>
           <w:b/>
+          <w:i w:val="0"/>
           <w:color w:val="5C3114"/>
           <w:sz w:val="23"/>
         </w:rPr>
@@ -2759,6 +3221,7 @@
         <w:rPr>
           <w:rFonts w:ascii="Garamond" w:hAnsi="Garamond"/>
           <w:b w:val="0"/>
+          <w:i w:val="0"/>
           <w:color w:val="2D1F15"/>
           <w:sz w:val="23"/>
         </w:rPr>
@@ -2773,6 +3236,7 @@
         <w:rPr>
           <w:rFonts w:ascii="Garamond" w:hAnsi="Garamond"/>
           <w:b/>
+          <w:i w:val="0"/>
           <w:color w:val="5C3114"/>
           <w:sz w:val="23"/>
         </w:rPr>
@@ -2782,6 +3246,7 @@
         <w:rPr>
           <w:rFonts w:ascii="Garamond" w:hAnsi="Garamond"/>
           <w:b w:val="0"/>
+          <w:i w:val="0"/>
           <w:color w:val="2D1F15"/>
           <w:sz w:val="23"/>
         </w:rPr>
@@ -2790,8 +3255,9 @@
     </w:p>
     <w:p>
       <w:pPr>
-        <w:spacing w:before="160" w:after="80"/>
+        <w:spacing w:before="160" w:after="100"/>
         <w:pBdr>
+          <w:top w:val="single" w:sz="8" w:space="6" w:color="7A4A22"/>
           <w:bottom w:val="single" w:sz="8" w:space="6" w:color="7A4A22"/>
         </w:pBdr>
       </w:pPr>
@@ -2799,10 +3265,11 @@
         <w:rPr>
           <w:rFonts w:ascii="Garamond" w:hAnsi="Garamond"/>
           <w:b/>
+          <w:i w:val="0"/>
           <w:color w:val="5C3114"/>
           <w:sz w:val="27"/>
         </w:rPr>
-        <w:t>Effect</w:t>
+        <w:t>Full Rules Text - Condensed Mechanics</w:t>
       </w:r>
     </w:p>
     <w:p>
@@ -2815,10 +3282,11 @@
         <w:rPr>
           <w:rFonts w:ascii="Garamond" w:hAnsi="Garamond"/>
           <w:b w:val="0"/>
+          <w:i w:val="0"/>
           <w:color w:val="2D1F15"/>
           <w:sz w:val="23"/>
         </w:rPr>
-        <w:t>Fetarak forms a 4-inch sphere of elemental power and hurls it at one visible creature in range.</w:t>
+        <w:t>Choose one visible creature within range.</w:t>
       </w:r>
     </w:p>
     <w:p>
@@ -2831,10 +3299,11 @@
         <w:rPr>
           <w:rFonts w:ascii="Garamond" w:hAnsi="Garamond"/>
           <w:b w:val="0"/>
+          <w:i w:val="0"/>
           <w:color w:val="2D1F15"/>
           <w:sz w:val="23"/>
         </w:rPr>
-        <w:t>Before the attack, choose acid, cold, fire, lightning, poison, or thunder.</w:t>
+        <w:t>Choose acid, cold, fire, lightning, poison, or thunder as the orb's damage type.</w:t>
       </w:r>
     </w:p>
     <w:p>
@@ -2847,6 +3316,24 @@
         <w:rPr>
           <w:rFonts w:ascii="Garamond" w:hAnsi="Garamond"/>
           <w:b w:val="0"/>
+          <w:i w:val="0"/>
+          <w:color w:val="2D1F15"/>
+          <w:sz w:val="23"/>
+        </w:rPr>
+        <w:t>Make a ranged spell attack against the target.</w:t>
+      </w:r>
+    </w:p>
+    <w:p>
+      <w:pPr>
+        <w:pStyle w:val="ListBullet"/>
+        <w:spacing w:after="40"/>
+        <w:ind w:left="360"/>
+      </w:pPr>
+      <w:r>
+        <w:rPr>
+          <w:rFonts w:ascii="Garamond" w:hAnsi="Garamond"/>
+          <w:b w:val="0"/>
+          <w:i w:val="0"/>
           <w:color w:val="2D1F15"/>
           <w:sz w:val="23"/>
         </w:rPr>
@@ -2855,8 +3342,9 @@
     </w:p>
     <w:p>
       <w:pPr>
-        <w:spacing w:before="160" w:after="80"/>
+        <w:spacing w:before="160" w:after="100"/>
         <w:pBdr>
+          <w:top w:val="single" w:sz="8" w:space="6" w:color="7A4A22"/>
           <w:bottom w:val="single" w:sz="8" w:space="6" w:color="7A4A22"/>
         </w:pBdr>
       </w:pPr>
@@ -2864,6 +3352,7 @@
         <w:rPr>
           <w:rFonts w:ascii="Garamond" w:hAnsi="Garamond"/>
           <w:b/>
+          <w:i w:val="0"/>
           <w:color w:val="5C3114"/>
           <w:sz w:val="27"/>
         </w:rPr>
@@ -2880,41 +3369,48 @@
         <w:rPr>
           <w:rFonts w:ascii="Garamond" w:hAnsi="Garamond"/>
           <w:b w:val="0"/>
+          <w:i w:val="0"/>
           <w:color w:val="2D1F15"/>
           <w:sz w:val="23"/>
         </w:rPr>
-        <w:t>When cast with a 2nd-level or higher slot, damage increases by 1d8 for each slot level above 1st.</w:t>
+        <w:t>When cast with a spell slot of 2nd level or higher, the damage increases by 1d8 for each slot level above 1st.</w:t>
       </w:r>
     </w:p>
     <w:p>
       <w:pPr>
-        <w:spacing w:before="260" w:after="80"/>
+        <w:spacing w:before="300" w:after="100"/>
         <w:pBdr>
-          <w:bottom w:val="single" w:sz="8" w:space="6" w:color="7A4A22"/>
+          <w:top w:val="single" w:sz="10" w:space="6" w:color="8A2D1E"/>
+          <w:bottom w:val="single" w:sz="10" w:space="6" w:color="8A2D1E"/>
         </w:pBdr>
+        <w:shd w:fill="F8D9C8"/>
       </w:pPr>
       <w:r>
         <w:rPr>
           <w:rFonts w:ascii="Garamond" w:hAnsi="Garamond"/>
           <w:b/>
-          <w:color w:val="5C3114"/>
+          <w:i w:val="0"/>
+          <w:color w:val="781C12"/>
           <w:sz w:val="32"/>
         </w:rPr>
-        <w:t>2nd-Level Spells Also Written on Fetarak's Sheet</w:t>
+        <w:t>Outside Table Spells - Full Mechanics</w:t>
       </w:r>
     </w:p>
     <w:p>
       <w:pPr>
-        <w:spacing w:before="260" w:after="80"/>
+        <w:spacing w:before="300" w:after="100"/>
         <w:pBdr>
-          <w:bottom w:val="single" w:sz="8" w:space="6" w:color="7A4A22"/>
+          <w:top w:val="single" w:sz="10" w:space="6" w:color="8A2D1E"/>
+          <w:bottom w:val="single" w:sz="10" w:space="6" w:color="8A2D1E"/>
         </w:pBdr>
+        <w:shd w:fill="F8D9C8"/>
       </w:pPr>
       <w:r>
         <w:rPr>
           <w:rFonts w:ascii="Garamond" w:hAnsi="Garamond"/>
           <w:b/>
-          <w:color w:val="5C3114"/>
+          <w:i w:val="0"/>
+          <w:color w:val="781C12"/>
           <w:sz w:val="32"/>
         </w:rPr>
         <w:t>Moonbeam</w:t>
@@ -2928,7 +3424,8 @@
         <w:rPr>
           <w:rFonts w:ascii="Garamond" w:hAnsi="Garamond"/>
           <w:b/>
-          <w:color w:val="5C3114"/>
+          <w:i w:val="0"/>
+          <w:color w:val="781C12"/>
           <w:sz w:val="23"/>
         </w:rPr>
         <w:t>2nd-level evocation</w:t>
@@ -2942,6 +3439,7 @@
         <w:rPr>
           <w:rFonts w:ascii="Garamond" w:hAnsi="Garamond"/>
           <w:b/>
+          <w:i w:val="0"/>
           <w:color w:val="5C3114"/>
           <w:sz w:val="23"/>
         </w:rPr>
@@ -2951,6 +3449,7 @@
         <w:rPr>
           <w:rFonts w:ascii="Garamond" w:hAnsi="Garamond"/>
           <w:b w:val="0"/>
+          <w:i w:val="0"/>
           <w:color w:val="2D1F15"/>
           <w:sz w:val="23"/>
         </w:rPr>
@@ -2965,6 +3464,7 @@
         <w:rPr>
           <w:rFonts w:ascii="Garamond" w:hAnsi="Garamond"/>
           <w:b/>
+          <w:i w:val="0"/>
           <w:color w:val="5C3114"/>
           <w:sz w:val="23"/>
         </w:rPr>
@@ -2974,6 +3474,7 @@
         <w:rPr>
           <w:rFonts w:ascii="Garamond" w:hAnsi="Garamond"/>
           <w:b w:val="0"/>
+          <w:i w:val="0"/>
           <w:color w:val="2D1F15"/>
           <w:sz w:val="23"/>
         </w:rPr>
@@ -2988,6 +3489,7 @@
         <w:rPr>
           <w:rFonts w:ascii="Garamond" w:hAnsi="Garamond"/>
           <w:b/>
+          <w:i w:val="0"/>
           <w:color w:val="5C3114"/>
           <w:sz w:val="23"/>
         </w:rPr>
@@ -2997,6 +3499,7 @@
         <w:rPr>
           <w:rFonts w:ascii="Garamond" w:hAnsi="Garamond"/>
           <w:b w:val="0"/>
+          <w:i w:val="0"/>
           <w:color w:val="2D1F15"/>
           <w:sz w:val="23"/>
         </w:rPr>
@@ -3011,6 +3514,7 @@
         <w:rPr>
           <w:rFonts w:ascii="Garamond" w:hAnsi="Garamond"/>
           <w:b/>
+          <w:i w:val="0"/>
           <w:color w:val="5C3114"/>
           <w:sz w:val="23"/>
         </w:rPr>
@@ -3020,6 +3524,7 @@
         <w:rPr>
           <w:rFonts w:ascii="Garamond" w:hAnsi="Garamond"/>
           <w:b w:val="0"/>
+          <w:i w:val="0"/>
           <w:color w:val="2D1F15"/>
           <w:sz w:val="23"/>
         </w:rPr>
@@ -3034,6 +3539,7 @@
         <w:rPr>
           <w:rFonts w:ascii="Garamond" w:hAnsi="Garamond"/>
           <w:b/>
+          <w:i w:val="0"/>
           <w:color w:val="5C3114"/>
           <w:sz w:val="23"/>
         </w:rPr>
@@ -3043,6 +3549,7 @@
         <w:rPr>
           <w:rFonts w:ascii="Garamond" w:hAnsi="Garamond"/>
           <w:b w:val="0"/>
+          <w:i w:val="0"/>
           <w:color w:val="2D1F15"/>
           <w:sz w:val="23"/>
         </w:rPr>
@@ -3057,6 +3564,7 @@
         <w:rPr>
           <w:rFonts w:ascii="Garamond" w:hAnsi="Garamond"/>
           <w:b/>
+          <w:i w:val="0"/>
           <w:color w:val="5C3114"/>
           <w:sz w:val="23"/>
         </w:rPr>
@@ -3066,27 +3574,31 @@
         <w:rPr>
           <w:rFonts w:ascii="Garamond" w:hAnsi="Garamond"/>
           <w:b w:val="0"/>
+          <w:i w:val="0"/>
           <w:color w:val="2D1F15"/>
           <w:sz w:val="23"/>
         </w:rPr>
-        <w:t>2d10 radiant, half on a successful save</w:t>
+        <w:t>2d10 radiant; half on success</w:t>
       </w:r>
     </w:p>
     <w:p>
       <w:pPr>
-        <w:spacing w:before="160" w:after="80"/>
+        <w:spacing w:before="160" w:after="100"/>
         <w:pBdr>
-          <w:bottom w:val="single" w:sz="8" w:space="6" w:color="7A4A22"/>
+          <w:top w:val="single" w:sz="10" w:space="6" w:color="8A2D1E"/>
+          <w:bottom w:val="single" w:sz="10" w:space="6" w:color="8A2D1E"/>
         </w:pBdr>
+        <w:shd w:fill="F8D9C8"/>
       </w:pPr>
       <w:r>
         <w:rPr>
           <w:rFonts w:ascii="Garamond" w:hAnsi="Garamond"/>
           <w:b/>
-          <w:color w:val="5C3114"/>
+          <w:i w:val="0"/>
+          <w:color w:val="781C12"/>
           <w:sz w:val="27"/>
         </w:rPr>
-        <w:t>Effect</w:t>
+        <w:t>Full Rules Text - Condensed Mechanics</w:t>
       </w:r>
     </w:p>
     <w:p>
@@ -3099,10 +3611,11 @@
         <w:rPr>
           <w:rFonts w:ascii="Garamond" w:hAnsi="Garamond"/>
           <w:b w:val="0"/>
+          <w:i w:val="0"/>
           <w:color w:val="2D1F15"/>
           <w:sz w:val="23"/>
         </w:rPr>
-        <w:t>A pale column of moonlight fills a 5-foot-radius, 40-foot-high cylinder centered on a point within range.</w:t>
+        <w:t>Choose a point within range.</w:t>
       </w:r>
     </w:p>
     <w:p>
@@ -3115,10 +3628,11 @@
         <w:rPr>
           <w:rFonts w:ascii="Garamond" w:hAnsi="Garamond"/>
           <w:b w:val="0"/>
+          <w:i w:val="0"/>
           <w:color w:val="2D1F15"/>
           <w:sz w:val="23"/>
         </w:rPr>
-        <w:t>The cylinder sheds dim light until the spell ends.</w:t>
+        <w:t>A 5-foot-radius, 40-foot-high cylinder of dim light appears there until the spell ends.</w:t>
       </w:r>
     </w:p>
     <w:p>
@@ -3131,10 +3645,11 @@
         <w:rPr>
           <w:rFonts w:ascii="Garamond" w:hAnsi="Garamond"/>
           <w:b w:val="0"/>
+          <w:i w:val="0"/>
           <w:color w:val="2D1F15"/>
           <w:sz w:val="23"/>
         </w:rPr>
-        <w:t>When a creature enters the area for the first time on a turn or starts its turn there, it makes a Constitution save.</w:t>
+        <w:t>When a creature enters the area for the first time on a turn or starts its turn there, it must make a Constitution saving throw.</w:t>
       </w:r>
     </w:p>
     <w:p>
@@ -3147,10 +3662,11 @@
         <w:rPr>
           <w:rFonts w:ascii="Garamond" w:hAnsi="Garamond"/>
           <w:b w:val="0"/>
+          <w:i w:val="0"/>
           <w:color w:val="2D1F15"/>
           <w:sz w:val="23"/>
         </w:rPr>
-        <w:t>On a failed save, the creature takes radiant damage; on a success, it takes half damage.</w:t>
+        <w:t>On a failed save, the creature takes 2d10 radiant damage.</w:t>
       </w:r>
     </w:p>
     <w:p>
@@ -3163,10 +3679,11 @@
         <w:rPr>
           <w:rFonts w:ascii="Garamond" w:hAnsi="Garamond"/>
           <w:b w:val="0"/>
+          <w:i w:val="0"/>
           <w:color w:val="2D1F15"/>
           <w:sz w:val="23"/>
         </w:rPr>
-        <w:t>Shapechangers make this save with disadvantage. On a failed save, a shapechanger also reverts to its true form and cannot change shape again until it leaves the light.</w:t>
+        <w:t>On a successful save, the creature takes half as much damage.</w:t>
       </w:r>
     </w:p>
     <w:p>
@@ -3179,24 +3696,62 @@
         <w:rPr>
           <w:rFonts w:ascii="Garamond" w:hAnsi="Garamond"/>
           <w:b w:val="0"/>
+          <w:i w:val="0"/>
           <w:color w:val="2D1F15"/>
           <w:sz w:val="23"/>
         </w:rPr>
-        <w:t>On later turns, Fetarak can use an action to move the beam up to 60 feet.</w:t>
+        <w:t>A shapechanger makes this saving throw with disadvantage.</w:t>
       </w:r>
     </w:p>
     <w:p>
       <w:pPr>
-        <w:spacing w:before="160" w:after="80"/>
+        <w:pStyle w:val="ListBullet"/>
+        <w:spacing w:after="40"/>
+        <w:ind w:left="360"/>
+      </w:pPr>
+      <w:r>
+        <w:rPr>
+          <w:rFonts w:ascii="Garamond" w:hAnsi="Garamond"/>
+          <w:b w:val="0"/>
+          <w:i w:val="0"/>
+          <w:color w:val="2D1F15"/>
+          <w:sz w:val="23"/>
+        </w:rPr>
+        <w:t>If a shapechanger fails the save, it reverts to its original form and cannot assume a different form until it leaves the spell's light.</w:t>
+      </w:r>
+    </w:p>
+    <w:p>
+      <w:pPr>
+        <w:pStyle w:val="ListBullet"/>
+        <w:spacing w:after="40"/>
+        <w:ind w:left="360"/>
+      </w:pPr>
+      <w:r>
+        <w:rPr>
+          <w:rFonts w:ascii="Garamond" w:hAnsi="Garamond"/>
+          <w:b w:val="0"/>
+          <w:i w:val="0"/>
+          <w:color w:val="2D1F15"/>
+          <w:sz w:val="23"/>
+        </w:rPr>
+        <w:t>On each turn after casting, the caster can use an action to move the beam up to 60 feet in any direction.</w:t>
+      </w:r>
+    </w:p>
+    <w:p>
+      <w:pPr>
+        <w:spacing w:before="160" w:after="100"/>
         <w:pBdr>
-          <w:bottom w:val="single" w:sz="8" w:space="6" w:color="7A4A22"/>
+          <w:top w:val="single" w:sz="10" w:space="6" w:color="8A2D1E"/>
+          <w:bottom w:val="single" w:sz="10" w:space="6" w:color="8A2D1E"/>
         </w:pBdr>
+        <w:shd w:fill="F8D9C8"/>
       </w:pPr>
       <w:r>
         <w:rPr>
           <w:rFonts w:ascii="Garamond" w:hAnsi="Garamond"/>
           <w:b/>
-          <w:color w:val="5C3114"/>
+          <w:i w:val="0"/>
+          <w:color w:val="781C12"/>
           <w:sz w:val="27"/>
         </w:rPr>
         <w:t>At Higher Levels</w:t>
@@ -3212,24 +3767,28 @@
         <w:rPr>
           <w:rFonts w:ascii="Garamond" w:hAnsi="Garamond"/>
           <w:b w:val="0"/>
+          <w:i w:val="0"/>
           <w:color w:val="2D1F15"/>
           <w:sz w:val="23"/>
         </w:rPr>
-        <w:t>When cast with a 3rd-level or higher slot, damage increases by 1d10 for each slot level above 2nd.</w:t>
+        <w:t>When cast with a spell slot of 3rd level or higher, the damage increases by 1d10 for each slot level above 2nd.</w:t>
       </w:r>
     </w:p>
     <w:p>
       <w:pPr>
-        <w:spacing w:before="260" w:after="80"/>
+        <w:spacing w:before="300" w:after="100"/>
         <w:pBdr>
-          <w:bottom w:val="single" w:sz="8" w:space="6" w:color="7A4A22"/>
+          <w:top w:val="single" w:sz="10" w:space="6" w:color="8A2D1E"/>
+          <w:bottom w:val="single" w:sz="10" w:space="6" w:color="8A2D1E"/>
         </w:pBdr>
+        <w:shd w:fill="F8D9C8"/>
       </w:pPr>
       <w:r>
         <w:rPr>
           <w:rFonts w:ascii="Garamond" w:hAnsi="Garamond"/>
           <w:b/>
-          <w:color w:val="5C3114"/>
+          <w:i w:val="0"/>
+          <w:color w:val="781C12"/>
           <w:sz w:val="32"/>
         </w:rPr>
         <w:t>Shatter</w:t>
@@ -3243,7 +3802,8 @@
         <w:rPr>
           <w:rFonts w:ascii="Garamond" w:hAnsi="Garamond"/>
           <w:b/>
-          <w:color w:val="5C3114"/>
+          <w:i w:val="0"/>
+          <w:color w:val="781C12"/>
           <w:sz w:val="23"/>
         </w:rPr>
         <w:t>2nd-level evocation</w:t>
@@ -3257,6 +3817,7 @@
         <w:rPr>
           <w:rFonts w:ascii="Garamond" w:hAnsi="Garamond"/>
           <w:b/>
+          <w:i w:val="0"/>
           <w:color w:val="5C3114"/>
           <w:sz w:val="23"/>
         </w:rPr>
@@ -3266,6 +3827,7 @@
         <w:rPr>
           <w:rFonts w:ascii="Garamond" w:hAnsi="Garamond"/>
           <w:b w:val="0"/>
+          <w:i w:val="0"/>
           <w:color w:val="2D1F15"/>
           <w:sz w:val="23"/>
         </w:rPr>
@@ -3280,6 +3842,7 @@
         <w:rPr>
           <w:rFonts w:ascii="Garamond" w:hAnsi="Garamond"/>
           <w:b/>
+          <w:i w:val="0"/>
           <w:color w:val="5C3114"/>
           <w:sz w:val="23"/>
         </w:rPr>
@@ -3289,6 +3852,7 @@
         <w:rPr>
           <w:rFonts w:ascii="Garamond" w:hAnsi="Garamond"/>
           <w:b w:val="0"/>
+          <w:i w:val="0"/>
           <w:color w:val="2D1F15"/>
           <w:sz w:val="23"/>
         </w:rPr>
@@ -3303,6 +3867,7 @@
         <w:rPr>
           <w:rFonts w:ascii="Garamond" w:hAnsi="Garamond"/>
           <w:b/>
+          <w:i w:val="0"/>
           <w:color w:val="5C3114"/>
           <w:sz w:val="23"/>
         </w:rPr>
@@ -3312,6 +3877,7 @@
         <w:rPr>
           <w:rFonts w:ascii="Garamond" w:hAnsi="Garamond"/>
           <w:b w:val="0"/>
+          <w:i w:val="0"/>
           <w:color w:val="2D1F15"/>
           <w:sz w:val="23"/>
         </w:rPr>
@@ -3326,6 +3892,7 @@
         <w:rPr>
           <w:rFonts w:ascii="Garamond" w:hAnsi="Garamond"/>
           <w:b/>
+          <w:i w:val="0"/>
           <w:color w:val="5C3114"/>
           <w:sz w:val="23"/>
         </w:rPr>
@@ -3335,6 +3902,7 @@
         <w:rPr>
           <w:rFonts w:ascii="Garamond" w:hAnsi="Garamond"/>
           <w:b w:val="0"/>
+          <w:i w:val="0"/>
           <w:color w:val="2D1F15"/>
           <w:sz w:val="23"/>
         </w:rPr>
@@ -3349,6 +3917,7 @@
         <w:rPr>
           <w:rFonts w:ascii="Garamond" w:hAnsi="Garamond"/>
           <w:b/>
+          <w:i w:val="0"/>
           <w:color w:val="5C3114"/>
           <w:sz w:val="23"/>
         </w:rPr>
@@ -3358,6 +3927,7 @@
         <w:rPr>
           <w:rFonts w:ascii="Garamond" w:hAnsi="Garamond"/>
           <w:b w:val="0"/>
+          <w:i w:val="0"/>
           <w:color w:val="2D1F15"/>
           <w:sz w:val="23"/>
         </w:rPr>
@@ -3372,6 +3942,7 @@
         <w:rPr>
           <w:rFonts w:ascii="Garamond" w:hAnsi="Garamond"/>
           <w:b/>
+          <w:i w:val="0"/>
           <w:color w:val="5C3114"/>
           <w:sz w:val="23"/>
         </w:rPr>
@@ -3381,27 +3952,31 @@
         <w:rPr>
           <w:rFonts w:ascii="Garamond" w:hAnsi="Garamond"/>
           <w:b w:val="0"/>
+          <w:i w:val="0"/>
           <w:color w:val="2D1F15"/>
           <w:sz w:val="23"/>
         </w:rPr>
-        <w:t>3d8 thunder, half on a successful save</w:t>
+        <w:t>3d8 thunder; half on success</w:t>
       </w:r>
     </w:p>
     <w:p>
       <w:pPr>
-        <w:spacing w:before="160" w:after="80"/>
+        <w:spacing w:before="160" w:after="100"/>
         <w:pBdr>
-          <w:bottom w:val="single" w:sz="8" w:space="6" w:color="7A4A22"/>
+          <w:top w:val="single" w:sz="10" w:space="6" w:color="8A2D1E"/>
+          <w:bottom w:val="single" w:sz="10" w:space="6" w:color="8A2D1E"/>
         </w:pBdr>
+        <w:shd w:fill="F8D9C8"/>
       </w:pPr>
       <w:r>
         <w:rPr>
           <w:rFonts w:ascii="Garamond" w:hAnsi="Garamond"/>
           <w:b/>
-          <w:color w:val="5C3114"/>
+          <w:i w:val="0"/>
+          <w:color w:val="781C12"/>
           <w:sz w:val="27"/>
         </w:rPr>
-        <w:t>Effect</w:t>
+        <w:t>Full Rules Text - Condensed Mechanics</w:t>
       </w:r>
     </w:p>
     <w:p>
@@ -3414,10 +3989,11 @@
         <w:rPr>
           <w:rFonts w:ascii="Garamond" w:hAnsi="Garamond"/>
           <w:b w:val="0"/>
+          <w:i w:val="0"/>
           <w:color w:val="2D1F15"/>
           <w:sz w:val="23"/>
         </w:rPr>
-        <w:t>A painfully loud ringing erupts from a point Fetarak chooses within range.</w:t>
+        <w:t>Choose a point within range.</w:t>
       </w:r>
     </w:p>
     <w:p>
@@ -3430,10 +4006,11 @@
         <w:rPr>
           <w:rFonts w:ascii="Garamond" w:hAnsi="Garamond"/>
           <w:b w:val="0"/>
+          <w:i w:val="0"/>
           <w:color w:val="2D1F15"/>
           <w:sz w:val="23"/>
         </w:rPr>
-        <w:t>Each creature in a 10-foot-radius sphere centered on that point must make a Constitution save.</w:t>
+        <w:t>Each creature in a 10-foot-radius sphere centered on that point must make a Constitution saving throw.</w:t>
       </w:r>
     </w:p>
     <w:p>
@@ -3446,10 +4023,11 @@
         <w:rPr>
           <w:rFonts w:ascii="Garamond" w:hAnsi="Garamond"/>
           <w:b w:val="0"/>
+          <w:i w:val="0"/>
           <w:color w:val="2D1F15"/>
           <w:sz w:val="23"/>
         </w:rPr>
-        <w:t>On a failed save, a creature takes thunder damage; on a success, it takes half damage.</w:t>
+        <w:t>On a failed save, a creature takes 3d8 thunder damage.</w:t>
       </w:r>
     </w:p>
     <w:p>
@@ -3462,10 +4040,11 @@
         <w:rPr>
           <w:rFonts w:ascii="Garamond" w:hAnsi="Garamond"/>
           <w:b w:val="0"/>
+          <w:i w:val="0"/>
           <w:color w:val="2D1F15"/>
           <w:sz w:val="23"/>
         </w:rPr>
-        <w:t>Creatures made from inorganic material such as stone, crystal, or metal have disadvantage on the saving throw.</w:t>
+        <w:t>On a successful save, a creature takes half as much damage.</w:t>
       </w:r>
     </w:p>
     <w:p>
@@ -3478,24 +4057,45 @@
         <w:rPr>
           <w:rFonts w:ascii="Garamond" w:hAnsi="Garamond"/>
           <w:b w:val="0"/>
+          <w:i w:val="0"/>
           <w:color w:val="2D1F15"/>
           <w:sz w:val="23"/>
         </w:rPr>
-        <w:t>Nonmagical objects in the area that are not being worn or carried also take the damage.</w:t>
+        <w:t>A creature made of inorganic material such as stone, crystal, or metal has disadvantage on the saving throw.</w:t>
       </w:r>
     </w:p>
     <w:p>
       <w:pPr>
-        <w:spacing w:before="160" w:after="80"/>
+        <w:pStyle w:val="ListBullet"/>
+        <w:spacing w:after="40"/>
+        <w:ind w:left="360"/>
+      </w:pPr>
+      <w:r>
+        <w:rPr>
+          <w:rFonts w:ascii="Garamond" w:hAnsi="Garamond"/>
+          <w:b w:val="0"/>
+          <w:i w:val="0"/>
+          <w:color w:val="2D1F15"/>
+          <w:sz w:val="23"/>
+        </w:rPr>
+        <w:t>A nonmagical object that is not being worn or carried also takes the damage if it is in the spell's area.</w:t>
+      </w:r>
+    </w:p>
+    <w:p>
+      <w:pPr>
+        <w:spacing w:before="160" w:after="100"/>
         <w:pBdr>
-          <w:bottom w:val="single" w:sz="8" w:space="6" w:color="7A4A22"/>
+          <w:top w:val="single" w:sz="10" w:space="6" w:color="8A2D1E"/>
+          <w:bottom w:val="single" w:sz="10" w:space="6" w:color="8A2D1E"/>
         </w:pBdr>
+        <w:shd w:fill="F8D9C8"/>
       </w:pPr>
       <w:r>
         <w:rPr>
           <w:rFonts w:ascii="Garamond" w:hAnsi="Garamond"/>
           <w:b/>
-          <w:color w:val="5C3114"/>
+          <w:i w:val="0"/>
+          <w:color w:val="781C12"/>
           <w:sz w:val="27"/>
         </w:rPr>
         <w:t>At Higher Levels</w:t>
@@ -3511,10 +4111,11 @@
         <w:rPr>
           <w:rFonts w:ascii="Garamond" w:hAnsi="Garamond"/>
           <w:b w:val="0"/>
+          <w:i w:val="0"/>
           <w:color w:val="2D1F15"/>
           <w:sz w:val="23"/>
         </w:rPr>
-        <w:t>When cast with a 3rd-level or higher slot, damage increases by 1d8 for each slot level above 2nd.</w:t>
+        <w:t>When cast with a spell slot of 3rd level or higher, the damage increases by 1d8 for each slot level above 2nd.</w:t>
       </w:r>
     </w:p>
     <w:sectPr>

</xml_diff>

<commit_message>
Format Fetarak spells like source entries
</commit_message>
<xml_diff>
--- a/Essentials/Fetarak.docx
+++ b/Essentials/Fetarak.docx
@@ -8,8 +8,7 @@
         <w:jc w:val="center"/>
         <w:shd w:fill="F3E5C0"/>
         <w:pBdr>
-          <w:top w:val="single" w:sz="8" w:space="6" w:color="9B6A2D"/>
-          <w:bottom w:val="single" w:sz="8" w:space="6" w:color="9B6A2D"/>
+          <w:bottom w:val="single" w:sz="10" w:space="6" w:color="9B6A2D"/>
         </w:pBdr>
       </w:pPr>
       <w:r>
@@ -25,9 +24,8 @@
     </w:p>
     <w:p>
       <w:pPr>
-        <w:spacing w:before="300" w:after="100"/>
+        <w:spacing w:before="280" w:after="100"/>
         <w:pBdr>
-          <w:top w:val="single" w:sz="8" w:space="6" w:color="7A4A22"/>
           <w:bottom w:val="single" w:sz="8" w:space="6" w:color="7A4A22"/>
         </w:pBdr>
       </w:pPr>
@@ -44,9 +42,7 @@
     </w:p>
     <w:p>
       <w:pPr>
-        <w:pStyle w:val="ListBullet"/>
-        <w:spacing w:after="40"/>
-        <w:ind w:left="360"/>
+        <w:spacing w:after="100"/>
       </w:pPr>
       <w:r>
         <w:rPr>
@@ -61,9 +57,7 @@
     </w:p>
     <w:p>
       <w:pPr>
-        <w:pStyle w:val="ListBullet"/>
-        <w:spacing w:after="40"/>
-        <w:ind w:left="360"/>
+        <w:spacing w:after="100"/>
       </w:pPr>
       <w:r>
         <w:rPr>
@@ -78,9 +72,8 @@
     </w:p>
     <w:p>
       <w:pPr>
-        <w:spacing w:before="300" w:after="100"/>
+        <w:spacing w:before="280" w:after="100"/>
         <w:pBdr>
-          <w:top w:val="single" w:sz="8" w:space="6" w:color="7A4A22"/>
           <w:bottom w:val="single" w:sz="8" w:space="6" w:color="7A4A22"/>
         </w:pBdr>
       </w:pPr>
@@ -227,9 +220,8 @@
     </w:p>
     <w:p>
       <w:pPr>
-        <w:spacing w:before="300" w:after="100"/>
+        <w:spacing w:before="280" w:after="100"/>
         <w:pBdr>
-          <w:top w:val="single" w:sz="8" w:space="6" w:color="7A4A22"/>
           <w:bottom w:val="single" w:sz="8" w:space="6" w:color="7A4A22"/>
         </w:pBdr>
       </w:pPr>
@@ -350,12 +342,11 @@
     </w:p>
     <w:p>
       <w:pPr>
-        <w:spacing w:before="300" w:after="100"/>
+        <w:spacing w:before="280" w:after="100"/>
+        <w:shd w:fill="F8D9C8"/>
         <w:pBdr>
-          <w:top w:val="single" w:sz="10" w:space="6" w:color="8A2D1E"/>
           <w:bottom w:val="single" w:sz="10" w:space="6" w:color="8A2D1E"/>
         </w:pBdr>
-        <w:shd w:fill="F8D9C8"/>
       </w:pPr>
       <w:r>
         <w:rPr>
@@ -370,9 +361,7 @@
     </w:p>
     <w:p>
       <w:pPr>
-        <w:pStyle w:val="ListBullet"/>
-        <w:spacing w:after="40"/>
-        <w:ind w:left="360"/>
+        <w:spacing w:after="100"/>
       </w:pPr>
       <w:r>
         <w:rPr>
@@ -441,9 +430,8 @@
     </w:p>
     <w:p>
       <w:pPr>
-        <w:spacing w:before="300" w:after="100"/>
+        <w:spacing w:before="280" w:after="100"/>
         <w:pBdr>
-          <w:top w:val="single" w:sz="8" w:space="6" w:color="7A4A22"/>
           <w:bottom w:val="single" w:sz="8" w:space="6" w:color="7A4A22"/>
         </w:pBdr>
       </w:pPr>
@@ -455,38 +443,71 @@
           <w:color w:val="5C3114"/>
           <w:sz w:val="32"/>
         </w:rPr>
-        <w:t>Cantrips - Full Mechanics</w:t>
+        <w:t>Cantrips</w:t>
       </w:r>
     </w:p>
     <w:p>
       <w:pPr>
-        <w:spacing w:before="300" w:after="100"/>
+        <w:spacing w:before="320" w:after="60"/>
         <w:pBdr>
-          <w:top w:val="single" w:sz="8" w:space="6" w:color="7A4A22"/>
-          <w:bottom w:val="single" w:sz="8" w:space="6" w:color="7A4A22"/>
+          <w:bottom w:val="single" w:sz="8" w:space="6" w:color="9B6A2D"/>
         </w:pBdr>
       </w:pPr>
+      <w:r>
+        <w:rPr>
+          <w:rFonts w:ascii="Garamond" w:hAnsi="Garamond"/>
+          <w:b/>
+          <w:i w:val="0"/>
+          <w:color w:val="4A260F"/>
+          <w:sz w:val="36"/>
+        </w:rPr>
+        <w:t>Fire Bolt</w:t>
+      </w:r>
+    </w:p>
+    <w:p>
+      <w:pPr>
+        <w:spacing w:after="100"/>
+      </w:pPr>
+      <w:r>
+        <w:rPr>
+          <w:rFonts w:ascii="Garamond" w:hAnsi="Garamond"/>
+          <w:b w:val="0"/>
+          <w:i w:val="0"/>
+          <w:color w:val="2D1F15"/>
+          <w:sz w:val="23"/>
+        </w:rPr>
+      </w:r>
       <w:r>
         <w:rPr>
           <w:rFonts w:ascii="Garamond" w:hAnsi="Garamond"/>
           <w:b/>
           <w:i w:val="0"/>
           <w:color w:val="5C3114"/>
-          <w:sz w:val="32"/>
+          <w:sz w:val="23"/>
         </w:rPr>
-        <w:t>Fire Bolt</w:t>
+        <w:t xml:space="preserve">Source: </w:t>
+      </w:r>
+      <w:r>
+        <w:rPr>
+          <w:rFonts w:ascii="Garamond" w:hAnsi="Garamond"/>
+          <w:b w:val="0"/>
+          <w:i w:val="0"/>
+          <w:color w:val="2D1F15"/>
+          <w:sz w:val="23"/>
+        </w:rPr>
+        <w:t>Player's Handbook</w:t>
       </w:r>
     </w:p>
     <w:p>
       <w:pPr>
-        <w:spacing w:after="80"/>
+        <w:spacing w:after="160"/>
       </w:pPr>
       <w:r>
         <w:rPr>
           <w:rFonts w:ascii="Garamond" w:hAnsi="Garamond"/>
-          <w:b/>
+          <w:b w:val="0"/>
           <w:i w:val="0"/>
-          <w:color w:val="5C3114"/>
+          <w:color w:val="2D1F15"/>
           <w:sz w:val="23"/>
         </w:rPr>
         <w:t>Evocation cantrip</w:t>
@@ -594,8 +615,46 @@
     </w:p>
     <w:p>
       <w:pPr>
-        <w:spacing w:after="0"/>
-      </w:pPr>
+        <w:spacing w:after="80"/>
+      </w:pPr>
+      <w:r>
+        <w:rPr>
+          <w:rFonts w:ascii="Garamond" w:hAnsi="Garamond"/>
+          <w:b w:val="0"/>
+          <w:i w:val="0"/>
+          <w:color w:val="2D1F15"/>
+          <w:sz w:val="23"/>
+        </w:rPr>
+      </w:r>
+    </w:p>
+    <w:p>
+      <w:pPr>
+        <w:spacing w:after="120"/>
+      </w:pPr>
+      <w:r>
+        <w:rPr>
+          <w:rFonts w:ascii="Garamond" w:hAnsi="Garamond"/>
+          <w:b w:val="0"/>
+          <w:i w:val="0"/>
+          <w:color w:val="2D1F15"/>
+          <w:sz w:val="23"/>
+        </w:rPr>
+        <w:t>A mote of flame is hurled at a creature or object within range. Make a ranged spell attack against the target. On a hit, the target takes 1d10 fire damage. A flammable object hit by the spell ignites if it is not being worn or carried.</w:t>
+      </w:r>
+    </w:p>
+    <w:p>
+      <w:pPr>
+        <w:spacing w:after="120"/>
+      </w:pPr>
+      <w:r>
+        <w:rPr>
+          <w:rFonts w:ascii="Garamond" w:hAnsi="Garamond"/>
+          <w:b w:val="0"/>
+          <w:i w:val="0"/>
+          <w:color w:val="2D1F15"/>
+          <w:sz w:val="23"/>
+        </w:rPr>
+      </w:r>
       <w:r>
         <w:rPr>
           <w:rFonts w:ascii="Garamond" w:hAnsi="Garamond"/>
@@ -604,7 +663,7 @@
           <w:color w:val="5C3114"/>
           <w:sz w:val="23"/>
         </w:rPr>
-        <w:t xml:space="preserve">Attack / Save: </w:t>
+        <w:t xml:space="preserve">At Higher Levels. </w:t>
       </w:r>
       <w:r>
         <w:rPr>
@@ -614,13 +673,22 @@
           <w:color w:val="2D1F15"/>
           <w:sz w:val="23"/>
         </w:rPr>
-        <w:t>Ranged spell attack</w:t>
+        <w:t>The spell damage increases by 1d10 at 5th level (2d10), 11th level (3d10), and 17th level (4d10).</w:t>
       </w:r>
     </w:p>
     <w:p>
       <w:pPr>
-        <w:spacing w:after="0"/>
-      </w:pPr>
+        <w:spacing w:after="80"/>
+      </w:pPr>
+      <w:r>
+        <w:rPr>
+          <w:rFonts w:ascii="Garamond" w:hAnsi="Garamond"/>
+          <w:b w:val="0"/>
+          <w:i w:val="0"/>
+          <w:color w:val="2D1F15"/>
+          <w:sz w:val="23"/>
+        </w:rPr>
+      </w:r>
       <w:r>
         <w:rPr>
           <w:rFonts w:ascii="Garamond" w:hAnsi="Garamond"/>
@@ -629,7 +697,7 @@
           <w:color w:val="5C3114"/>
           <w:sz w:val="23"/>
         </w:rPr>
-        <w:t xml:space="preserve">Damage: </w:t>
+        <w:t xml:space="preserve">Spell Lists. </w:t>
       </w:r>
       <w:r>
         <w:rPr>
@@ -639,15 +707,14 @@
           <w:color w:val="2D1F15"/>
           <w:sz w:val="23"/>
         </w:rPr>
-        <w:t>1d10 fire</w:t>
+        <w:t>Artificer, Sorcerer, Wizard</w:t>
       </w:r>
     </w:p>
     <w:p>
       <w:pPr>
-        <w:spacing w:before="160" w:after="100"/>
+        <w:spacing w:before="320" w:after="60"/>
         <w:pBdr>
-          <w:top w:val="single" w:sz="8" w:space="6" w:color="7A4A22"/>
-          <w:bottom w:val="single" w:sz="8" w:space="6" w:color="7A4A22"/>
+          <w:bottom w:val="single" w:sz="8" w:space="6" w:color="9B6A2D"/>
         </w:pBdr>
       </w:pPr>
       <w:r>
@@ -655,17 +722,15 @@
           <w:rFonts w:ascii="Garamond" w:hAnsi="Garamond"/>
           <w:b/>
           <w:i w:val="0"/>
-          <w:color w:val="5C3114"/>
-          <w:sz w:val="27"/>
+          <w:color w:val="4A260F"/>
+          <w:sz w:val="36"/>
         </w:rPr>
-        <w:t>Full Rules Text - Condensed Mechanics</w:t>
+        <w:t>Eldritch Blast</w:t>
       </w:r>
     </w:p>
     <w:p>
       <w:pPr>
-        <w:pStyle w:val="ListBullet"/>
-        <w:spacing w:after="40"/>
-        <w:ind w:left="360"/>
+        <w:spacing w:after="100"/>
       </w:pPr>
       <w:r>
         <w:rPr>
@@ -675,15 +740,17 @@
           <w:color w:val="2D1F15"/>
           <w:sz w:val="23"/>
         </w:rPr>
-        <w:t>Choose a creature or object within range.</w:t>
       </w:r>
-    </w:p>
-    <w:p>
-      <w:pPr>
-        <w:pStyle w:val="ListBullet"/>
-        <w:spacing w:after="40"/>
-        <w:ind w:left="360"/>
-      </w:pPr>
+      <w:r>
+        <w:rPr>
+          <w:rFonts w:ascii="Garamond" w:hAnsi="Garamond"/>
+          <w:b/>
+          <w:i w:val="0"/>
+          <w:color w:val="5C3114"/>
+          <w:sz w:val="23"/>
+        </w:rPr>
+        <w:t xml:space="preserve">Source: </w:t>
+      </w:r>
       <w:r>
         <w:rPr>
           <w:rFonts w:ascii="Garamond" w:hAnsi="Garamond"/>
@@ -692,14 +759,12 @@
           <w:color w:val="2D1F15"/>
           <w:sz w:val="23"/>
         </w:rPr>
-        <w:t>Make a ranged spell attack against the target.</w:t>
+        <w:t>Player's Handbook</w:t>
       </w:r>
     </w:p>
     <w:p>
       <w:pPr>
-        <w:pStyle w:val="ListBullet"/>
-        <w:spacing w:after="40"/>
-        <w:ind w:left="360"/>
+        <w:spacing w:after="160"/>
       </w:pPr>
       <w:r>
         <w:rPr>
@@ -707,93 +772,6 @@
           <w:b w:val="0"/>
           <w:i w:val="0"/>
           <w:color w:val="2D1F15"/>
-          <w:sz w:val="23"/>
-        </w:rPr>
-        <w:t>On a hit, the target takes 1d10 fire damage.</w:t>
-      </w:r>
-    </w:p>
-    <w:p>
-      <w:pPr>
-        <w:pStyle w:val="ListBullet"/>
-        <w:spacing w:after="40"/>
-        <w:ind w:left="360"/>
-      </w:pPr>
-      <w:r>
-        <w:rPr>
-          <w:rFonts w:ascii="Garamond" w:hAnsi="Garamond"/>
-          <w:b w:val="0"/>
-          <w:i w:val="0"/>
-          <w:color w:val="2D1F15"/>
-          <w:sz w:val="23"/>
-        </w:rPr>
-        <w:t>A flammable object hit by the spell ignites if it is not being worn or carried.</w:t>
-      </w:r>
-    </w:p>
-    <w:p>
-      <w:pPr>
-        <w:spacing w:before="160" w:after="100"/>
-        <w:pBdr>
-          <w:top w:val="single" w:sz="8" w:space="6" w:color="7A4A22"/>
-          <w:bottom w:val="single" w:sz="8" w:space="6" w:color="7A4A22"/>
-        </w:pBdr>
-      </w:pPr>
-      <w:r>
-        <w:rPr>
-          <w:rFonts w:ascii="Garamond" w:hAnsi="Garamond"/>
-          <w:b/>
-          <w:i w:val="0"/>
-          <w:color w:val="5C3114"/>
-          <w:sz w:val="27"/>
-        </w:rPr>
-        <w:t>At Higher Levels</w:t>
-      </w:r>
-    </w:p>
-    <w:p>
-      <w:pPr>
-        <w:pStyle w:val="ListBullet"/>
-        <w:spacing w:after="40"/>
-        <w:ind w:left="360"/>
-      </w:pPr>
-      <w:r>
-        <w:rPr>
-          <w:rFonts w:ascii="Garamond" w:hAnsi="Garamond"/>
-          <w:b w:val="0"/>
-          <w:i w:val="0"/>
-          <w:color w:val="2D1F15"/>
-          <w:sz w:val="23"/>
-        </w:rPr>
-        <w:t>The damage increases by 1d10 at 5th level, 11th level, and 17th level.</w:t>
-      </w:r>
-    </w:p>
-    <w:p>
-      <w:pPr>
-        <w:spacing w:before="300" w:after="100"/>
-        <w:pBdr>
-          <w:top w:val="single" w:sz="8" w:space="6" w:color="7A4A22"/>
-          <w:bottom w:val="single" w:sz="8" w:space="6" w:color="7A4A22"/>
-        </w:pBdr>
-      </w:pPr>
-      <w:r>
-        <w:rPr>
-          <w:rFonts w:ascii="Garamond" w:hAnsi="Garamond"/>
-          <w:b/>
-          <w:i w:val="0"/>
-          <w:color w:val="5C3114"/>
-          <w:sz w:val="32"/>
-        </w:rPr>
-        <w:t>Eldritch Blast</w:t>
-      </w:r>
-    </w:p>
-    <w:p>
-      <w:pPr>
-        <w:spacing w:after="80"/>
-      </w:pPr>
-      <w:r>
-        <w:rPr>
-          <w:rFonts w:ascii="Garamond" w:hAnsi="Garamond"/>
-          <w:b/>
-          <w:i w:val="0"/>
-          <w:color w:val="5C3114"/>
           <w:sz w:val="23"/>
         </w:rPr>
         <w:t>Evocation cantrip</w:t>
@@ -901,8 +879,46 @@
     </w:p>
     <w:p>
       <w:pPr>
-        <w:spacing w:after="0"/>
-      </w:pPr>
+        <w:spacing w:after="80"/>
+      </w:pPr>
+      <w:r>
+        <w:rPr>
+          <w:rFonts w:ascii="Garamond" w:hAnsi="Garamond"/>
+          <w:b w:val="0"/>
+          <w:i w:val="0"/>
+          <w:color w:val="2D1F15"/>
+          <w:sz w:val="23"/>
+        </w:rPr>
+      </w:r>
+    </w:p>
+    <w:p>
+      <w:pPr>
+        <w:spacing w:after="120"/>
+      </w:pPr>
+      <w:r>
+        <w:rPr>
+          <w:rFonts w:ascii="Garamond" w:hAnsi="Garamond"/>
+          <w:b w:val="0"/>
+          <w:i w:val="0"/>
+          <w:color w:val="2D1F15"/>
+          <w:sz w:val="23"/>
+        </w:rPr>
+        <w:t>A beam of crackling energy streaks toward a creature within range. Make a ranged spell attack against the target. On a hit, the target takes 1d10 force damage.</w:t>
+      </w:r>
+    </w:p>
+    <w:p>
+      <w:pPr>
+        <w:spacing w:after="120"/>
+      </w:pPr>
+      <w:r>
+        <w:rPr>
+          <w:rFonts w:ascii="Garamond" w:hAnsi="Garamond"/>
+          <w:b w:val="0"/>
+          <w:i w:val="0"/>
+          <w:color w:val="2D1F15"/>
+          <w:sz w:val="23"/>
+        </w:rPr>
+      </w:r>
       <w:r>
         <w:rPr>
           <w:rFonts w:ascii="Garamond" w:hAnsi="Garamond"/>
@@ -911,7 +927,7 @@
           <w:color w:val="5C3114"/>
           <w:sz w:val="23"/>
         </w:rPr>
-        <w:t xml:space="preserve">Attack / Save: </w:t>
+        <w:t xml:space="preserve">At Higher Levels. </w:t>
       </w:r>
       <w:r>
         <w:rPr>
@@ -921,13 +937,22 @@
           <w:color w:val="2D1F15"/>
           <w:sz w:val="23"/>
         </w:rPr>
-        <w:t>Ranged spell attack</w:t>
+        <w:t>At higher levels, the spell creates more than one beam: two beams at 5th level, three beams at 11th level, and four beams at 17th level. Each beam uses a separate attack roll, and the beams can be aimed at the same target or different targets.</w:t>
       </w:r>
     </w:p>
     <w:p>
       <w:pPr>
-        <w:spacing w:after="0"/>
-      </w:pPr>
+        <w:spacing w:after="80"/>
+      </w:pPr>
+      <w:r>
+        <w:rPr>
+          <w:rFonts w:ascii="Garamond" w:hAnsi="Garamond"/>
+          <w:b w:val="0"/>
+          <w:i w:val="0"/>
+          <w:color w:val="2D1F15"/>
+          <w:sz w:val="23"/>
+        </w:rPr>
+      </w:r>
       <w:r>
         <w:rPr>
           <w:rFonts w:ascii="Garamond" w:hAnsi="Garamond"/>
@@ -936,7 +961,7 @@
           <w:color w:val="5C3114"/>
           <w:sz w:val="23"/>
         </w:rPr>
-        <w:t xml:space="preserve">Damage: </w:t>
+        <w:t xml:space="preserve">Spell Lists. </w:t>
       </w:r>
       <w:r>
         <w:rPr>
@@ -946,15 +971,14 @@
           <w:color w:val="2D1F15"/>
           <w:sz w:val="23"/>
         </w:rPr>
-        <w:t>1d10 force</w:t>
+        <w:t>Warlock</w:t>
       </w:r>
     </w:p>
     <w:p>
       <w:pPr>
-        <w:spacing w:before="160" w:after="100"/>
+        <w:spacing w:before="320" w:after="60"/>
         <w:pBdr>
-          <w:top w:val="single" w:sz="8" w:space="6" w:color="7A4A22"/>
-          <w:bottom w:val="single" w:sz="8" w:space="6" w:color="7A4A22"/>
+          <w:bottom w:val="single" w:sz="8" w:space="6" w:color="9B6A2D"/>
         </w:pBdr>
       </w:pPr>
       <w:r>
@@ -962,17 +986,15 @@
           <w:rFonts w:ascii="Garamond" w:hAnsi="Garamond"/>
           <w:b/>
           <w:i w:val="0"/>
-          <w:color w:val="5C3114"/>
-          <w:sz w:val="27"/>
+          <w:color w:val="4A260F"/>
+          <w:sz w:val="36"/>
         </w:rPr>
-        <w:t>Full Rules Text - Condensed Mechanics</w:t>
+        <w:t>Acid Splash</w:t>
       </w:r>
     </w:p>
     <w:p>
       <w:pPr>
-        <w:pStyle w:val="ListBullet"/>
-        <w:spacing w:after="40"/>
-        <w:ind w:left="360"/>
+        <w:spacing w:after="100"/>
       </w:pPr>
       <w:r>
         <w:rPr>
@@ -982,15 +1004,17 @@
           <w:color w:val="2D1F15"/>
           <w:sz w:val="23"/>
         </w:rPr>
-        <w:t>Choose a creature within range.</w:t>
       </w:r>
-    </w:p>
-    <w:p>
-      <w:pPr>
-        <w:pStyle w:val="ListBullet"/>
-        <w:spacing w:after="40"/>
-        <w:ind w:left="360"/>
-      </w:pPr>
+      <w:r>
+        <w:rPr>
+          <w:rFonts w:ascii="Garamond" w:hAnsi="Garamond"/>
+          <w:b/>
+          <w:i w:val="0"/>
+          <w:color w:val="5C3114"/>
+          <w:sz w:val="23"/>
+        </w:rPr>
+        <w:t xml:space="preserve">Source: </w:t>
+      </w:r>
       <w:r>
         <w:rPr>
           <w:rFonts w:ascii="Garamond" w:hAnsi="Garamond"/>
@@ -999,14 +1023,12 @@
           <w:color w:val="2D1F15"/>
           <w:sz w:val="23"/>
         </w:rPr>
-        <w:t>Make a ranged spell attack against the target.</w:t>
+        <w:t>Player's Handbook</w:t>
       </w:r>
     </w:p>
     <w:p>
       <w:pPr>
-        <w:pStyle w:val="ListBullet"/>
-        <w:spacing w:after="40"/>
-        <w:ind w:left="360"/>
+        <w:spacing w:after="160"/>
       </w:pPr>
       <w:r>
         <w:rPr>
@@ -1014,110 +1036,6 @@
           <w:b w:val="0"/>
           <w:i w:val="0"/>
           <w:color w:val="2D1F15"/>
-          <w:sz w:val="23"/>
-        </w:rPr>
-        <w:t>On a hit, the target takes 1d10 force damage.</w:t>
-      </w:r>
-    </w:p>
-    <w:p>
-      <w:pPr>
-        <w:spacing w:before="160" w:after="100"/>
-        <w:pBdr>
-          <w:top w:val="single" w:sz="8" w:space="6" w:color="7A4A22"/>
-          <w:bottom w:val="single" w:sz="8" w:space="6" w:color="7A4A22"/>
-        </w:pBdr>
-      </w:pPr>
-      <w:r>
-        <w:rPr>
-          <w:rFonts w:ascii="Garamond" w:hAnsi="Garamond"/>
-          <w:b/>
-          <w:i w:val="0"/>
-          <w:color w:val="5C3114"/>
-          <w:sz w:val="27"/>
-        </w:rPr>
-        <w:t>At Higher Levels</w:t>
-      </w:r>
-    </w:p>
-    <w:p>
-      <w:pPr>
-        <w:pStyle w:val="ListBullet"/>
-        <w:spacing w:after="40"/>
-        <w:ind w:left="360"/>
-      </w:pPr>
-      <w:r>
-        <w:rPr>
-          <w:rFonts w:ascii="Garamond" w:hAnsi="Garamond"/>
-          <w:b w:val="0"/>
-          <w:i w:val="0"/>
-          <w:color w:val="2D1F15"/>
-          <w:sz w:val="23"/>
-        </w:rPr>
-        <w:t>At 5th level the spell creates two beams; at 11th level, three beams; at 17th level, four beams.</w:t>
-      </w:r>
-    </w:p>
-    <w:p>
-      <w:pPr>
-        <w:pStyle w:val="ListBullet"/>
-        <w:spacing w:after="40"/>
-        <w:ind w:left="360"/>
-      </w:pPr>
-      <w:r>
-        <w:rPr>
-          <w:rFonts w:ascii="Garamond" w:hAnsi="Garamond"/>
-          <w:b w:val="0"/>
-          <w:i w:val="0"/>
-          <w:color w:val="2D1F15"/>
-          <w:sz w:val="23"/>
-        </w:rPr>
-        <w:t>Each beam requires a separate attack roll.</w:t>
-      </w:r>
-    </w:p>
-    <w:p>
-      <w:pPr>
-        <w:pStyle w:val="ListBullet"/>
-        <w:spacing w:after="40"/>
-        <w:ind w:left="360"/>
-      </w:pPr>
-      <w:r>
-        <w:rPr>
-          <w:rFonts w:ascii="Garamond" w:hAnsi="Garamond"/>
-          <w:b w:val="0"/>
-          <w:i w:val="0"/>
-          <w:color w:val="2D1F15"/>
-          <w:sz w:val="23"/>
-        </w:rPr>
-        <w:t>The beams can be aimed at the same target or at different targets.</w:t>
-      </w:r>
-    </w:p>
-    <w:p>
-      <w:pPr>
-        <w:spacing w:before="300" w:after="100"/>
-        <w:pBdr>
-          <w:top w:val="single" w:sz="8" w:space="6" w:color="7A4A22"/>
-          <w:bottom w:val="single" w:sz="8" w:space="6" w:color="7A4A22"/>
-        </w:pBdr>
-      </w:pPr>
-      <w:r>
-        <w:rPr>
-          <w:rFonts w:ascii="Garamond" w:hAnsi="Garamond"/>
-          <w:b/>
-          <w:i w:val="0"/>
-          <w:color w:val="5C3114"/>
-          <w:sz w:val="32"/>
-        </w:rPr>
-        <w:t>Acid Splash</w:t>
-      </w:r>
-    </w:p>
-    <w:p>
-      <w:pPr>
-        <w:spacing w:after="80"/>
-      </w:pPr>
-      <w:r>
-        <w:rPr>
-          <w:rFonts w:ascii="Garamond" w:hAnsi="Garamond"/>
-          <w:b/>
-          <w:i w:val="0"/>
-          <w:color w:val="5C3114"/>
           <w:sz w:val="23"/>
         </w:rPr>
         <w:t>Conjuration cantrip</w:t>
@@ -1225,8 +1143,46 @@
     </w:p>
     <w:p>
       <w:pPr>
-        <w:spacing w:after="0"/>
-      </w:pPr>
+        <w:spacing w:after="80"/>
+      </w:pPr>
+      <w:r>
+        <w:rPr>
+          <w:rFonts w:ascii="Garamond" w:hAnsi="Garamond"/>
+          <w:b w:val="0"/>
+          <w:i w:val="0"/>
+          <w:color w:val="2D1F15"/>
+          <w:sz w:val="23"/>
+        </w:rPr>
+      </w:r>
+    </w:p>
+    <w:p>
+      <w:pPr>
+        <w:spacing w:after="120"/>
+      </w:pPr>
+      <w:r>
+        <w:rPr>
+          <w:rFonts w:ascii="Garamond" w:hAnsi="Garamond"/>
+          <w:b w:val="0"/>
+          <w:i w:val="0"/>
+          <w:color w:val="2D1F15"/>
+          <w:sz w:val="23"/>
+        </w:rPr>
+        <w:t>A bubble of acid is hurled at one creature within range that can be seen, or at two visible creatures within range that are within 5 feet of each other. A target must succeed on a Dexterity saving throw or take 1d6 acid damage.</w:t>
+      </w:r>
+    </w:p>
+    <w:p>
+      <w:pPr>
+        <w:spacing w:after="120"/>
+      </w:pPr>
+      <w:r>
+        <w:rPr>
+          <w:rFonts w:ascii="Garamond" w:hAnsi="Garamond"/>
+          <w:b w:val="0"/>
+          <w:i w:val="0"/>
+          <w:color w:val="2D1F15"/>
+          <w:sz w:val="23"/>
+        </w:rPr>
+      </w:r>
       <w:r>
         <w:rPr>
           <w:rFonts w:ascii="Garamond" w:hAnsi="Garamond"/>
@@ -1235,7 +1191,7 @@
           <w:color w:val="5C3114"/>
           <w:sz w:val="23"/>
         </w:rPr>
-        <w:t xml:space="preserve">Attack / Save: </w:t>
+        <w:t xml:space="preserve">At Higher Levels. </w:t>
       </w:r>
       <w:r>
         <w:rPr>
@@ -1245,13 +1201,22 @@
           <w:color w:val="2D1F15"/>
           <w:sz w:val="23"/>
         </w:rPr>
-        <w:t>Dexterity saving throw</w:t>
+        <w:t>The spell damage increases by 1d6 at 5th level (2d6), 11th level (3d6), and 17th level (4d6).</w:t>
       </w:r>
     </w:p>
     <w:p>
       <w:pPr>
-        <w:spacing w:after="0"/>
-      </w:pPr>
+        <w:spacing w:after="80"/>
+      </w:pPr>
+      <w:r>
+        <w:rPr>
+          <w:rFonts w:ascii="Garamond" w:hAnsi="Garamond"/>
+          <w:b w:val="0"/>
+          <w:i w:val="0"/>
+          <w:color w:val="2D1F15"/>
+          <w:sz w:val="23"/>
+        </w:rPr>
+      </w:r>
       <w:r>
         <w:rPr>
           <w:rFonts w:ascii="Garamond" w:hAnsi="Garamond"/>
@@ -1260,7 +1225,7 @@
           <w:color w:val="5C3114"/>
           <w:sz w:val="23"/>
         </w:rPr>
-        <w:t xml:space="preserve">Damage: </w:t>
+        <w:t xml:space="preserve">Spell Lists. </w:t>
       </w:r>
       <w:r>
         <w:rPr>
@@ -1270,15 +1235,14 @@
           <w:color w:val="2D1F15"/>
           <w:sz w:val="23"/>
         </w:rPr>
-        <w:t>1d6 acid</w:t>
+        <w:t>Artificer, Sorcerer, Wizard</w:t>
       </w:r>
     </w:p>
     <w:p>
       <w:pPr>
-        <w:spacing w:before="160" w:after="100"/>
+        <w:spacing w:before="320" w:after="60"/>
         <w:pBdr>
-          <w:top w:val="single" w:sz="8" w:space="6" w:color="7A4A22"/>
-          <w:bottom w:val="single" w:sz="8" w:space="6" w:color="7A4A22"/>
+          <w:bottom w:val="single" w:sz="8" w:space="6" w:color="9B6A2D"/>
         </w:pBdr>
       </w:pPr>
       <w:r>
@@ -1286,17 +1250,15 @@
           <w:rFonts w:ascii="Garamond" w:hAnsi="Garamond"/>
           <w:b/>
           <w:i w:val="0"/>
-          <w:color w:val="5C3114"/>
-          <w:sz w:val="27"/>
+          <w:color w:val="4A260F"/>
+          <w:sz w:val="36"/>
         </w:rPr>
-        <w:t>Full Rules Text - Condensed Mechanics</w:t>
+        <w:t>Ray of Frost</w:t>
       </w:r>
     </w:p>
     <w:p>
       <w:pPr>
-        <w:pStyle w:val="ListBullet"/>
-        <w:spacing w:after="40"/>
-        <w:ind w:left="360"/>
+        <w:spacing w:after="100"/>
       </w:pPr>
       <w:r>
         <w:rPr>
@@ -1306,15 +1268,17 @@
           <w:color w:val="2D1F15"/>
           <w:sz w:val="23"/>
         </w:rPr>
-        <w:t>Choose one visible creature within range.</w:t>
       </w:r>
-    </w:p>
-    <w:p>
-      <w:pPr>
-        <w:pStyle w:val="ListBullet"/>
-        <w:spacing w:after="40"/>
-        <w:ind w:left="360"/>
-      </w:pPr>
+      <w:r>
+        <w:rPr>
+          <w:rFonts w:ascii="Garamond" w:hAnsi="Garamond"/>
+          <w:b/>
+          <w:i w:val="0"/>
+          <w:color w:val="5C3114"/>
+          <w:sz w:val="23"/>
+        </w:rPr>
+        <w:t xml:space="preserve">Source: </w:t>
+      </w:r>
       <w:r>
         <w:rPr>
           <w:rFonts w:ascii="Garamond" w:hAnsi="Garamond"/>
@@ -1323,14 +1287,12 @@
           <w:color w:val="2D1F15"/>
           <w:sz w:val="23"/>
         </w:rPr>
-        <w:t>Alternatively, choose two visible creatures within range if they are within 5 feet of each other.</w:t>
+        <w:t>Player's Handbook</w:t>
       </w:r>
     </w:p>
     <w:p>
       <w:pPr>
-        <w:pStyle w:val="ListBullet"/>
-        <w:spacing w:after="40"/>
-        <w:ind w:left="360"/>
+        <w:spacing w:after="160"/>
       </w:pPr>
       <w:r>
         <w:rPr>
@@ -1338,93 +1300,6 @@
           <w:b w:val="0"/>
           <w:i w:val="0"/>
           <w:color w:val="2D1F15"/>
-          <w:sz w:val="23"/>
-        </w:rPr>
-        <w:t>Each target must make a Dexterity saving throw.</w:t>
-      </w:r>
-    </w:p>
-    <w:p>
-      <w:pPr>
-        <w:pStyle w:val="ListBullet"/>
-        <w:spacing w:after="40"/>
-        <w:ind w:left="360"/>
-      </w:pPr>
-      <w:r>
-        <w:rPr>
-          <w:rFonts w:ascii="Garamond" w:hAnsi="Garamond"/>
-          <w:b w:val="0"/>
-          <w:i w:val="0"/>
-          <w:color w:val="2D1F15"/>
-          <w:sz w:val="23"/>
-        </w:rPr>
-        <w:t>A target that fails the save takes 1d6 acid damage.</w:t>
-      </w:r>
-    </w:p>
-    <w:p>
-      <w:pPr>
-        <w:spacing w:before="160" w:after="100"/>
-        <w:pBdr>
-          <w:top w:val="single" w:sz="8" w:space="6" w:color="7A4A22"/>
-          <w:bottom w:val="single" w:sz="8" w:space="6" w:color="7A4A22"/>
-        </w:pBdr>
-      </w:pPr>
-      <w:r>
-        <w:rPr>
-          <w:rFonts w:ascii="Garamond" w:hAnsi="Garamond"/>
-          <w:b/>
-          <w:i w:val="0"/>
-          <w:color w:val="5C3114"/>
-          <w:sz w:val="27"/>
-        </w:rPr>
-        <w:t>At Higher Levels</w:t>
-      </w:r>
-    </w:p>
-    <w:p>
-      <w:pPr>
-        <w:pStyle w:val="ListBullet"/>
-        <w:spacing w:after="40"/>
-        <w:ind w:left="360"/>
-      </w:pPr>
-      <w:r>
-        <w:rPr>
-          <w:rFonts w:ascii="Garamond" w:hAnsi="Garamond"/>
-          <w:b w:val="0"/>
-          <w:i w:val="0"/>
-          <w:color w:val="2D1F15"/>
-          <w:sz w:val="23"/>
-        </w:rPr>
-        <w:t>The damage increases by 1d6 at 5th level, 11th level, and 17th level.</w:t>
-      </w:r>
-    </w:p>
-    <w:p>
-      <w:pPr>
-        <w:spacing w:before="300" w:after="100"/>
-        <w:pBdr>
-          <w:top w:val="single" w:sz="8" w:space="6" w:color="7A4A22"/>
-          <w:bottom w:val="single" w:sz="8" w:space="6" w:color="7A4A22"/>
-        </w:pBdr>
-      </w:pPr>
-      <w:r>
-        <w:rPr>
-          <w:rFonts w:ascii="Garamond" w:hAnsi="Garamond"/>
-          <w:b/>
-          <w:i w:val="0"/>
-          <w:color w:val="5C3114"/>
-          <w:sz w:val="32"/>
-        </w:rPr>
-        <w:t>Ray of Frost</w:t>
-      </w:r>
-    </w:p>
-    <w:p>
-      <w:pPr>
-        <w:spacing w:after="80"/>
-      </w:pPr>
-      <w:r>
-        <w:rPr>
-          <w:rFonts w:ascii="Garamond" w:hAnsi="Garamond"/>
-          <w:b/>
-          <w:i w:val="0"/>
-          <w:color w:val="5C3114"/>
           <w:sz w:val="23"/>
         </w:rPr>
         <w:t>Evocation cantrip</w:t>
@@ -1532,8 +1407,46 @@
     </w:p>
     <w:p>
       <w:pPr>
-        <w:spacing w:after="0"/>
-      </w:pPr>
+        <w:spacing w:after="80"/>
+      </w:pPr>
+      <w:r>
+        <w:rPr>
+          <w:rFonts w:ascii="Garamond" w:hAnsi="Garamond"/>
+          <w:b w:val="0"/>
+          <w:i w:val="0"/>
+          <w:color w:val="2D1F15"/>
+          <w:sz w:val="23"/>
+        </w:rPr>
+      </w:r>
+    </w:p>
+    <w:p>
+      <w:pPr>
+        <w:spacing w:after="120"/>
+      </w:pPr>
+      <w:r>
+        <w:rPr>
+          <w:rFonts w:ascii="Garamond" w:hAnsi="Garamond"/>
+          <w:b w:val="0"/>
+          <w:i w:val="0"/>
+          <w:color w:val="2D1F15"/>
+          <w:sz w:val="23"/>
+        </w:rPr>
+        <w:t>A frigid beam of blue-white light streaks toward a creature within range. Make a ranged spell attack against the target. On a hit, the target takes 1d8 cold damage, and its speed is reduced by 10 feet until the start of the caster's next turn.</w:t>
+      </w:r>
+    </w:p>
+    <w:p>
+      <w:pPr>
+        <w:spacing w:after="120"/>
+      </w:pPr>
+      <w:r>
+        <w:rPr>
+          <w:rFonts w:ascii="Garamond" w:hAnsi="Garamond"/>
+          <w:b w:val="0"/>
+          <w:i w:val="0"/>
+          <w:color w:val="2D1F15"/>
+          <w:sz w:val="23"/>
+        </w:rPr>
+      </w:r>
       <w:r>
         <w:rPr>
           <w:rFonts w:ascii="Garamond" w:hAnsi="Garamond"/>
@@ -1542,7 +1455,7 @@
           <w:color w:val="5C3114"/>
           <w:sz w:val="23"/>
         </w:rPr>
-        <w:t xml:space="preserve">Attack / Save: </w:t>
+        <w:t xml:space="preserve">At Higher Levels. </w:t>
       </w:r>
       <w:r>
         <w:rPr>
@@ -1552,13 +1465,22 @@
           <w:color w:val="2D1F15"/>
           <w:sz w:val="23"/>
         </w:rPr>
-        <w:t>Ranged spell attack</w:t>
+        <w:t>The spell damage increases by 1d8 at 5th level (2d8), 11th level (3d8), and 17th level (4d8).</w:t>
       </w:r>
     </w:p>
     <w:p>
       <w:pPr>
-        <w:spacing w:after="0"/>
-      </w:pPr>
+        <w:spacing w:after="80"/>
+      </w:pPr>
+      <w:r>
+        <w:rPr>
+          <w:rFonts w:ascii="Garamond" w:hAnsi="Garamond"/>
+          <w:b w:val="0"/>
+          <w:i w:val="0"/>
+          <w:color w:val="2D1F15"/>
+          <w:sz w:val="23"/>
+        </w:rPr>
+      </w:r>
       <w:r>
         <w:rPr>
           <w:rFonts w:ascii="Garamond" w:hAnsi="Garamond"/>
@@ -1567,7 +1489,7 @@
           <w:color w:val="5C3114"/>
           <w:sz w:val="23"/>
         </w:rPr>
-        <w:t xml:space="preserve">Damage: </w:t>
+        <w:t xml:space="preserve">Spell Lists. </w:t>
       </w:r>
       <w:r>
         <w:rPr>
@@ -1577,15 +1499,14 @@
           <w:color w:val="2D1F15"/>
           <w:sz w:val="23"/>
         </w:rPr>
-        <w:t>1d8 cold</w:t>
+        <w:t>Artificer, Sorcerer, Wizard</w:t>
       </w:r>
     </w:p>
     <w:p>
       <w:pPr>
-        <w:spacing w:before="160" w:after="100"/>
+        <w:spacing w:before="320" w:after="60"/>
         <w:pBdr>
-          <w:top w:val="single" w:sz="8" w:space="6" w:color="7A4A22"/>
-          <w:bottom w:val="single" w:sz="8" w:space="6" w:color="7A4A22"/>
+          <w:bottom w:val="single" w:sz="8" w:space="6" w:color="9B6A2D"/>
         </w:pBdr>
       </w:pPr>
       <w:r>
@@ -1593,17 +1514,15 @@
           <w:rFonts w:ascii="Garamond" w:hAnsi="Garamond"/>
           <w:b/>
           <w:i w:val="0"/>
-          <w:color w:val="5C3114"/>
-          <w:sz w:val="27"/>
+          <w:color w:val="4A260F"/>
+          <w:sz w:val="36"/>
         </w:rPr>
-        <w:t>Full Rules Text - Condensed Mechanics</w:t>
+        <w:t>Thorn Whip</w:t>
       </w:r>
     </w:p>
     <w:p>
       <w:pPr>
-        <w:pStyle w:val="ListBullet"/>
-        <w:spacing w:after="40"/>
-        <w:ind w:left="360"/>
+        <w:spacing w:after="100"/>
       </w:pPr>
       <w:r>
         <w:rPr>
@@ -1613,15 +1532,17 @@
           <w:color w:val="2D1F15"/>
           <w:sz w:val="23"/>
         </w:rPr>
-        <w:t>Choose a creature within range.</w:t>
       </w:r>
-    </w:p>
-    <w:p>
-      <w:pPr>
-        <w:pStyle w:val="ListBullet"/>
-        <w:spacing w:after="40"/>
-        <w:ind w:left="360"/>
-      </w:pPr>
+      <w:r>
+        <w:rPr>
+          <w:rFonts w:ascii="Garamond" w:hAnsi="Garamond"/>
+          <w:b/>
+          <w:i w:val="0"/>
+          <w:color w:val="5C3114"/>
+          <w:sz w:val="23"/>
+        </w:rPr>
+        <w:t xml:space="preserve">Source: </w:t>
+      </w:r>
       <w:r>
         <w:rPr>
           <w:rFonts w:ascii="Garamond" w:hAnsi="Garamond"/>
@@ -1630,14 +1551,12 @@
           <w:color w:val="2D1F15"/>
           <w:sz w:val="23"/>
         </w:rPr>
-        <w:t>Make a ranged spell attack against the target.</w:t>
+        <w:t>Player's Handbook</w:t>
       </w:r>
     </w:p>
     <w:p>
       <w:pPr>
-        <w:pStyle w:val="ListBullet"/>
-        <w:spacing w:after="40"/>
-        <w:ind w:left="360"/>
+        <w:spacing w:after="160"/>
       </w:pPr>
       <w:r>
         <w:rPr>
@@ -1645,93 +1564,6 @@
           <w:b w:val="0"/>
           <w:i w:val="0"/>
           <w:color w:val="2D1F15"/>
-          <w:sz w:val="23"/>
-        </w:rPr>
-        <w:t>On a hit, the target takes 1d8 cold damage.</w:t>
-      </w:r>
-    </w:p>
-    <w:p>
-      <w:pPr>
-        <w:pStyle w:val="ListBullet"/>
-        <w:spacing w:after="40"/>
-        <w:ind w:left="360"/>
-      </w:pPr>
-      <w:r>
-        <w:rPr>
-          <w:rFonts w:ascii="Garamond" w:hAnsi="Garamond"/>
-          <w:b w:val="0"/>
-          <w:i w:val="0"/>
-          <w:color w:val="2D1F15"/>
-          <w:sz w:val="23"/>
-        </w:rPr>
-        <w:t>On a hit, the target's speed is reduced by 10 feet until the start of the caster's next turn.</w:t>
-      </w:r>
-    </w:p>
-    <w:p>
-      <w:pPr>
-        <w:spacing w:before="160" w:after="100"/>
-        <w:pBdr>
-          <w:top w:val="single" w:sz="8" w:space="6" w:color="7A4A22"/>
-          <w:bottom w:val="single" w:sz="8" w:space="6" w:color="7A4A22"/>
-        </w:pBdr>
-      </w:pPr>
-      <w:r>
-        <w:rPr>
-          <w:rFonts w:ascii="Garamond" w:hAnsi="Garamond"/>
-          <w:b/>
-          <w:i w:val="0"/>
-          <w:color w:val="5C3114"/>
-          <w:sz w:val="27"/>
-        </w:rPr>
-        <w:t>At Higher Levels</w:t>
-      </w:r>
-    </w:p>
-    <w:p>
-      <w:pPr>
-        <w:pStyle w:val="ListBullet"/>
-        <w:spacing w:after="40"/>
-        <w:ind w:left="360"/>
-      </w:pPr>
-      <w:r>
-        <w:rPr>
-          <w:rFonts w:ascii="Garamond" w:hAnsi="Garamond"/>
-          <w:b w:val="0"/>
-          <w:i w:val="0"/>
-          <w:color w:val="2D1F15"/>
-          <w:sz w:val="23"/>
-        </w:rPr>
-        <w:t>The damage increases by 1d8 at 5th level, 11th level, and 17th level.</w:t>
-      </w:r>
-    </w:p>
-    <w:p>
-      <w:pPr>
-        <w:spacing w:before="300" w:after="100"/>
-        <w:pBdr>
-          <w:top w:val="single" w:sz="8" w:space="6" w:color="7A4A22"/>
-          <w:bottom w:val="single" w:sz="8" w:space="6" w:color="7A4A22"/>
-        </w:pBdr>
-      </w:pPr>
-      <w:r>
-        <w:rPr>
-          <w:rFonts w:ascii="Garamond" w:hAnsi="Garamond"/>
-          <w:b/>
-          <w:i w:val="0"/>
-          <w:color w:val="5C3114"/>
-          <w:sz w:val="32"/>
-        </w:rPr>
-        <w:t>Thorn Whip</w:t>
-      </w:r>
-    </w:p>
-    <w:p>
-      <w:pPr>
-        <w:spacing w:after="80"/>
-      </w:pPr>
-      <w:r>
-        <w:rPr>
-          <w:rFonts w:ascii="Garamond" w:hAnsi="Garamond"/>
-          <w:b/>
-          <w:i w:val="0"/>
-          <w:color w:val="5C3114"/>
           <w:sz w:val="23"/>
         </w:rPr>
         <w:t>Transmutation cantrip</w:t>
@@ -1839,8 +1671,46 @@
     </w:p>
     <w:p>
       <w:pPr>
-        <w:spacing w:after="0"/>
-      </w:pPr>
+        <w:spacing w:after="80"/>
+      </w:pPr>
+      <w:r>
+        <w:rPr>
+          <w:rFonts w:ascii="Garamond" w:hAnsi="Garamond"/>
+          <w:b w:val="0"/>
+          <w:i w:val="0"/>
+          <w:color w:val="2D1F15"/>
+          <w:sz w:val="23"/>
+        </w:rPr>
+      </w:r>
+    </w:p>
+    <w:p>
+      <w:pPr>
+        <w:spacing w:after="120"/>
+      </w:pPr>
+      <w:r>
+        <w:rPr>
+          <w:rFonts w:ascii="Garamond" w:hAnsi="Garamond"/>
+          <w:b w:val="0"/>
+          <w:i w:val="0"/>
+          <w:color w:val="2D1F15"/>
+          <w:sz w:val="23"/>
+        </w:rPr>
+        <w:t>A long, vine-like whip covered in thorns lashes out toward a creature in range. Make a melee spell attack against the target. If the attack hits, the creature takes 1d6 piercing damage. If the creature is Large or smaller, it is pulled up to 10 feet closer to the caster.</w:t>
+      </w:r>
+    </w:p>
+    <w:p>
+      <w:pPr>
+        <w:spacing w:after="120"/>
+      </w:pPr>
+      <w:r>
+        <w:rPr>
+          <w:rFonts w:ascii="Garamond" w:hAnsi="Garamond"/>
+          <w:b w:val="0"/>
+          <w:i w:val="0"/>
+          <w:color w:val="2D1F15"/>
+          <w:sz w:val="23"/>
+        </w:rPr>
+      </w:r>
       <w:r>
         <w:rPr>
           <w:rFonts w:ascii="Garamond" w:hAnsi="Garamond"/>
@@ -1849,7 +1719,7 @@
           <w:color w:val="5C3114"/>
           <w:sz w:val="23"/>
         </w:rPr>
-        <w:t xml:space="preserve">Attack / Save: </w:t>
+        <w:t xml:space="preserve">At Higher Levels. </w:t>
       </w:r>
       <w:r>
         <w:rPr>
@@ -1859,13 +1729,22 @@
           <w:color w:val="2D1F15"/>
           <w:sz w:val="23"/>
         </w:rPr>
-        <w:t>Melee spell attack</w:t>
+        <w:t>The spell damage increases by 1d6 at 5th level (2d6), 11th level (3d6), and 17th level (4d6).</w:t>
       </w:r>
     </w:p>
     <w:p>
       <w:pPr>
-        <w:spacing w:after="0"/>
-      </w:pPr>
+        <w:spacing w:after="80"/>
+      </w:pPr>
+      <w:r>
+        <w:rPr>
+          <w:rFonts w:ascii="Garamond" w:hAnsi="Garamond"/>
+          <w:b w:val="0"/>
+          <w:i w:val="0"/>
+          <w:color w:val="2D1F15"/>
+          <w:sz w:val="23"/>
+        </w:rPr>
+      </w:r>
       <w:r>
         <w:rPr>
           <w:rFonts w:ascii="Garamond" w:hAnsi="Garamond"/>
@@ -1874,7 +1753,7 @@
           <w:color w:val="5C3114"/>
           <w:sz w:val="23"/>
         </w:rPr>
-        <w:t xml:space="preserve">Damage: </w:t>
+        <w:t xml:space="preserve">Spell Lists. </w:t>
       </w:r>
       <w:r>
         <w:rPr>
@@ -1884,14 +1763,13 @@
           <w:color w:val="2D1F15"/>
           <w:sz w:val="23"/>
         </w:rPr>
-        <w:t>1d6 piercing</w:t>
+        <w:t>Artificer, Druid</w:t>
       </w:r>
     </w:p>
     <w:p>
       <w:pPr>
-        <w:spacing w:before="160" w:after="100"/>
+        <w:spacing w:before="280" w:after="100"/>
         <w:pBdr>
-          <w:top w:val="single" w:sz="8" w:space="6" w:color="7A4A22"/>
           <w:bottom w:val="single" w:sz="8" w:space="6" w:color="7A4A22"/>
         </w:pBdr>
       </w:pPr>
@@ -1901,16 +1779,32 @@
           <w:b/>
           <w:i w:val="0"/>
           <w:color w:val="5C3114"/>
-          <w:sz w:val="27"/>
+          <w:sz w:val="32"/>
         </w:rPr>
-        <w:t>Full Rules Text - Condensed Mechanics</w:t>
+        <w:t>1st-Level Spells</w:t>
       </w:r>
     </w:p>
     <w:p>
       <w:pPr>
-        <w:pStyle w:val="ListBullet"/>
-        <w:spacing w:after="40"/>
-        <w:ind w:left="360"/>
+        <w:spacing w:before="320" w:after="60"/>
+        <w:pBdr>
+          <w:bottom w:val="single" w:sz="8" w:space="6" w:color="9B6A2D"/>
+        </w:pBdr>
+      </w:pPr>
+      <w:r>
+        <w:rPr>
+          <w:rFonts w:ascii="Garamond" w:hAnsi="Garamond"/>
+          <w:b/>
+          <w:i w:val="0"/>
+          <w:color w:val="4A260F"/>
+          <w:sz w:val="36"/>
+        </w:rPr>
+        <w:t>Ice Knife</w:t>
+      </w:r>
+    </w:p>
+    <w:p>
+      <w:pPr>
+        <w:spacing w:after="100"/>
       </w:pPr>
       <w:r>
         <w:rPr>
@@ -1920,15 +1814,17 @@
           <w:color w:val="2D1F15"/>
           <w:sz w:val="23"/>
         </w:rPr>
-        <w:t>Choose a creature within range.</w:t>
       </w:r>
-    </w:p>
-    <w:p>
-      <w:pPr>
-        <w:pStyle w:val="ListBullet"/>
-        <w:spacing w:after="40"/>
-        <w:ind w:left="360"/>
-      </w:pPr>
+      <w:r>
+        <w:rPr>
+          <w:rFonts w:ascii="Garamond" w:hAnsi="Garamond"/>
+          <w:b/>
+          <w:i w:val="0"/>
+          <w:color w:val="5C3114"/>
+          <w:sz w:val="23"/>
+        </w:rPr>
+        <w:t xml:space="preserve">Source: </w:t>
+      </w:r>
       <w:r>
         <w:rPr>
           <w:rFonts w:ascii="Garamond" w:hAnsi="Garamond"/>
@@ -1937,14 +1833,12 @@
           <w:color w:val="2D1F15"/>
           <w:sz w:val="23"/>
         </w:rPr>
-        <w:t>Make a melee spell attack against the target.</w:t>
+        <w:t>Xanathar's Guide to Everything</w:t>
       </w:r>
     </w:p>
     <w:p>
       <w:pPr>
-        <w:pStyle w:val="ListBullet"/>
-        <w:spacing w:after="40"/>
-        <w:ind w:left="360"/>
+        <w:spacing w:after="160"/>
       </w:pPr>
       <w:r>
         <w:rPr>
@@ -1952,112 +1846,6 @@
           <w:b w:val="0"/>
           <w:i w:val="0"/>
           <w:color w:val="2D1F15"/>
-          <w:sz w:val="23"/>
-        </w:rPr>
-        <w:t>On a hit, the target takes 1d6 piercing damage.</w:t>
-      </w:r>
-    </w:p>
-    <w:p>
-      <w:pPr>
-        <w:pStyle w:val="ListBullet"/>
-        <w:spacing w:after="40"/>
-        <w:ind w:left="360"/>
-      </w:pPr>
-      <w:r>
-        <w:rPr>
-          <w:rFonts w:ascii="Garamond" w:hAnsi="Garamond"/>
-          <w:b w:val="0"/>
-          <w:i w:val="0"/>
-          <w:color w:val="2D1F15"/>
-          <w:sz w:val="23"/>
-        </w:rPr>
-        <w:t>If the target is Large or smaller, it is pulled up to 10 feet closer to the caster.</w:t>
-      </w:r>
-    </w:p>
-    <w:p>
-      <w:pPr>
-        <w:spacing w:before="160" w:after="100"/>
-        <w:pBdr>
-          <w:top w:val="single" w:sz="8" w:space="6" w:color="7A4A22"/>
-          <w:bottom w:val="single" w:sz="8" w:space="6" w:color="7A4A22"/>
-        </w:pBdr>
-      </w:pPr>
-      <w:r>
-        <w:rPr>
-          <w:rFonts w:ascii="Garamond" w:hAnsi="Garamond"/>
-          <w:b/>
-          <w:i w:val="0"/>
-          <w:color w:val="5C3114"/>
-          <w:sz w:val="27"/>
-        </w:rPr>
-        <w:t>At Higher Levels</w:t>
-      </w:r>
-    </w:p>
-    <w:p>
-      <w:pPr>
-        <w:pStyle w:val="ListBullet"/>
-        <w:spacing w:after="40"/>
-        <w:ind w:left="360"/>
-      </w:pPr>
-      <w:r>
-        <w:rPr>
-          <w:rFonts w:ascii="Garamond" w:hAnsi="Garamond"/>
-          <w:b w:val="0"/>
-          <w:i w:val="0"/>
-          <w:color w:val="2D1F15"/>
-          <w:sz w:val="23"/>
-        </w:rPr>
-        <w:t>The damage increases by 1d6 at 5th level, 11th level, and 17th level.</w:t>
-      </w:r>
-    </w:p>
-    <w:p>
-      <w:pPr>
-        <w:spacing w:before="300" w:after="100"/>
-        <w:pBdr>
-          <w:top w:val="single" w:sz="8" w:space="6" w:color="7A4A22"/>
-          <w:bottom w:val="single" w:sz="8" w:space="6" w:color="7A4A22"/>
-        </w:pBdr>
-      </w:pPr>
-      <w:r>
-        <w:rPr>
-          <w:rFonts w:ascii="Garamond" w:hAnsi="Garamond"/>
-          <w:b/>
-          <w:i w:val="0"/>
-          <w:color w:val="5C3114"/>
-          <w:sz w:val="32"/>
-        </w:rPr>
-        <w:t>1st-Level Spells - Full Mechanics</w:t>
-      </w:r>
-    </w:p>
-    <w:p>
-      <w:pPr>
-        <w:spacing w:before="300" w:after="100"/>
-        <w:pBdr>
-          <w:top w:val="single" w:sz="8" w:space="6" w:color="7A4A22"/>
-          <w:bottom w:val="single" w:sz="8" w:space="6" w:color="7A4A22"/>
-        </w:pBdr>
-      </w:pPr>
-      <w:r>
-        <w:rPr>
-          <w:rFonts w:ascii="Garamond" w:hAnsi="Garamond"/>
-          <w:b/>
-          <w:i w:val="0"/>
-          <w:color w:val="5C3114"/>
-          <w:sz w:val="32"/>
-        </w:rPr>
-        <w:t>Ice Knife</w:t>
-      </w:r>
-    </w:p>
-    <w:p>
-      <w:pPr>
-        <w:spacing w:after="80"/>
-      </w:pPr>
-      <w:r>
-        <w:rPr>
-          <w:rFonts w:ascii="Garamond" w:hAnsi="Garamond"/>
-          <w:b/>
-          <w:i w:val="0"/>
-          <w:color w:val="5C3114"/>
           <w:sz w:val="23"/>
         </w:rPr>
         <w:t>1st-level conjuration</w:t>
@@ -2165,8 +1953,46 @@
     </w:p>
     <w:p>
       <w:pPr>
-        <w:spacing w:after="0"/>
-      </w:pPr>
+        <w:spacing w:after="80"/>
+      </w:pPr>
+      <w:r>
+        <w:rPr>
+          <w:rFonts w:ascii="Garamond" w:hAnsi="Garamond"/>
+          <w:b w:val="0"/>
+          <w:i w:val="0"/>
+          <w:color w:val="2D1F15"/>
+          <w:sz w:val="23"/>
+        </w:rPr>
+      </w:r>
+    </w:p>
+    <w:p>
+      <w:pPr>
+        <w:spacing w:after="120"/>
+      </w:pPr>
+      <w:r>
+        <w:rPr>
+          <w:rFonts w:ascii="Garamond" w:hAnsi="Garamond"/>
+          <w:b w:val="0"/>
+          <w:i w:val="0"/>
+          <w:color w:val="2D1F15"/>
+          <w:sz w:val="23"/>
+        </w:rPr>
+        <w:t>A shard of ice is created and flung at one creature within range. Make a ranged spell attack against the target. On a hit, the target takes 1d10 piercing damage. Hit or miss, the shard then explodes. The target and each creature within 5 feet of the explosion must succeed on a Dexterity saving throw or take 2d6 cold damage.</w:t>
+      </w:r>
+    </w:p>
+    <w:p>
+      <w:pPr>
+        <w:spacing w:after="120"/>
+      </w:pPr>
+      <w:r>
+        <w:rPr>
+          <w:rFonts w:ascii="Garamond" w:hAnsi="Garamond"/>
+          <w:b w:val="0"/>
+          <w:i w:val="0"/>
+          <w:color w:val="2D1F15"/>
+          <w:sz w:val="23"/>
+        </w:rPr>
+      </w:r>
       <w:r>
         <w:rPr>
           <w:rFonts w:ascii="Garamond" w:hAnsi="Garamond"/>
@@ -2175,7 +2001,7 @@
           <w:color w:val="5C3114"/>
           <w:sz w:val="23"/>
         </w:rPr>
-        <w:t xml:space="preserve">Attack / Save: </w:t>
+        <w:t xml:space="preserve">At Higher Levels. </w:t>
       </w:r>
       <w:r>
         <w:rPr>
@@ -2185,13 +2011,22 @@
           <w:color w:val="2D1F15"/>
           <w:sz w:val="23"/>
         </w:rPr>
-        <w:t>Ranged spell attack, then Dexterity saving throw</w:t>
+        <w:t>When cast using a spell slot of 2nd level or higher, the cold damage increases by 1d6 for each slot level above 1st.</w:t>
       </w:r>
     </w:p>
     <w:p>
       <w:pPr>
-        <w:spacing w:after="0"/>
-      </w:pPr>
+        <w:spacing w:after="80"/>
+      </w:pPr>
+      <w:r>
+        <w:rPr>
+          <w:rFonts w:ascii="Garamond" w:hAnsi="Garamond"/>
+          <w:b w:val="0"/>
+          <w:i w:val="0"/>
+          <w:color w:val="2D1F15"/>
+          <w:sz w:val="23"/>
+        </w:rPr>
+      </w:r>
       <w:r>
         <w:rPr>
           <w:rFonts w:ascii="Garamond" w:hAnsi="Garamond"/>
@@ -2200,7 +2035,7 @@
           <w:color w:val="5C3114"/>
           <w:sz w:val="23"/>
         </w:rPr>
-        <w:t xml:space="preserve">Damage: </w:t>
+        <w:t xml:space="preserve">Spell Lists. </w:t>
       </w:r>
       <w:r>
         <w:rPr>
@@ -2210,15 +2045,14 @@
           <w:color w:val="2D1F15"/>
           <w:sz w:val="23"/>
         </w:rPr>
-        <w:t>1d10 piercing; 2d6 cold explosion</w:t>
+        <w:t>Druid, Sorcerer, Wizard</w:t>
       </w:r>
     </w:p>
     <w:p>
       <w:pPr>
-        <w:spacing w:before="160" w:after="100"/>
+        <w:spacing w:before="320" w:after="60"/>
         <w:pBdr>
-          <w:top w:val="single" w:sz="8" w:space="6" w:color="7A4A22"/>
-          <w:bottom w:val="single" w:sz="8" w:space="6" w:color="7A4A22"/>
+          <w:bottom w:val="single" w:sz="8" w:space="6" w:color="9B6A2D"/>
         </w:pBdr>
       </w:pPr>
       <w:r>
@@ -2226,17 +2060,15 @@
           <w:rFonts w:ascii="Garamond" w:hAnsi="Garamond"/>
           <w:b/>
           <w:i w:val="0"/>
-          <w:color w:val="5C3114"/>
-          <w:sz w:val="27"/>
+          <w:color w:val="4A260F"/>
+          <w:sz w:val="36"/>
         </w:rPr>
-        <w:t>Full Rules Text - Condensed Mechanics</w:t>
+        <w:t>Guiding Bolt</w:t>
       </w:r>
     </w:p>
     <w:p>
       <w:pPr>
-        <w:pStyle w:val="ListBullet"/>
-        <w:spacing w:after="40"/>
-        <w:ind w:left="360"/>
+        <w:spacing w:after="100"/>
       </w:pPr>
       <w:r>
         <w:rPr>
@@ -2246,15 +2078,17 @@
           <w:color w:val="2D1F15"/>
           <w:sz w:val="23"/>
         </w:rPr>
-        <w:t>Choose one creature within range.</w:t>
       </w:r>
-    </w:p>
-    <w:p>
-      <w:pPr>
-        <w:pStyle w:val="ListBullet"/>
-        <w:spacing w:after="40"/>
-        <w:ind w:left="360"/>
-      </w:pPr>
+      <w:r>
+        <w:rPr>
+          <w:rFonts w:ascii="Garamond" w:hAnsi="Garamond"/>
+          <w:b/>
+          <w:i w:val="0"/>
+          <w:color w:val="5C3114"/>
+          <w:sz w:val="23"/>
+        </w:rPr>
+        <w:t xml:space="preserve">Source: </w:t>
+      </w:r>
       <w:r>
         <w:rPr>
           <w:rFonts w:ascii="Garamond" w:hAnsi="Garamond"/>
@@ -2263,14 +2097,12 @@
           <w:color w:val="2D1F15"/>
           <w:sz w:val="23"/>
         </w:rPr>
-        <w:t>Make a ranged spell attack against the target.</w:t>
+        <w:t>Player's Handbook</w:t>
       </w:r>
     </w:p>
     <w:p>
       <w:pPr>
-        <w:pStyle w:val="ListBullet"/>
-        <w:spacing w:after="40"/>
-        <w:ind w:left="360"/>
+        <w:spacing w:after="160"/>
       </w:pPr>
       <w:r>
         <w:rPr>
@@ -2278,127 +2110,6 @@
           <w:b w:val="0"/>
           <w:i w:val="0"/>
           <w:color w:val="2D1F15"/>
-          <w:sz w:val="23"/>
-        </w:rPr>
-        <w:t>On a hit, the target takes 1d10 piercing damage.</w:t>
-      </w:r>
-    </w:p>
-    <w:p>
-      <w:pPr>
-        <w:pStyle w:val="ListBullet"/>
-        <w:spacing w:after="40"/>
-        <w:ind w:left="360"/>
-      </w:pPr>
-      <w:r>
-        <w:rPr>
-          <w:rFonts w:ascii="Garamond" w:hAnsi="Garamond"/>
-          <w:b w:val="0"/>
-          <w:i w:val="0"/>
-          <w:color w:val="2D1F15"/>
-          <w:sz w:val="23"/>
-        </w:rPr>
-        <w:t>Hit or miss, the shard explodes.</w:t>
-      </w:r>
-    </w:p>
-    <w:p>
-      <w:pPr>
-        <w:pStyle w:val="ListBullet"/>
-        <w:spacing w:after="40"/>
-        <w:ind w:left="360"/>
-      </w:pPr>
-      <w:r>
-        <w:rPr>
-          <w:rFonts w:ascii="Garamond" w:hAnsi="Garamond"/>
-          <w:b w:val="0"/>
-          <w:i w:val="0"/>
-          <w:color w:val="2D1F15"/>
-          <w:sz w:val="23"/>
-        </w:rPr>
-        <w:t>The target and each creature within 5 feet of the explosion point must make a Dexterity saving throw.</w:t>
-      </w:r>
-    </w:p>
-    <w:p>
-      <w:pPr>
-        <w:pStyle w:val="ListBullet"/>
-        <w:spacing w:after="40"/>
-        <w:ind w:left="360"/>
-      </w:pPr>
-      <w:r>
-        <w:rPr>
-          <w:rFonts w:ascii="Garamond" w:hAnsi="Garamond"/>
-          <w:b w:val="0"/>
-          <w:i w:val="0"/>
-          <w:color w:val="2D1F15"/>
-          <w:sz w:val="23"/>
-        </w:rPr>
-        <w:t>A creature that fails the save takes 2d6 cold damage.</w:t>
-      </w:r>
-    </w:p>
-    <w:p>
-      <w:pPr>
-        <w:spacing w:before="160" w:after="100"/>
-        <w:pBdr>
-          <w:top w:val="single" w:sz="8" w:space="6" w:color="7A4A22"/>
-          <w:bottom w:val="single" w:sz="8" w:space="6" w:color="7A4A22"/>
-        </w:pBdr>
-      </w:pPr>
-      <w:r>
-        <w:rPr>
-          <w:rFonts w:ascii="Garamond" w:hAnsi="Garamond"/>
-          <w:b/>
-          <w:i w:val="0"/>
-          <w:color w:val="5C3114"/>
-          <w:sz w:val="27"/>
-        </w:rPr>
-        <w:t>At Higher Levels</w:t>
-      </w:r>
-    </w:p>
-    <w:p>
-      <w:pPr>
-        <w:pStyle w:val="ListBullet"/>
-        <w:spacing w:after="40"/>
-        <w:ind w:left="360"/>
-      </w:pPr>
-      <w:r>
-        <w:rPr>
-          <w:rFonts w:ascii="Garamond" w:hAnsi="Garamond"/>
-          <w:b w:val="0"/>
-          <w:i w:val="0"/>
-          <w:color w:val="2D1F15"/>
-          <w:sz w:val="23"/>
-        </w:rPr>
-        <w:t>When cast with a spell slot of 2nd level or higher, the cold damage increases by 1d6 for each slot level above 1st.</w:t>
-      </w:r>
-    </w:p>
-    <w:p>
-      <w:pPr>
-        <w:spacing w:before="300" w:after="100"/>
-        <w:pBdr>
-          <w:top w:val="single" w:sz="8" w:space="6" w:color="7A4A22"/>
-          <w:bottom w:val="single" w:sz="8" w:space="6" w:color="7A4A22"/>
-        </w:pBdr>
-      </w:pPr>
-      <w:r>
-        <w:rPr>
-          <w:rFonts w:ascii="Garamond" w:hAnsi="Garamond"/>
-          <w:b/>
-          <w:i w:val="0"/>
-          <w:color w:val="5C3114"/>
-          <w:sz w:val="32"/>
-        </w:rPr>
-        <w:t>Guiding Bolt</w:t>
-      </w:r>
-    </w:p>
-    <w:p>
-      <w:pPr>
-        <w:spacing w:after="80"/>
-      </w:pPr>
-      <w:r>
-        <w:rPr>
-          <w:rFonts w:ascii="Garamond" w:hAnsi="Garamond"/>
-          <w:b/>
-          <w:i w:val="0"/>
-          <w:color w:val="5C3114"/>
           <w:sz w:val="23"/>
         </w:rPr>
         <w:t>1st-level evocation</w:t>
@@ -2506,8 +2217,46 @@
     </w:p>
     <w:p>
       <w:pPr>
-        <w:spacing w:after="0"/>
-      </w:pPr>
+        <w:spacing w:after="80"/>
+      </w:pPr>
+      <w:r>
+        <w:rPr>
+          <w:rFonts w:ascii="Garamond" w:hAnsi="Garamond"/>
+          <w:b w:val="0"/>
+          <w:i w:val="0"/>
+          <w:color w:val="2D1F15"/>
+          <w:sz w:val="23"/>
+        </w:rPr>
+      </w:r>
+    </w:p>
+    <w:p>
+      <w:pPr>
+        <w:spacing w:after="120"/>
+      </w:pPr>
+      <w:r>
+        <w:rPr>
+          <w:rFonts w:ascii="Garamond" w:hAnsi="Garamond"/>
+          <w:b w:val="0"/>
+          <w:i w:val="0"/>
+          <w:color w:val="2D1F15"/>
+          <w:sz w:val="23"/>
+        </w:rPr>
+        <w:t>A flash of light streaks toward a chosen creature within range. Make a ranged spell attack against the target. On a hit, the target takes 4d6 radiant damage. The next attack roll made against the target before the end of the caster's next turn has advantage because mystical dim light glitters on the target until then.</w:t>
+      </w:r>
+    </w:p>
+    <w:p>
+      <w:pPr>
+        <w:spacing w:after="120"/>
+      </w:pPr>
+      <w:r>
+        <w:rPr>
+          <w:rFonts w:ascii="Garamond" w:hAnsi="Garamond"/>
+          <w:b w:val="0"/>
+          <w:i w:val="0"/>
+          <w:color w:val="2D1F15"/>
+          <w:sz w:val="23"/>
+        </w:rPr>
+      </w:r>
       <w:r>
         <w:rPr>
           <w:rFonts w:ascii="Garamond" w:hAnsi="Garamond"/>
@@ -2516,7 +2265,7 @@
           <w:color w:val="5C3114"/>
           <w:sz w:val="23"/>
         </w:rPr>
-        <w:t xml:space="preserve">Attack / Save: </w:t>
+        <w:t xml:space="preserve">At Higher Levels. </w:t>
       </w:r>
       <w:r>
         <w:rPr>
@@ -2526,13 +2275,22 @@
           <w:color w:val="2D1F15"/>
           <w:sz w:val="23"/>
         </w:rPr>
-        <w:t>Ranged spell attack</w:t>
+        <w:t>When cast using a spell slot of 2nd level or higher, the damage increases by 1d6 for each slot level above 1st.</w:t>
       </w:r>
     </w:p>
     <w:p>
       <w:pPr>
-        <w:spacing w:after="0"/>
-      </w:pPr>
+        <w:spacing w:after="80"/>
+      </w:pPr>
+      <w:r>
+        <w:rPr>
+          <w:rFonts w:ascii="Garamond" w:hAnsi="Garamond"/>
+          <w:b w:val="0"/>
+          <w:i w:val="0"/>
+          <w:color w:val="2D1F15"/>
+          <w:sz w:val="23"/>
+        </w:rPr>
+      </w:r>
       <w:r>
         <w:rPr>
           <w:rFonts w:ascii="Garamond" w:hAnsi="Garamond"/>
@@ -2541,7 +2299,7 @@
           <w:color w:val="5C3114"/>
           <w:sz w:val="23"/>
         </w:rPr>
-        <w:t xml:space="preserve">Damage: </w:t>
+        <w:t xml:space="preserve">Spell Lists. </w:t>
       </w:r>
       <w:r>
         <w:rPr>
@@ -2551,15 +2309,14 @@
           <w:color w:val="2D1F15"/>
           <w:sz w:val="23"/>
         </w:rPr>
-        <w:t>4d6 radiant</w:t>
+        <w:t>Cleric</w:t>
       </w:r>
     </w:p>
     <w:p>
       <w:pPr>
-        <w:spacing w:before="160" w:after="100"/>
+        <w:spacing w:before="320" w:after="60"/>
         <w:pBdr>
-          <w:top w:val="single" w:sz="8" w:space="6" w:color="7A4A22"/>
-          <w:bottom w:val="single" w:sz="8" w:space="6" w:color="7A4A22"/>
+          <w:bottom w:val="single" w:sz="8" w:space="6" w:color="9B6A2D"/>
         </w:pBdr>
       </w:pPr>
       <w:r>
@@ -2567,17 +2324,15 @@
           <w:rFonts w:ascii="Garamond" w:hAnsi="Garamond"/>
           <w:b/>
           <w:i w:val="0"/>
-          <w:color w:val="5C3114"/>
-          <w:sz w:val="27"/>
+          <w:color w:val="4A260F"/>
+          <w:sz w:val="36"/>
         </w:rPr>
-        <w:t>Full Rules Text - Condensed Mechanics</w:t>
+        <w:t>Chaos Bolt</w:t>
       </w:r>
     </w:p>
     <w:p>
       <w:pPr>
-        <w:pStyle w:val="ListBullet"/>
-        <w:spacing w:after="40"/>
-        <w:ind w:left="360"/>
+        <w:spacing w:after="100"/>
       </w:pPr>
       <w:r>
         <w:rPr>
@@ -2587,15 +2342,17 @@
           <w:color w:val="2D1F15"/>
           <w:sz w:val="23"/>
         </w:rPr>
-        <w:t>Choose a creature within range.</w:t>
       </w:r>
-    </w:p>
-    <w:p>
-      <w:pPr>
-        <w:pStyle w:val="ListBullet"/>
-        <w:spacing w:after="40"/>
-        <w:ind w:left="360"/>
-      </w:pPr>
+      <w:r>
+        <w:rPr>
+          <w:rFonts w:ascii="Garamond" w:hAnsi="Garamond"/>
+          <w:b/>
+          <w:i w:val="0"/>
+          <w:color w:val="5C3114"/>
+          <w:sz w:val="23"/>
+        </w:rPr>
+        <w:t xml:space="preserve">Source: </w:t>
+      </w:r>
       <w:r>
         <w:rPr>
           <w:rFonts w:ascii="Garamond" w:hAnsi="Garamond"/>
@@ -2604,14 +2361,12 @@
           <w:color w:val="2D1F15"/>
           <w:sz w:val="23"/>
         </w:rPr>
-        <w:t>Make a ranged spell attack against the target.</w:t>
+        <w:t>Xanathar's Guide to Everything</w:t>
       </w:r>
     </w:p>
     <w:p>
       <w:pPr>
-        <w:pStyle w:val="ListBullet"/>
-        <w:spacing w:after="40"/>
-        <w:ind w:left="360"/>
+        <w:spacing w:after="160"/>
       </w:pPr>
       <w:r>
         <w:rPr>
@@ -2619,93 +2374,6 @@
           <w:b w:val="0"/>
           <w:i w:val="0"/>
           <w:color w:val="2D1F15"/>
-          <w:sz w:val="23"/>
-        </w:rPr>
-        <w:t>On a hit, the target takes 4d6 radiant damage.</w:t>
-      </w:r>
-    </w:p>
-    <w:p>
-      <w:pPr>
-        <w:pStyle w:val="ListBullet"/>
-        <w:spacing w:after="40"/>
-        <w:ind w:left="360"/>
-      </w:pPr>
-      <w:r>
-        <w:rPr>
-          <w:rFonts w:ascii="Garamond" w:hAnsi="Garamond"/>
-          <w:b w:val="0"/>
-          <w:i w:val="0"/>
-          <w:color w:val="2D1F15"/>
-          <w:sz w:val="23"/>
-        </w:rPr>
-        <w:t>The next attack roll made against the target before the end of the caster's next turn has advantage.</w:t>
-      </w:r>
-    </w:p>
-    <w:p>
-      <w:pPr>
-        <w:spacing w:before="160" w:after="100"/>
-        <w:pBdr>
-          <w:top w:val="single" w:sz="8" w:space="6" w:color="7A4A22"/>
-          <w:bottom w:val="single" w:sz="8" w:space="6" w:color="7A4A22"/>
-        </w:pBdr>
-      </w:pPr>
-      <w:r>
-        <w:rPr>
-          <w:rFonts w:ascii="Garamond" w:hAnsi="Garamond"/>
-          <w:b/>
-          <w:i w:val="0"/>
-          <w:color w:val="5C3114"/>
-          <w:sz w:val="27"/>
-        </w:rPr>
-        <w:t>At Higher Levels</w:t>
-      </w:r>
-    </w:p>
-    <w:p>
-      <w:pPr>
-        <w:pStyle w:val="ListBullet"/>
-        <w:spacing w:after="40"/>
-        <w:ind w:left="360"/>
-      </w:pPr>
-      <w:r>
-        <w:rPr>
-          <w:rFonts w:ascii="Garamond" w:hAnsi="Garamond"/>
-          <w:b w:val="0"/>
-          <w:i w:val="0"/>
-          <w:color w:val="2D1F15"/>
-          <w:sz w:val="23"/>
-        </w:rPr>
-        <w:t>When cast with a spell slot of 2nd level or higher, the damage increases by 1d6 for each slot level above 1st.</w:t>
-      </w:r>
-    </w:p>
-    <w:p>
-      <w:pPr>
-        <w:spacing w:before="300" w:after="100"/>
-        <w:pBdr>
-          <w:top w:val="single" w:sz="8" w:space="6" w:color="7A4A22"/>
-          <w:bottom w:val="single" w:sz="8" w:space="6" w:color="7A4A22"/>
-        </w:pBdr>
-      </w:pPr>
-      <w:r>
-        <w:rPr>
-          <w:rFonts w:ascii="Garamond" w:hAnsi="Garamond"/>
-          <w:b/>
-          <w:i w:val="0"/>
-          <w:color w:val="5C3114"/>
-          <w:sz w:val="32"/>
-        </w:rPr>
-        <w:t>Chaos Bolt</w:t>
-      </w:r>
-    </w:p>
-    <w:p>
-      <w:pPr>
-        <w:spacing w:after="80"/>
-      </w:pPr>
-      <w:r>
-        <w:rPr>
-          <w:rFonts w:ascii="Garamond" w:hAnsi="Garamond"/>
-          <w:b/>
-          <w:i w:val="0"/>
-          <w:color w:val="5C3114"/>
           <w:sz w:val="23"/>
         </w:rPr>
         <w:t>1st-level evocation</w:t>
@@ -2813,8 +2481,46 @@
     </w:p>
     <w:p>
       <w:pPr>
-        <w:spacing w:after="0"/>
-      </w:pPr>
+        <w:spacing w:after="80"/>
+      </w:pPr>
+      <w:r>
+        <w:rPr>
+          <w:rFonts w:ascii="Garamond" w:hAnsi="Garamond"/>
+          <w:b w:val="0"/>
+          <w:i w:val="0"/>
+          <w:color w:val="2D1F15"/>
+          <w:sz w:val="23"/>
+        </w:rPr>
+      </w:r>
+    </w:p>
+    <w:p>
+      <w:pPr>
+        <w:spacing w:after="120"/>
+      </w:pPr>
+      <w:r>
+        <w:rPr>
+          <w:rFonts w:ascii="Garamond" w:hAnsi="Garamond"/>
+          <w:b w:val="0"/>
+          <w:i w:val="0"/>
+          <w:color w:val="2D1F15"/>
+          <w:sz w:val="23"/>
+        </w:rPr>
+        <w:t>An undulating mass of chaotic energy is hurled at one creature in range. Make a ranged spell attack against the target. On a hit, the target takes 2d8 + 1d6 damage. Choose one of the d8s; that die determines the damage type: 1 acid, 2 cold, 3 fire, 4 force, 5 lightning, 6 poison, 7 psychic, 8 thunder. If both d8s roll the same number, the energy leaps to a different creature of choice within 30 feet of the target. Make a new attack roll and damage roll for the new target. The energy can keep leaping if the d8s match again. A creature can be targeted only once by each casting of this spell.</w:t>
+      </w:r>
+    </w:p>
+    <w:p>
+      <w:pPr>
+        <w:spacing w:after="120"/>
+      </w:pPr>
+      <w:r>
+        <w:rPr>
+          <w:rFonts w:ascii="Garamond" w:hAnsi="Garamond"/>
+          <w:b w:val="0"/>
+          <w:i w:val="0"/>
+          <w:color w:val="2D1F15"/>
+          <w:sz w:val="23"/>
+        </w:rPr>
+      </w:r>
       <w:r>
         <w:rPr>
           <w:rFonts w:ascii="Garamond" w:hAnsi="Garamond"/>
@@ -2823,7 +2529,7 @@
           <w:color w:val="5C3114"/>
           <w:sz w:val="23"/>
         </w:rPr>
-        <w:t xml:space="preserve">Attack / Save: </w:t>
+        <w:t xml:space="preserve">At Higher Levels. </w:t>
       </w:r>
       <w:r>
         <w:rPr>
@@ -2833,13 +2539,22 @@
           <w:color w:val="2D1F15"/>
           <w:sz w:val="23"/>
         </w:rPr>
-        <w:t>Ranged spell attack</w:t>
+        <w:t>When cast using a spell slot of 2nd level or higher, each target takes 1d6 extra damage of the rolled type for each slot level above 1st.</w:t>
       </w:r>
     </w:p>
     <w:p>
       <w:pPr>
-        <w:spacing w:after="0"/>
-      </w:pPr>
+        <w:spacing w:after="80"/>
+      </w:pPr>
+      <w:r>
+        <w:rPr>
+          <w:rFonts w:ascii="Garamond" w:hAnsi="Garamond"/>
+          <w:b w:val="0"/>
+          <w:i w:val="0"/>
+          <w:color w:val="2D1F15"/>
+          <w:sz w:val="23"/>
+        </w:rPr>
+      </w:r>
       <w:r>
         <w:rPr>
           <w:rFonts w:ascii="Garamond" w:hAnsi="Garamond"/>
@@ -2848,7 +2563,7 @@
           <w:color w:val="5C3114"/>
           <w:sz w:val="23"/>
         </w:rPr>
-        <w:t xml:space="preserve">Damage: </w:t>
+        <w:t xml:space="preserve">Spell Lists. </w:t>
       </w:r>
       <w:r>
         <w:rPr>
@@ -2858,15 +2573,14 @@
           <w:color w:val="2D1F15"/>
           <w:sz w:val="23"/>
         </w:rPr>
-        <w:t>2d8 + 1d6; damage type from d8 result</w:t>
+        <w:t>Sorcerer</w:t>
       </w:r>
     </w:p>
     <w:p>
       <w:pPr>
-        <w:spacing w:before="160" w:after="100"/>
+        <w:spacing w:before="320" w:after="60"/>
         <w:pBdr>
-          <w:top w:val="single" w:sz="8" w:space="6" w:color="7A4A22"/>
-          <w:bottom w:val="single" w:sz="8" w:space="6" w:color="7A4A22"/>
+          <w:bottom w:val="single" w:sz="8" w:space="6" w:color="9B6A2D"/>
         </w:pBdr>
       </w:pPr>
       <w:r>
@@ -2874,17 +2588,15 @@
           <w:rFonts w:ascii="Garamond" w:hAnsi="Garamond"/>
           <w:b/>
           <w:i w:val="0"/>
-          <w:color w:val="5C3114"/>
-          <w:sz w:val="27"/>
+          <w:color w:val="4A260F"/>
+          <w:sz w:val="36"/>
         </w:rPr>
-        <w:t>Full Rules Text - Condensed Mechanics</w:t>
+        <w:t>Chromatic Orb</w:t>
       </w:r>
     </w:p>
     <w:p>
       <w:pPr>
-        <w:pStyle w:val="ListBullet"/>
-        <w:spacing w:after="40"/>
-        <w:ind w:left="360"/>
+        <w:spacing w:after="100"/>
       </w:pPr>
       <w:r>
         <w:rPr>
@@ -2894,15 +2606,17 @@
           <w:color w:val="2D1F15"/>
           <w:sz w:val="23"/>
         </w:rPr>
-        <w:t>Choose one creature within range.</w:t>
       </w:r>
-    </w:p>
-    <w:p>
-      <w:pPr>
-        <w:pStyle w:val="ListBullet"/>
-        <w:spacing w:after="40"/>
-        <w:ind w:left="360"/>
-      </w:pPr>
+      <w:r>
+        <w:rPr>
+          <w:rFonts w:ascii="Garamond" w:hAnsi="Garamond"/>
+          <w:b/>
+          <w:i w:val="0"/>
+          <w:color w:val="5C3114"/>
+          <w:sz w:val="23"/>
+        </w:rPr>
+        <w:t xml:space="preserve">Source: </w:t>
+      </w:r>
       <w:r>
         <w:rPr>
           <w:rFonts w:ascii="Garamond" w:hAnsi="Garamond"/>
@@ -2911,14 +2625,12 @@
           <w:color w:val="2D1F15"/>
           <w:sz w:val="23"/>
         </w:rPr>
-        <w:t>Make a ranged spell attack against the target.</w:t>
+        <w:t>Player's Handbook</w:t>
       </w:r>
     </w:p>
     <w:p>
       <w:pPr>
-        <w:pStyle w:val="ListBullet"/>
-        <w:spacing w:after="40"/>
-        <w:ind w:left="360"/>
+        <w:spacing w:after="160"/>
       </w:pPr>
       <w:r>
         <w:rPr>
@@ -2926,178 +2638,6 @@
           <w:b w:val="0"/>
           <w:i w:val="0"/>
           <w:color w:val="2D1F15"/>
-          <w:sz w:val="23"/>
-        </w:rPr>
-        <w:t>On a hit, the target takes 2d8 + 1d6 damage.</w:t>
-      </w:r>
-    </w:p>
-    <w:p>
-      <w:pPr>
-        <w:pStyle w:val="ListBullet"/>
-        <w:spacing w:after="40"/>
-        <w:ind w:left="360"/>
-      </w:pPr>
-      <w:r>
-        <w:rPr>
-          <w:rFonts w:ascii="Garamond" w:hAnsi="Garamond"/>
-          <w:b w:val="0"/>
-          <w:i w:val="0"/>
-          <w:color w:val="2D1F15"/>
-          <w:sz w:val="23"/>
-        </w:rPr>
-        <w:t>Choose one of the d8s rolled for damage; that die determines the damage type.</w:t>
-      </w:r>
-    </w:p>
-    <w:p>
-      <w:pPr>
-        <w:pStyle w:val="ListBullet"/>
-        <w:spacing w:after="40"/>
-        <w:ind w:left="360"/>
-      </w:pPr>
-      <w:r>
-        <w:rPr>
-          <w:rFonts w:ascii="Garamond" w:hAnsi="Garamond"/>
-          <w:b w:val="0"/>
-          <w:i w:val="0"/>
-          <w:color w:val="2D1F15"/>
-          <w:sz w:val="23"/>
-        </w:rPr>
-        <w:t>Damage type table: 1 acid, 2 cold, 3 fire, 4 force, 5 lightning, 6 poison, 7 psychic, 8 thunder.</w:t>
-      </w:r>
-    </w:p>
-    <w:p>
-      <w:pPr>
-        <w:pStyle w:val="ListBullet"/>
-        <w:spacing w:after="40"/>
-        <w:ind w:left="360"/>
-      </w:pPr>
-      <w:r>
-        <w:rPr>
-          <w:rFonts w:ascii="Garamond" w:hAnsi="Garamond"/>
-          <w:b w:val="0"/>
-          <w:i w:val="0"/>
-          <w:color w:val="2D1F15"/>
-          <w:sz w:val="23"/>
-        </w:rPr>
-        <w:t>If both d8s show the same number, the energy jumps to a different creature of the caster's choice within 30 feet of the target.</w:t>
-      </w:r>
-    </w:p>
-    <w:p>
-      <w:pPr>
-        <w:pStyle w:val="ListBullet"/>
-        <w:spacing w:after="40"/>
-        <w:ind w:left="360"/>
-      </w:pPr>
-      <w:r>
-        <w:rPr>
-          <w:rFonts w:ascii="Garamond" w:hAnsi="Garamond"/>
-          <w:b w:val="0"/>
-          <w:i w:val="0"/>
-          <w:color w:val="2D1F15"/>
-          <w:sz w:val="23"/>
-        </w:rPr>
-        <w:t>The new target requires a new attack roll and a new damage roll.</w:t>
-      </w:r>
-    </w:p>
-    <w:p>
-      <w:pPr>
-        <w:pStyle w:val="ListBullet"/>
-        <w:spacing w:after="40"/>
-        <w:ind w:left="360"/>
-      </w:pPr>
-      <w:r>
-        <w:rPr>
-          <w:rFonts w:ascii="Garamond" w:hAnsi="Garamond"/>
-          <w:b w:val="0"/>
-          <w:i w:val="0"/>
-          <w:color w:val="2D1F15"/>
-          <w:sz w:val="23"/>
-        </w:rPr>
-        <w:t>The energy can keep jumping if the d8s match again.</w:t>
-      </w:r>
-    </w:p>
-    <w:p>
-      <w:pPr>
-        <w:pStyle w:val="ListBullet"/>
-        <w:spacing w:after="40"/>
-        <w:ind w:left="360"/>
-      </w:pPr>
-      <w:r>
-        <w:rPr>
-          <w:rFonts w:ascii="Garamond" w:hAnsi="Garamond"/>
-          <w:b w:val="0"/>
-          <w:i w:val="0"/>
-          <w:color w:val="2D1F15"/>
-          <w:sz w:val="23"/>
-        </w:rPr>
-        <w:t>A creature can be targeted only once by a single casting of this spell.</w:t>
-      </w:r>
-    </w:p>
-    <w:p>
-      <w:pPr>
-        <w:spacing w:before="160" w:after="100"/>
-        <w:pBdr>
-          <w:top w:val="single" w:sz="8" w:space="6" w:color="7A4A22"/>
-          <w:bottom w:val="single" w:sz="8" w:space="6" w:color="7A4A22"/>
-        </w:pBdr>
-      </w:pPr>
-      <w:r>
-        <w:rPr>
-          <w:rFonts w:ascii="Garamond" w:hAnsi="Garamond"/>
-          <w:b/>
-          <w:i w:val="0"/>
-          <w:color w:val="5C3114"/>
-          <w:sz w:val="27"/>
-        </w:rPr>
-        <w:t>At Higher Levels</w:t>
-      </w:r>
-    </w:p>
-    <w:p>
-      <w:pPr>
-        <w:pStyle w:val="ListBullet"/>
-        <w:spacing w:after="40"/>
-        <w:ind w:left="360"/>
-      </w:pPr>
-      <w:r>
-        <w:rPr>
-          <w:rFonts w:ascii="Garamond" w:hAnsi="Garamond"/>
-          <w:b w:val="0"/>
-          <w:i w:val="0"/>
-          <w:color w:val="2D1F15"/>
-          <w:sz w:val="23"/>
-        </w:rPr>
-        <w:t>When cast with a spell slot of 2nd level or higher, each target takes 1d6 extra damage for each slot level above 1st.</w:t>
-      </w:r>
-    </w:p>
-    <w:p>
-      <w:pPr>
-        <w:spacing w:before="300" w:after="100"/>
-        <w:pBdr>
-          <w:top w:val="single" w:sz="8" w:space="6" w:color="7A4A22"/>
-          <w:bottom w:val="single" w:sz="8" w:space="6" w:color="7A4A22"/>
-        </w:pBdr>
-      </w:pPr>
-      <w:r>
-        <w:rPr>
-          <w:rFonts w:ascii="Garamond" w:hAnsi="Garamond"/>
-          <w:b/>
-          <w:i w:val="0"/>
-          <w:color w:val="5C3114"/>
-          <w:sz w:val="32"/>
-        </w:rPr>
-        <w:t>Chromatic Orb</w:t>
-      </w:r>
-    </w:p>
-    <w:p>
-      <w:pPr>
-        <w:spacing w:after="80"/>
-      </w:pPr>
-      <w:r>
-        <w:rPr>
-          <w:rFonts w:ascii="Garamond" w:hAnsi="Garamond"/>
-          <w:b/>
-          <w:i w:val="0"/>
-          <w:color w:val="5C3114"/>
           <w:sz w:val="23"/>
         </w:rPr>
         <w:t>1st-level evocation</w:t>
@@ -3205,8 +2745,46 @@
     </w:p>
     <w:p>
       <w:pPr>
-        <w:spacing w:after="0"/>
-      </w:pPr>
+        <w:spacing w:after="80"/>
+      </w:pPr>
+      <w:r>
+        <w:rPr>
+          <w:rFonts w:ascii="Garamond" w:hAnsi="Garamond"/>
+          <w:b w:val="0"/>
+          <w:i w:val="0"/>
+          <w:color w:val="2D1F15"/>
+          <w:sz w:val="23"/>
+        </w:rPr>
+      </w:r>
+    </w:p>
+    <w:p>
+      <w:pPr>
+        <w:spacing w:after="120"/>
+      </w:pPr>
+      <w:r>
+        <w:rPr>
+          <w:rFonts w:ascii="Garamond" w:hAnsi="Garamond"/>
+          <w:b w:val="0"/>
+          <w:i w:val="0"/>
+          <w:color w:val="2D1F15"/>
+          <w:sz w:val="23"/>
+        </w:rPr>
+        <w:t>A 4-inch-diameter sphere of energy is hurled at a creature visible within range. Choose acid, cold, fire, lightning, poison, or thunder for the orb. Make a ranged spell attack against the target. If the attack hits, the creature takes 3d8 damage of the chosen type.</w:t>
+      </w:r>
+    </w:p>
+    <w:p>
+      <w:pPr>
+        <w:spacing w:after="120"/>
+      </w:pPr>
+      <w:r>
+        <w:rPr>
+          <w:rFonts w:ascii="Garamond" w:hAnsi="Garamond"/>
+          <w:b w:val="0"/>
+          <w:i w:val="0"/>
+          <w:color w:val="2D1F15"/>
+          <w:sz w:val="23"/>
+        </w:rPr>
+      </w:r>
       <w:r>
         <w:rPr>
           <w:rFonts w:ascii="Garamond" w:hAnsi="Garamond"/>
@@ -3215,7 +2793,7 @@
           <w:color w:val="5C3114"/>
           <w:sz w:val="23"/>
         </w:rPr>
-        <w:t xml:space="preserve">Attack / Save: </w:t>
+        <w:t xml:space="preserve">At Higher Levels. </w:t>
       </w:r>
       <w:r>
         <w:rPr>
@@ -3225,13 +2803,22 @@
           <w:color w:val="2D1F15"/>
           <w:sz w:val="23"/>
         </w:rPr>
-        <w:t>Ranged spell attack</w:t>
+        <w:t>When cast using a spell slot of 2nd level or higher, the damage increases by 1d8 for each slot level above 1st.</w:t>
       </w:r>
     </w:p>
     <w:p>
       <w:pPr>
-        <w:spacing w:after="0"/>
-      </w:pPr>
+        <w:spacing w:after="80"/>
+      </w:pPr>
+      <w:r>
+        <w:rPr>
+          <w:rFonts w:ascii="Garamond" w:hAnsi="Garamond"/>
+          <w:b w:val="0"/>
+          <w:i w:val="0"/>
+          <w:color w:val="2D1F15"/>
+          <w:sz w:val="23"/>
+        </w:rPr>
+      </w:r>
       <w:r>
         <w:rPr>
           <w:rFonts w:ascii="Garamond" w:hAnsi="Garamond"/>
@@ -3240,7 +2827,7 @@
           <w:color w:val="5C3114"/>
           <w:sz w:val="23"/>
         </w:rPr>
-        <w:t xml:space="preserve">Damage: </w:t>
+        <w:t xml:space="preserve">Spell Lists. </w:t>
       </w:r>
       <w:r>
         <w:rPr>
@@ -3250,15 +2837,15 @@
           <w:color w:val="2D1F15"/>
           <w:sz w:val="23"/>
         </w:rPr>
-        <w:t>3d8 acid, cold, fire, lightning, poison, or thunder</w:t>
+        <w:t>Sorcerer, Wizard</w:t>
       </w:r>
     </w:p>
     <w:p>
       <w:pPr>
-        <w:spacing w:before="160" w:after="100"/>
+        <w:spacing w:before="280" w:after="100"/>
+        <w:shd w:fill="F8D9C8"/>
         <w:pBdr>
-          <w:top w:val="single" w:sz="8" w:space="6" w:color="7A4A22"/>
-          <w:bottom w:val="single" w:sz="8" w:space="6" w:color="7A4A22"/>
+          <w:bottom w:val="single" w:sz="10" w:space="6" w:color="8A2D1E"/>
         </w:pBdr>
       </w:pPr>
       <w:r>
@@ -3266,17 +2853,34 @@
           <w:rFonts w:ascii="Garamond" w:hAnsi="Garamond"/>
           <w:b/>
           <w:i w:val="0"/>
-          <w:color w:val="5C3114"/>
-          <w:sz w:val="27"/>
+          <w:color w:val="781C12"/>
+          <w:sz w:val="32"/>
         </w:rPr>
-        <w:t>Full Rules Text - Condensed Mechanics</w:t>
+        <w:t>Outside Table Spells</w:t>
       </w:r>
     </w:p>
     <w:p>
       <w:pPr>
-        <w:pStyle w:val="ListBullet"/>
-        <w:spacing w:after="40"/>
-        <w:ind w:left="360"/>
+        <w:spacing w:before="320" w:after="60"/>
+        <w:shd w:fill="FFF0E7"/>
+        <w:pBdr>
+          <w:bottom w:val="single" w:sz="8" w:space="6" w:color="8A2D1E"/>
+        </w:pBdr>
+      </w:pPr>
+      <w:r>
+        <w:rPr>
+          <w:rFonts w:ascii="Garamond" w:hAnsi="Garamond"/>
+          <w:b/>
+          <w:i w:val="0"/>
+          <w:color w:val="781C12"/>
+          <w:sz w:val="36"/>
+        </w:rPr>
+        <w:t>Moonbeam</w:t>
+      </w:r>
+    </w:p>
+    <w:p>
+      <w:pPr>
+        <w:spacing w:after="100"/>
       </w:pPr>
       <w:r>
         <w:rPr>
@@ -3286,15 +2890,17 @@
           <w:color w:val="2D1F15"/>
           <w:sz w:val="23"/>
         </w:rPr>
-        <w:t>Choose one visible creature within range.</w:t>
       </w:r>
-    </w:p>
-    <w:p>
-      <w:pPr>
-        <w:pStyle w:val="ListBullet"/>
-        <w:spacing w:after="40"/>
-        <w:ind w:left="360"/>
-      </w:pPr>
+      <w:r>
+        <w:rPr>
+          <w:rFonts w:ascii="Garamond" w:hAnsi="Garamond"/>
+          <w:b/>
+          <w:i w:val="0"/>
+          <w:color w:val="5C3114"/>
+          <w:sz w:val="23"/>
+        </w:rPr>
+        <w:t xml:space="preserve">Source: </w:t>
+      </w:r>
       <w:r>
         <w:rPr>
           <w:rFonts w:ascii="Garamond" w:hAnsi="Garamond"/>
@@ -3303,14 +2909,12 @@
           <w:color w:val="2D1F15"/>
           <w:sz w:val="23"/>
         </w:rPr>
-        <w:t>Choose acid, cold, fire, lightning, poison, or thunder as the orb's damage type.</w:t>
+        <w:t>Player's Handbook</w:t>
       </w:r>
     </w:p>
     <w:p>
       <w:pPr>
-        <w:pStyle w:val="ListBullet"/>
-        <w:spacing w:after="40"/>
-        <w:ind w:left="360"/>
+        <w:spacing w:after="160"/>
       </w:pPr>
       <w:r>
         <w:rPr>
@@ -3318,114 +2922,6 @@
           <w:b w:val="0"/>
           <w:i w:val="0"/>
           <w:color w:val="2D1F15"/>
-          <w:sz w:val="23"/>
-        </w:rPr>
-        <w:t>Make a ranged spell attack against the target.</w:t>
-      </w:r>
-    </w:p>
-    <w:p>
-      <w:pPr>
-        <w:pStyle w:val="ListBullet"/>
-        <w:spacing w:after="40"/>
-        <w:ind w:left="360"/>
-      </w:pPr>
-      <w:r>
-        <w:rPr>
-          <w:rFonts w:ascii="Garamond" w:hAnsi="Garamond"/>
-          <w:b w:val="0"/>
-          <w:i w:val="0"/>
-          <w:color w:val="2D1F15"/>
-          <w:sz w:val="23"/>
-        </w:rPr>
-        <w:t>On a hit, the target takes 3d8 damage of the chosen type.</w:t>
-      </w:r>
-    </w:p>
-    <w:p>
-      <w:pPr>
-        <w:spacing w:before="160" w:after="100"/>
-        <w:pBdr>
-          <w:top w:val="single" w:sz="8" w:space="6" w:color="7A4A22"/>
-          <w:bottom w:val="single" w:sz="8" w:space="6" w:color="7A4A22"/>
-        </w:pBdr>
-      </w:pPr>
-      <w:r>
-        <w:rPr>
-          <w:rFonts w:ascii="Garamond" w:hAnsi="Garamond"/>
-          <w:b/>
-          <w:i w:val="0"/>
-          <w:color w:val="5C3114"/>
-          <w:sz w:val="27"/>
-        </w:rPr>
-        <w:t>At Higher Levels</w:t>
-      </w:r>
-    </w:p>
-    <w:p>
-      <w:pPr>
-        <w:pStyle w:val="ListBullet"/>
-        <w:spacing w:after="40"/>
-        <w:ind w:left="360"/>
-      </w:pPr>
-      <w:r>
-        <w:rPr>
-          <w:rFonts w:ascii="Garamond" w:hAnsi="Garamond"/>
-          <w:b w:val="0"/>
-          <w:i w:val="0"/>
-          <w:color w:val="2D1F15"/>
-          <w:sz w:val="23"/>
-        </w:rPr>
-        <w:t>When cast with a spell slot of 2nd level or higher, the damage increases by 1d8 for each slot level above 1st.</w:t>
-      </w:r>
-    </w:p>
-    <w:p>
-      <w:pPr>
-        <w:spacing w:before="300" w:after="100"/>
-        <w:pBdr>
-          <w:top w:val="single" w:sz="10" w:space="6" w:color="8A2D1E"/>
-          <w:bottom w:val="single" w:sz="10" w:space="6" w:color="8A2D1E"/>
-        </w:pBdr>
-        <w:shd w:fill="F8D9C8"/>
-      </w:pPr>
-      <w:r>
-        <w:rPr>
-          <w:rFonts w:ascii="Garamond" w:hAnsi="Garamond"/>
-          <w:b/>
-          <w:i w:val="0"/>
-          <w:color w:val="781C12"/>
-          <w:sz w:val="32"/>
-        </w:rPr>
-        <w:t>Outside Table Spells - Full Mechanics</w:t>
-      </w:r>
-    </w:p>
-    <w:p>
-      <w:pPr>
-        <w:spacing w:before="300" w:after="100"/>
-        <w:pBdr>
-          <w:top w:val="single" w:sz="10" w:space="6" w:color="8A2D1E"/>
-          <w:bottom w:val="single" w:sz="10" w:space="6" w:color="8A2D1E"/>
-        </w:pBdr>
-        <w:shd w:fill="F8D9C8"/>
-      </w:pPr>
-      <w:r>
-        <w:rPr>
-          <w:rFonts w:ascii="Garamond" w:hAnsi="Garamond"/>
-          <w:b/>
-          <w:i w:val="0"/>
-          <w:color w:val="781C12"/>
-          <w:sz w:val="32"/>
-        </w:rPr>
-        <w:t>Moonbeam</w:t>
-      </w:r>
-    </w:p>
-    <w:p>
-      <w:pPr>
-        <w:spacing w:after="80"/>
-      </w:pPr>
-      <w:r>
-        <w:rPr>
-          <w:rFonts w:ascii="Garamond" w:hAnsi="Garamond"/>
-          <w:b/>
-          <w:i w:val="0"/>
-          <w:color w:val="781C12"/>
           <w:sz w:val="23"/>
         </w:rPr>
         <w:t>2nd-level evocation</w:t>
@@ -3533,8 +3029,46 @@
     </w:p>
     <w:p>
       <w:pPr>
-        <w:spacing w:after="0"/>
-      </w:pPr>
+        <w:spacing w:after="80"/>
+      </w:pPr>
+      <w:r>
+        <w:rPr>
+          <w:rFonts w:ascii="Garamond" w:hAnsi="Garamond"/>
+          <w:b w:val="0"/>
+          <w:i w:val="0"/>
+          <w:color w:val="2D1F15"/>
+          <w:sz w:val="23"/>
+        </w:rPr>
+      </w:r>
+    </w:p>
+    <w:p>
+      <w:pPr>
+        <w:spacing w:after="120"/>
+      </w:pPr>
+      <w:r>
+        <w:rPr>
+          <w:rFonts w:ascii="Garamond" w:hAnsi="Garamond"/>
+          <w:b w:val="0"/>
+          <w:i w:val="0"/>
+          <w:color w:val="2D1F15"/>
+          <w:sz w:val="23"/>
+        </w:rPr>
+        <w:t>A silvery beam of pale light shines down in a 5-foot-radius, 40-foot-high cylinder centered on a point within range. Dim light fills the cylinder until the spell ends. When a creature enters the area for the first time on a turn or starts its turn there, it makes a Constitution saving throw. It takes 2d10 radiant damage on a failed save, or half as much damage on a successful one. A shapechanger makes this saving throw with disadvantage. If it fails, it reverts to its original form and cannot assume a different form until it leaves the light. On each turn after the spell is cast, the caster can use an action to move the beam up to 60 feet in any direction.</w:t>
+      </w:r>
+    </w:p>
+    <w:p>
+      <w:pPr>
+        <w:spacing w:after="120"/>
+      </w:pPr>
+      <w:r>
+        <w:rPr>
+          <w:rFonts w:ascii="Garamond" w:hAnsi="Garamond"/>
+          <w:b w:val="0"/>
+          <w:i w:val="0"/>
+          <w:color w:val="2D1F15"/>
+          <w:sz w:val="23"/>
+        </w:rPr>
+      </w:r>
       <w:r>
         <w:rPr>
           <w:rFonts w:ascii="Garamond" w:hAnsi="Garamond"/>
@@ -3543,7 +3077,7 @@
           <w:color w:val="5C3114"/>
           <w:sz w:val="23"/>
         </w:rPr>
-        <w:t xml:space="preserve">Attack / Save: </w:t>
+        <w:t xml:space="preserve">At Higher Levels. </w:t>
       </w:r>
       <w:r>
         <w:rPr>
@@ -3553,13 +3087,22 @@
           <w:color w:val="2D1F15"/>
           <w:sz w:val="23"/>
         </w:rPr>
-        <w:t>Constitution saving throw</w:t>
+        <w:t>When cast using a spell slot of 3rd level or higher, the damage increases by 1d10 for each slot level above 2nd.</w:t>
       </w:r>
     </w:p>
     <w:p>
       <w:pPr>
-        <w:spacing w:after="0"/>
-      </w:pPr>
+        <w:spacing w:after="80"/>
+      </w:pPr>
+      <w:r>
+        <w:rPr>
+          <w:rFonts w:ascii="Garamond" w:hAnsi="Garamond"/>
+          <w:b w:val="0"/>
+          <w:i w:val="0"/>
+          <w:color w:val="2D1F15"/>
+          <w:sz w:val="23"/>
+        </w:rPr>
+      </w:r>
       <w:r>
         <w:rPr>
           <w:rFonts w:ascii="Garamond" w:hAnsi="Garamond"/>
@@ -3568,7 +3111,7 @@
           <w:color w:val="5C3114"/>
           <w:sz w:val="23"/>
         </w:rPr>
-        <w:t xml:space="preserve">Damage: </w:t>
+        <w:t xml:space="preserve">Spell Lists. </w:t>
       </w:r>
       <w:r>
         <w:rPr>
@@ -3578,17 +3121,16 @@
           <w:color w:val="2D1F15"/>
           <w:sz w:val="23"/>
         </w:rPr>
-        <w:t>2d10 radiant; half on success</w:t>
+        <w:t>Druid</w:t>
       </w:r>
     </w:p>
     <w:p>
       <w:pPr>
-        <w:spacing w:before="160" w:after="100"/>
+        <w:spacing w:before="320" w:after="60"/>
+        <w:shd w:fill="FFF0E7"/>
         <w:pBdr>
-          <w:top w:val="single" w:sz="10" w:space="6" w:color="8A2D1E"/>
-          <w:bottom w:val="single" w:sz="10" w:space="6" w:color="8A2D1E"/>
+          <w:bottom w:val="single" w:sz="8" w:space="6" w:color="8A2D1E"/>
         </w:pBdr>
-        <w:shd w:fill="F8D9C8"/>
       </w:pPr>
       <w:r>
         <w:rPr>
@@ -3596,16 +3138,14 @@
           <w:b/>
           <w:i w:val="0"/>
           <w:color w:val="781C12"/>
-          <w:sz w:val="27"/>
+          <w:sz w:val="36"/>
         </w:rPr>
-        <w:t>Full Rules Text - Condensed Mechanics</w:t>
+        <w:t>Shatter</w:t>
       </w:r>
     </w:p>
     <w:p>
       <w:pPr>
-        <w:pStyle w:val="ListBullet"/>
-        <w:spacing w:after="40"/>
-        <w:ind w:left="360"/>
+        <w:spacing w:after="100"/>
       </w:pPr>
       <w:r>
         <w:rPr>
@@ -3615,15 +3155,17 @@
           <w:color w:val="2D1F15"/>
           <w:sz w:val="23"/>
         </w:rPr>
-        <w:t>Choose a point within range.</w:t>
       </w:r>
-    </w:p>
-    <w:p>
-      <w:pPr>
-        <w:pStyle w:val="ListBullet"/>
-        <w:spacing w:after="40"/>
-        <w:ind w:left="360"/>
-      </w:pPr>
+      <w:r>
+        <w:rPr>
+          <w:rFonts w:ascii="Garamond" w:hAnsi="Garamond"/>
+          <w:b/>
+          <w:i w:val="0"/>
+          <w:color w:val="5C3114"/>
+          <w:sz w:val="23"/>
+        </w:rPr>
+        <w:t xml:space="preserve">Source: </w:t>
+      </w:r>
       <w:r>
         <w:rPr>
           <w:rFonts w:ascii="Garamond" w:hAnsi="Garamond"/>
@@ -3632,14 +3174,12 @@
           <w:color w:val="2D1F15"/>
           <w:sz w:val="23"/>
         </w:rPr>
-        <w:t>A 5-foot-radius, 40-foot-high cylinder of dim light appears there until the spell ends.</w:t>
+        <w:t>Player's Handbook</w:t>
       </w:r>
     </w:p>
     <w:p>
       <w:pPr>
-        <w:pStyle w:val="ListBullet"/>
-        <w:spacing w:after="40"/>
-        <w:ind w:left="360"/>
+        <w:spacing w:after="160"/>
       </w:pPr>
       <w:r>
         <w:rPr>
@@ -3647,163 +3187,6 @@
           <w:b w:val="0"/>
           <w:i w:val="0"/>
           <w:color w:val="2D1F15"/>
-          <w:sz w:val="23"/>
-        </w:rPr>
-        <w:t>When a creature enters the area for the first time on a turn or starts its turn there, it must make a Constitution saving throw.</w:t>
-      </w:r>
-    </w:p>
-    <w:p>
-      <w:pPr>
-        <w:pStyle w:val="ListBullet"/>
-        <w:spacing w:after="40"/>
-        <w:ind w:left="360"/>
-      </w:pPr>
-      <w:r>
-        <w:rPr>
-          <w:rFonts w:ascii="Garamond" w:hAnsi="Garamond"/>
-          <w:b w:val="0"/>
-          <w:i w:val="0"/>
-          <w:color w:val="2D1F15"/>
-          <w:sz w:val="23"/>
-        </w:rPr>
-        <w:t>On a failed save, the creature takes 2d10 radiant damage.</w:t>
-      </w:r>
-    </w:p>
-    <w:p>
-      <w:pPr>
-        <w:pStyle w:val="ListBullet"/>
-        <w:spacing w:after="40"/>
-        <w:ind w:left="360"/>
-      </w:pPr>
-      <w:r>
-        <w:rPr>
-          <w:rFonts w:ascii="Garamond" w:hAnsi="Garamond"/>
-          <w:b w:val="0"/>
-          <w:i w:val="0"/>
-          <w:color w:val="2D1F15"/>
-          <w:sz w:val="23"/>
-        </w:rPr>
-        <w:t>On a successful save, the creature takes half as much damage.</w:t>
-      </w:r>
-    </w:p>
-    <w:p>
-      <w:pPr>
-        <w:pStyle w:val="ListBullet"/>
-        <w:spacing w:after="40"/>
-        <w:ind w:left="360"/>
-      </w:pPr>
-      <w:r>
-        <w:rPr>
-          <w:rFonts w:ascii="Garamond" w:hAnsi="Garamond"/>
-          <w:b w:val="0"/>
-          <w:i w:val="0"/>
-          <w:color w:val="2D1F15"/>
-          <w:sz w:val="23"/>
-        </w:rPr>
-        <w:t>A shapechanger makes this saving throw with disadvantage.</w:t>
-      </w:r>
-    </w:p>
-    <w:p>
-      <w:pPr>
-        <w:pStyle w:val="ListBullet"/>
-        <w:spacing w:after="40"/>
-        <w:ind w:left="360"/>
-      </w:pPr>
-      <w:r>
-        <w:rPr>
-          <w:rFonts w:ascii="Garamond" w:hAnsi="Garamond"/>
-          <w:b w:val="0"/>
-          <w:i w:val="0"/>
-          <w:color w:val="2D1F15"/>
-          <w:sz w:val="23"/>
-        </w:rPr>
-        <w:t>If a shapechanger fails the save, it reverts to its original form and cannot assume a different form until it leaves the spell's light.</w:t>
-      </w:r>
-    </w:p>
-    <w:p>
-      <w:pPr>
-        <w:pStyle w:val="ListBullet"/>
-        <w:spacing w:after="40"/>
-        <w:ind w:left="360"/>
-      </w:pPr>
-      <w:r>
-        <w:rPr>
-          <w:rFonts w:ascii="Garamond" w:hAnsi="Garamond"/>
-          <w:b w:val="0"/>
-          <w:i w:val="0"/>
-          <w:color w:val="2D1F15"/>
-          <w:sz w:val="23"/>
-        </w:rPr>
-        <w:t>On each turn after casting, the caster can use an action to move the beam up to 60 feet in any direction.</w:t>
-      </w:r>
-    </w:p>
-    <w:p>
-      <w:pPr>
-        <w:spacing w:before="160" w:after="100"/>
-        <w:pBdr>
-          <w:top w:val="single" w:sz="10" w:space="6" w:color="8A2D1E"/>
-          <w:bottom w:val="single" w:sz="10" w:space="6" w:color="8A2D1E"/>
-        </w:pBdr>
-        <w:shd w:fill="F8D9C8"/>
-      </w:pPr>
-      <w:r>
-        <w:rPr>
-          <w:rFonts w:ascii="Garamond" w:hAnsi="Garamond"/>
-          <w:b/>
-          <w:i w:val="0"/>
-          <w:color w:val="781C12"/>
-          <w:sz w:val="27"/>
-        </w:rPr>
-        <w:t>At Higher Levels</w:t>
-      </w:r>
-    </w:p>
-    <w:p>
-      <w:pPr>
-        <w:pStyle w:val="ListBullet"/>
-        <w:spacing w:after="40"/>
-        <w:ind w:left="360"/>
-      </w:pPr>
-      <w:r>
-        <w:rPr>
-          <w:rFonts w:ascii="Garamond" w:hAnsi="Garamond"/>
-          <w:b w:val="0"/>
-          <w:i w:val="0"/>
-          <w:color w:val="2D1F15"/>
-          <w:sz w:val="23"/>
-        </w:rPr>
-        <w:t>When cast with a spell slot of 3rd level or higher, the damage increases by 1d10 for each slot level above 2nd.</w:t>
-      </w:r>
-    </w:p>
-    <w:p>
-      <w:pPr>
-        <w:spacing w:before="300" w:after="100"/>
-        <w:pBdr>
-          <w:top w:val="single" w:sz="10" w:space="6" w:color="8A2D1E"/>
-          <w:bottom w:val="single" w:sz="10" w:space="6" w:color="8A2D1E"/>
-        </w:pBdr>
-        <w:shd w:fill="F8D9C8"/>
-      </w:pPr>
-      <w:r>
-        <w:rPr>
-          <w:rFonts w:ascii="Garamond" w:hAnsi="Garamond"/>
-          <w:b/>
-          <w:i w:val="0"/>
-          <w:color w:val="781C12"/>
-          <w:sz w:val="32"/>
-        </w:rPr>
-        <w:t>Shatter</w:t>
-      </w:r>
-    </w:p>
-    <w:p>
-      <w:pPr>
-        <w:spacing w:after="80"/>
-      </w:pPr>
-      <w:r>
-        <w:rPr>
-          <w:rFonts w:ascii="Garamond" w:hAnsi="Garamond"/>
-          <w:b/>
-          <w:i w:val="0"/>
-          <w:color w:val="781C12"/>
           <w:sz w:val="23"/>
         </w:rPr>
         <w:t>2nd-level evocation</w:t>
@@ -3911,8 +3294,46 @@
     </w:p>
     <w:p>
       <w:pPr>
-        <w:spacing w:after="0"/>
-      </w:pPr>
+        <w:spacing w:after="80"/>
+      </w:pPr>
+      <w:r>
+        <w:rPr>
+          <w:rFonts w:ascii="Garamond" w:hAnsi="Garamond"/>
+          <w:b w:val="0"/>
+          <w:i w:val="0"/>
+          <w:color w:val="2D1F15"/>
+          <w:sz w:val="23"/>
+        </w:rPr>
+      </w:r>
+    </w:p>
+    <w:p>
+      <w:pPr>
+        <w:spacing w:after="120"/>
+      </w:pPr>
+      <w:r>
+        <w:rPr>
+          <w:rFonts w:ascii="Garamond" w:hAnsi="Garamond"/>
+          <w:b w:val="0"/>
+          <w:i w:val="0"/>
+          <w:color w:val="2D1F15"/>
+          <w:sz w:val="23"/>
+        </w:rPr>
+        <w:t>A sudden, painfully intense ringing noise erupts from a point of choice within range. Each creature in a 10-foot-radius sphere centered on that point must make a Constitution saving throw. A creature takes 3d8 thunder damage on a failed save, or half as much damage on a successful one. A creature made of inorganic material such as stone, crystal, or metal has disadvantage on this saving throw. A nonmagical object that is not being worn or carried also takes the damage if it is in the spell area.</w:t>
+      </w:r>
+    </w:p>
+    <w:p>
+      <w:pPr>
+        <w:spacing w:after="120"/>
+      </w:pPr>
+      <w:r>
+        <w:rPr>
+          <w:rFonts w:ascii="Garamond" w:hAnsi="Garamond"/>
+          <w:b w:val="0"/>
+          <w:i w:val="0"/>
+          <w:color w:val="2D1F15"/>
+          <w:sz w:val="23"/>
+        </w:rPr>
+      </w:r>
       <w:r>
         <w:rPr>
           <w:rFonts w:ascii="Garamond" w:hAnsi="Garamond"/>
@@ -3921,7 +3342,7 @@
           <w:color w:val="5C3114"/>
           <w:sz w:val="23"/>
         </w:rPr>
-        <w:t xml:space="preserve">Attack / Save: </w:t>
+        <w:t xml:space="preserve">At Higher Levels. </w:t>
       </w:r>
       <w:r>
         <w:rPr>
@@ -3931,13 +3352,22 @@
           <w:color w:val="2D1F15"/>
           <w:sz w:val="23"/>
         </w:rPr>
-        <w:t>Constitution saving throw</w:t>
+        <w:t>When cast using a spell slot of 3rd level or higher, the damage increases by 1d8 for each slot level above 2nd.</w:t>
       </w:r>
     </w:p>
     <w:p>
       <w:pPr>
-        <w:spacing w:after="0"/>
-      </w:pPr>
+        <w:spacing w:after="80"/>
+      </w:pPr>
+      <w:r>
+        <w:rPr>
+          <w:rFonts w:ascii="Garamond" w:hAnsi="Garamond"/>
+          <w:b w:val="0"/>
+          <w:i w:val="0"/>
+          <w:color w:val="2D1F15"/>
+          <w:sz w:val="23"/>
+        </w:rPr>
+      </w:r>
       <w:r>
         <w:rPr>
           <w:rFonts w:ascii="Garamond" w:hAnsi="Garamond"/>
@@ -3946,7 +3376,7 @@
           <w:color w:val="5C3114"/>
           <w:sz w:val="23"/>
         </w:rPr>
-        <w:t xml:space="preserve">Damage: </w:t>
+        <w:t xml:space="preserve">Spell Lists. </w:t>
       </w:r>
       <w:r>
         <w:rPr>
@@ -3956,166 +3386,7 @@
           <w:color w:val="2D1F15"/>
           <w:sz w:val="23"/>
         </w:rPr>
-        <w:t>3d8 thunder; half on success</w:t>
-      </w:r>
-    </w:p>
-    <w:p>
-      <w:pPr>
-        <w:spacing w:before="160" w:after="100"/>
-        <w:pBdr>
-          <w:top w:val="single" w:sz="10" w:space="6" w:color="8A2D1E"/>
-          <w:bottom w:val="single" w:sz="10" w:space="6" w:color="8A2D1E"/>
-        </w:pBdr>
-        <w:shd w:fill="F8D9C8"/>
-      </w:pPr>
-      <w:r>
-        <w:rPr>
-          <w:rFonts w:ascii="Garamond" w:hAnsi="Garamond"/>
-          <w:b/>
-          <w:i w:val="0"/>
-          <w:color w:val="781C12"/>
-          <w:sz w:val="27"/>
-        </w:rPr>
-        <w:t>Full Rules Text - Condensed Mechanics</w:t>
-      </w:r>
-    </w:p>
-    <w:p>
-      <w:pPr>
-        <w:pStyle w:val="ListBullet"/>
-        <w:spacing w:after="40"/>
-        <w:ind w:left="360"/>
-      </w:pPr>
-      <w:r>
-        <w:rPr>
-          <w:rFonts w:ascii="Garamond" w:hAnsi="Garamond"/>
-          <w:b w:val="0"/>
-          <w:i w:val="0"/>
-          <w:color w:val="2D1F15"/>
-          <w:sz w:val="23"/>
-        </w:rPr>
-        <w:t>Choose a point within range.</w:t>
-      </w:r>
-    </w:p>
-    <w:p>
-      <w:pPr>
-        <w:pStyle w:val="ListBullet"/>
-        <w:spacing w:after="40"/>
-        <w:ind w:left="360"/>
-      </w:pPr>
-      <w:r>
-        <w:rPr>
-          <w:rFonts w:ascii="Garamond" w:hAnsi="Garamond"/>
-          <w:b w:val="0"/>
-          <w:i w:val="0"/>
-          <w:color w:val="2D1F15"/>
-          <w:sz w:val="23"/>
-        </w:rPr>
-        <w:t>Each creature in a 10-foot-radius sphere centered on that point must make a Constitution saving throw.</w:t>
-      </w:r>
-    </w:p>
-    <w:p>
-      <w:pPr>
-        <w:pStyle w:val="ListBullet"/>
-        <w:spacing w:after="40"/>
-        <w:ind w:left="360"/>
-      </w:pPr>
-      <w:r>
-        <w:rPr>
-          <w:rFonts w:ascii="Garamond" w:hAnsi="Garamond"/>
-          <w:b w:val="0"/>
-          <w:i w:val="0"/>
-          <w:color w:val="2D1F15"/>
-          <w:sz w:val="23"/>
-        </w:rPr>
-        <w:t>On a failed save, a creature takes 3d8 thunder damage.</w:t>
-      </w:r>
-    </w:p>
-    <w:p>
-      <w:pPr>
-        <w:pStyle w:val="ListBullet"/>
-        <w:spacing w:after="40"/>
-        <w:ind w:left="360"/>
-      </w:pPr>
-      <w:r>
-        <w:rPr>
-          <w:rFonts w:ascii="Garamond" w:hAnsi="Garamond"/>
-          <w:b w:val="0"/>
-          <w:i w:val="0"/>
-          <w:color w:val="2D1F15"/>
-          <w:sz w:val="23"/>
-        </w:rPr>
-        <w:t>On a successful save, a creature takes half as much damage.</w:t>
-      </w:r>
-    </w:p>
-    <w:p>
-      <w:pPr>
-        <w:pStyle w:val="ListBullet"/>
-        <w:spacing w:after="40"/>
-        <w:ind w:left="360"/>
-      </w:pPr>
-      <w:r>
-        <w:rPr>
-          <w:rFonts w:ascii="Garamond" w:hAnsi="Garamond"/>
-          <w:b w:val="0"/>
-          <w:i w:val="0"/>
-          <w:color w:val="2D1F15"/>
-          <w:sz w:val="23"/>
-        </w:rPr>
-        <w:t>A creature made of inorganic material such as stone, crystal, or metal has disadvantage on the saving throw.</w:t>
-      </w:r>
-    </w:p>
-    <w:p>
-      <w:pPr>
-        <w:pStyle w:val="ListBullet"/>
-        <w:spacing w:after="40"/>
-        <w:ind w:left="360"/>
-      </w:pPr>
-      <w:r>
-        <w:rPr>
-          <w:rFonts w:ascii="Garamond" w:hAnsi="Garamond"/>
-          <w:b w:val="0"/>
-          <w:i w:val="0"/>
-          <w:color w:val="2D1F15"/>
-          <w:sz w:val="23"/>
-        </w:rPr>
-        <w:t>A nonmagical object that is not being worn or carried also takes the damage if it is in the spell's area.</w:t>
-      </w:r>
-    </w:p>
-    <w:p>
-      <w:pPr>
-        <w:spacing w:before="160" w:after="100"/>
-        <w:pBdr>
-          <w:top w:val="single" w:sz="10" w:space="6" w:color="8A2D1E"/>
-          <w:bottom w:val="single" w:sz="10" w:space="6" w:color="8A2D1E"/>
-        </w:pBdr>
-        <w:shd w:fill="F8D9C8"/>
-      </w:pPr>
-      <w:r>
-        <w:rPr>
-          <w:rFonts w:ascii="Garamond" w:hAnsi="Garamond"/>
-          <w:b/>
-          <w:i w:val="0"/>
-          <w:color w:val="781C12"/>
-          <w:sz w:val="27"/>
-        </w:rPr>
-        <w:t>At Higher Levels</w:t>
-      </w:r>
-    </w:p>
-    <w:p>
-      <w:pPr>
-        <w:pStyle w:val="ListBullet"/>
-        <w:spacing w:after="40"/>
-        <w:ind w:left="360"/>
-      </w:pPr>
-      <w:r>
-        <w:rPr>
-          <w:rFonts w:ascii="Garamond" w:hAnsi="Garamond"/>
-          <w:b w:val="0"/>
-          <w:i w:val="0"/>
-          <w:color w:val="2D1F15"/>
-          <w:sz w:val="23"/>
-        </w:rPr>
-        <w:t>When cast with a spell slot of 3rd level or higher, the damage increases by 1d8 for each slot level above 2nd.</w:t>
+        <w:t>Bard, Sorcerer, Warlock, Wizard</w:t>
       </w:r>
     </w:p>
     <w:sectPr>
@@ -4556,7 +3827,7 @@
       <w:outlineLvl w:val="0"/>
     </w:pPr>
     <w:rPr>
-      <w:rFonts w:asciiTheme="majorHAnsi" w:eastAsiaTheme="majorEastAsia" w:hAnsiTheme="majorHAnsi" w:cstheme="majorBidi" w:ascii="Garamond" w:hAnsi="Garamond"/>
+      <w:rFonts w:asciiTheme="majorHAnsi" w:eastAsiaTheme="majorEastAsia" w:hAnsiTheme="majorHAnsi" w:cstheme="majorBidi"/>
       <w:b/>
       <w:bCs/>
       <w:color w:val="365F91" w:themeColor="accent1" w:themeShade="BF"/>
@@ -4580,7 +3851,7 @@
       <w:outlineLvl w:val="1"/>
     </w:pPr>
     <w:rPr>
-      <w:rFonts w:asciiTheme="majorHAnsi" w:eastAsiaTheme="majorEastAsia" w:hAnsiTheme="majorHAnsi" w:cstheme="majorBidi" w:ascii="Garamond" w:hAnsi="Garamond"/>
+      <w:rFonts w:asciiTheme="majorHAnsi" w:eastAsiaTheme="majorEastAsia" w:hAnsiTheme="majorHAnsi" w:cstheme="majorBidi"/>
       <w:b/>
       <w:bCs/>
       <w:color w:val="4F81BD" w:themeColor="accent1"/>
@@ -4845,7 +4116,7 @@
       <w:contextualSpacing/>
     </w:pPr>
     <w:rPr>
-      <w:rFonts w:asciiTheme="majorHAnsi" w:eastAsiaTheme="majorEastAsia" w:hAnsiTheme="majorHAnsi" w:cstheme="majorBidi" w:ascii="Garamond" w:hAnsi="Garamond"/>
+      <w:rFonts w:asciiTheme="majorHAnsi" w:eastAsiaTheme="majorEastAsia" w:hAnsiTheme="majorHAnsi" w:cstheme="majorBidi"/>
       <w:color w:val="17365D" w:themeColor="text2" w:themeShade="BF"/>
       <w:spacing w:val="5"/>
       <w:kern w:val="28"/>

</xml_diff>

<commit_message>
Remove Fetarak heading backgrounds
</commit_message>
<xml_diff>
--- a/Essentials/Fetarak.docx
+++ b/Essentials/Fetarak.docx
@@ -7,7 +7,6 @@
         <w:pBdr>
           <w:bottom w:val="single" w:sz="10" w:space="6" w:color="9B6A2D"/>
         </w:pBdr>
-        <w:shd w:val="clear" w:color="auto" w:fill="F3E5C0"/>
         <w:jc w:val="center"/>
         <w:rPr>
           <w:rFonts w:hint="eastAsia"/>
@@ -277,7 +276,6 @@
         <w:pBdr>
           <w:bottom w:val="single" w:sz="10" w:space="6" w:color="8A2D1E"/>
         </w:pBdr>
-        <w:shd w:val="clear" w:color="auto" w:fill="F8D9C8"/>
         <w:spacing w:before="280" w:after="100"/>
         <w:rPr>
           <w:rFonts w:hint="eastAsia"/>
@@ -305,7 +303,6 @@
     </w:p>
     <w:p>
       <w:pPr>
-        <w:shd w:val="clear" w:color="auto" w:fill="FFF0E7"/>
         <w:spacing w:after="40"/>
         <w:ind w:left="360"/>
         <w:rPr>
@@ -322,7 +319,6 @@
     </w:p>
     <w:p>
       <w:pPr>
-        <w:shd w:val="clear" w:color="auto" w:fill="FFF0E7"/>
         <w:spacing w:after="40"/>
         <w:ind w:left="360"/>
         <w:rPr>
@@ -2071,7 +2067,6 @@
         <w:pBdr>
           <w:bottom w:val="single" w:sz="10" w:space="6" w:color="8A2D1E"/>
         </w:pBdr>
-        <w:shd w:val="clear" w:color="auto" w:fill="F8D9C8"/>
         <w:spacing w:before="280" w:after="100"/>
         <w:rPr>
           <w:rFonts w:hint="eastAsia"/>
@@ -2091,7 +2086,6 @@
         <w:pBdr>
           <w:bottom w:val="single" w:sz="8" w:space="6" w:color="8A2D1E"/>
         </w:pBdr>
-        <w:shd w:val="clear" w:color="auto" w:fill="FFF0E7"/>
         <w:spacing w:before="320" w:after="60"/>
         <w:rPr>
           <w:rFonts w:hint="eastAsia"/>
@@ -2267,7 +2261,6 @@
         <w:pBdr>
           <w:bottom w:val="single" w:sz="8" w:space="6" w:color="8A2D1E"/>
         </w:pBdr>
-        <w:shd w:val="clear" w:color="auto" w:fill="FFF0E7"/>
         <w:spacing w:before="320" w:after="60"/>
         <w:rPr>
           <w:rFonts w:hint="eastAsia"/>

</xml_diff>

<commit_message>
Unify Fetarak spell heading colors
</commit_message>
<xml_diff>
--- a/Essentials/Fetarak.docx
+++ b/Essentials/Fetarak.docx
@@ -274,7 +274,7 @@
     <w:p>
       <w:pPr>
         <w:pBdr>
-          <w:bottom w:val="single" w:sz="10" w:space="6" w:color="8A2D1E"/>
+          <w:bottom w:val="single" w:sz="10" w:space="6" w:color="7A4A22"/>
         </w:pBdr>
         <w:spacing w:before="280" w:after="100"/>
         <w:rPr>
@@ -284,7 +284,7 @@
       <w:r>
         <w:rPr>
           <w:b/>
-          <w:color w:val="781C12"/>
+          <w:color w:val="5C3114"/>
           <w:sz w:val="32"/>
         </w:rPr>
         <w:t>2nd-Level Damage Spells</w:t>
@@ -312,7 +312,7 @@
       <w:r>
         <w:rPr>
           <w:b/>
-          <w:color w:val="781C12"/>
+          <w:color w:val="5C3114"/>
         </w:rPr>
         <w:t>1. Moonbeam - 2nd Level - 2d10 radiant; half on success</w:t>
       </w:r>
@@ -328,7 +328,7 @@
       <w:r>
         <w:rPr>
           <w:b/>
-          <w:color w:val="781C12"/>
+          <w:color w:val="5C3114"/>
         </w:rPr>
         <w:t>2. Shatter - 2nd Level - 3d8 thunder; half on success</w:t>
       </w:r>
@@ -2056,7 +2056,7 @@
       <w:r>
         <w:rPr>
           <w:b/>
-          <w:color w:val="781C12"/>
+          <w:color w:val="5C3114"/>
           <w:sz w:val="32"/>
         </w:rPr>
         <w:br w:type="page"/>
@@ -2065,7 +2065,7 @@
     <w:p>
       <w:pPr>
         <w:pBdr>
-          <w:bottom w:val="single" w:sz="10" w:space="6" w:color="8A2D1E"/>
+          <w:bottom w:val="single" w:sz="10" w:space="6" w:color="7A4A22"/>
         </w:pBdr>
         <w:spacing w:before="280" w:after="100"/>
         <w:rPr>
@@ -2075,7 +2075,7 @@
       <w:r>
         <w:rPr>
           <w:b/>
-          <w:color w:val="781C12"/>
+          <w:color w:val="5C3114"/>
           <w:sz w:val="32"/>
         </w:rPr>
         <w:t>2nd-Level Spells</w:t>
@@ -2084,7 +2084,7 @@
     <w:p>
       <w:pPr>
         <w:pBdr>
-          <w:bottom w:val="single" w:sz="8" w:space="6" w:color="8A2D1E"/>
+          <w:bottom w:val="single" w:sz="8" w:space="6" w:color="7A4A22"/>
         </w:pBdr>
         <w:spacing w:before="320" w:after="60"/>
         <w:rPr>
@@ -2094,7 +2094,7 @@
       <w:r>
         <w:rPr>
           <w:b/>
-          <w:color w:val="781C12"/>
+          <w:color w:val="5C3114"/>
           <w:sz w:val="36"/>
         </w:rPr>
         <w:t>Moonbeam</w:t>
@@ -2259,7 +2259,7 @@
     <w:p>
       <w:pPr>
         <w:pBdr>
-          <w:bottom w:val="single" w:sz="8" w:space="6" w:color="8A2D1E"/>
+          <w:bottom w:val="single" w:sz="8" w:space="6" w:color="7A4A22"/>
         </w:pBdr>
         <w:spacing w:before="320" w:after="60"/>
         <w:rPr>
@@ -2269,7 +2269,7 @@
       <w:r>
         <w:rPr>
           <w:b/>
-          <w:color w:val="781C12"/>
+          <w:color w:val="5C3114"/>
           <w:sz w:val="36"/>
         </w:rPr>
         <w:t>Shatter</w:t>

</xml_diff>

<commit_message>
Update Fetarak Thunderclap spell
</commit_message>
<xml_diff>
--- a/Essentials/Fetarak.docx
+++ b/Essentials/Fetarak.docx
@@ -369,7 +369,7 @@
           <w:color w:val="2D1F15"/>
           <w:sz w:val="23"/>
         </w:rPr>
-        <w:t>Thorn Whip - 2nd Level - 1d6 piercing</w:t>
+        <w:t>Thunderclap - Cantrip - 1d6 thunder</w:t>
       </w:r>
     </w:p>
     <w:p>
@@ -2605,7 +2605,7 @@
           <w:color w:val="4A260F"/>
           <w:sz w:val="36"/>
         </w:rPr>
-        <w:t>Thorn Whip</w:t>
+        <w:t>Thunderclap</w:t>
       </w:r>
     </w:p>
     <w:p>
@@ -2654,7 +2654,7 @@
           <w:color w:val="2D1F15"/>
           <w:sz w:val="23"/>
         </w:rPr>
-        <w:t>Transmutation cantrip (written on Fetarak's sheet as a 2nd-level spell)</w:t>
+        <w:t>Evocation cantrip</w:t>
       </w:r>
     </w:p>
     <w:p>
@@ -2704,7 +2704,7 @@
           <w:color w:val="2D1F15"/>
           <w:sz w:val="23"/>
         </w:rPr>
-        <w:t>30 feet</w:t>
+        <w:t>Self (5-foot radius)</w:t>
       </w:r>
     </w:p>
     <w:p>
@@ -2729,7 +2729,7 @@
           <w:color w:val="2D1F15"/>
           <w:sz w:val="23"/>
         </w:rPr>
-        <w:t>V, S, M (the stem of a plant with thorns)</w:t>
+        <w:t>S</w:t>
       </w:r>
     </w:p>
     <w:p>
@@ -2783,7 +2783,7 @@
           <w:color w:val="2D1F15"/>
           <w:sz w:val="23"/>
         </w:rPr>
-        <w:t>A long, vine-like whip covered in thorns lashes out toward a creature in range. Make a melee spell attack against the target. If the attack hits, the creature takes 1d6 piercing damage. If the creature is Large or smaller, it is pulled up to 10 feet closer to the caster.</w:t>
+        <w:t>You create a burst of thunderous sound, which can be heard 100 feet away. Each creature other than you within 5 feet of you must make a Constitution saving throw. On a failed save, the creature takes 1d6 thunder damage.</w:t>
       </w:r>
     </w:p>
     <w:p>
@@ -2817,7 +2817,7 @@
           <w:color w:val="2D1F15"/>
           <w:sz w:val="23"/>
         </w:rPr>
-        <w:t>The spell damage increases by 1d6 at 5th level (2d6), 11th level (3d6), and 17th level (4d6).</w:t>
+        <w:t>The spell's damage increases by 1d6 when you reach 5th level (2d6), 11th level (3d6), and 17th level (4d6).</w:t>
       </w:r>
     </w:p>
     <w:p>
@@ -2851,7 +2851,7 @@
           <w:color w:val="2D1F15"/>
           <w:sz w:val="23"/>
         </w:rPr>
-        <w:t>Artificer, Druid</w:t>
+        <w:t>Bard, Druid, Sorcerer, Warlock, Wizard, Artificer</w:t>
       </w:r>
     </w:p>
     <w:p>

</xml_diff>